<commit_message>
Powerpoint guncelleme ve digerleri
</commit_message>
<xml_diff>
--- a/Sismik_Analiz_Ekibi_Team510_FinalProjectReport.docx
+++ b/Sismik_Analiz_Ekibi_Team510_FinalProjectReport.docx
@@ -1002,16 +1002,17 @@
           <w:ilvl w:val="0"/>
           <w:numId w:val="17"/>
         </w:numPr>
+        <w:tabs>
+          <w:tab w:val="clear" w:pos="720"/>
+          <w:tab w:val="num" w:pos="709"/>
+        </w:tabs>
         <w:ind w:left="709" w:hanging="283"/>
         <w:rPr>
-          <w:rStyle w:val="Kpr"/>
+          <w:rStyle w:val="Gl"/>
           <w:rFonts w:ascii="Times New Roman" w:hAnsi="Times New Roman" w:cs="Times New Roman"/>
-          <w:b/>
-          <w:bCs/>
           <w:color w:val="000000" w:themeColor="text1"/>
           <w:sz w:val="24"/>
           <w:szCs w:val="24"/>
-          <w:u w:val="none"/>
         </w:rPr>
       </w:pPr>
       <w:r>
@@ -1026,25 +1027,45 @@
       </w:r>
       <w:r>
         <w:rPr>
+          <w:sz w:val="23"/>
+          <w:szCs w:val="23"/>
+          <w:shd w:val="clear" w:color="auto" w:fill="FFFFFF"/>
+        </w:rPr>
+        <w:t xml:space="preserve"> </w:t>
+      </w:r>
+      <w:hyperlink r:id="rId10" w:history="1">
+        <w:r>
+          <w:rPr>
+            <w:rStyle w:val="Kpr"/>
+            <w:sz w:val="23"/>
+            <w:szCs w:val="23"/>
+            <w:shd w:val="clear" w:color="auto" w:fill="FFFFFF"/>
+          </w:rPr>
+          <w:t>https://github.com/Ahmetbugraarslan/Sismik_Analiz_Ekibi_Team510</w:t>
+        </w:r>
+      </w:hyperlink>
+      <w:r>
+        <w:rPr>
+          <w:sz w:val="23"/>
+          <w:szCs w:val="23"/>
+          <w:shd w:val="clear" w:color="auto" w:fill="FFFFFF"/>
+        </w:rPr>
+        <w:tab/>
+      </w:r>
+    </w:p>
+    <w:p>
+      <w:pPr>
+        <w:tabs>
+          <w:tab w:val="num" w:pos="709"/>
+        </w:tabs>
+        <w:rPr>
           <w:rStyle w:val="Gl"/>
           <w:rFonts w:ascii="Times New Roman" w:hAnsi="Times New Roman" w:cs="Times New Roman"/>
           <w:color w:val="000000" w:themeColor="text1"/>
           <w:sz w:val="24"/>
           <w:szCs w:val="24"/>
         </w:rPr>
-        <w:tab/>
-      </w:r>
-      <w:hyperlink r:id="rId10" w:history="1">
-        <w:r>
-          <w:rPr>
-            <w:rStyle w:val="Kpr"/>
-            <w:rFonts w:ascii="Times New Roman" w:hAnsi="Times New Roman" w:cs="Times New Roman"/>
-            <w:sz w:val="24"/>
-            <w:szCs w:val="24"/>
-          </w:rPr>
-          <w:t>https://github.com/AkifErzurumlu/akif-s</w:t>
-        </w:r>
-      </w:hyperlink>
+      </w:pPr>
     </w:p>
     <w:p>
       <w:pPr>
@@ -1076,9 +1097,6 @@
     </w:p>
     <w:p>
       <w:pPr>
-        <w:tabs>
-          <w:tab w:val="num" w:pos="709"/>
-        </w:tabs>
         <w:rPr>
           <w:rStyle w:val="Gl"/>
           <w:rFonts w:ascii="Times New Roman" w:hAnsi="Times New Roman" w:cs="Times New Roman"/>
@@ -1090,31 +1108,6 @@
     </w:p>
     <w:p>
       <w:pPr>
-        <w:tabs>
-          <w:tab w:val="num" w:pos="709"/>
-        </w:tabs>
-        <w:rPr>
-          <w:rStyle w:val="Gl"/>
-          <w:rFonts w:ascii="Times New Roman" w:hAnsi="Times New Roman" w:cs="Times New Roman"/>
-          <w:color w:val="000000" w:themeColor="text1"/>
-          <w:sz w:val="24"/>
-          <w:szCs w:val="24"/>
-        </w:rPr>
-      </w:pPr>
-    </w:p>
-    <w:p>
-      <w:pPr>
-        <w:rPr>
-          <w:rStyle w:val="Gl"/>
-          <w:rFonts w:ascii="Times New Roman" w:hAnsi="Times New Roman" w:cs="Times New Roman"/>
-          <w:color w:val="000000" w:themeColor="text1"/>
-          <w:sz w:val="24"/>
-          <w:szCs w:val="24"/>
-        </w:rPr>
-      </w:pPr>
-    </w:p>
-    <w:p>
-      <w:pPr>
         <w:pStyle w:val="Balk1"/>
       </w:pPr>
       <w:r>
@@ -1123,7 +1116,6 @@
           <w:b/>
           <w:bCs/>
         </w:rPr>
-        <w:lastRenderedPageBreak/>
         <w:t>2</w:t>
       </w:r>
       <w:r>
@@ -1168,6 +1160,7 @@
           <w:sz w:val="28"/>
           <w:szCs w:val="28"/>
         </w:rPr>
+        <w:lastRenderedPageBreak/>
         <w:t>İş/Bilimsel Soru</w:t>
       </w:r>
     </w:p>
@@ -1607,7 +1600,6 @@
           <w:b/>
           <w:bCs/>
         </w:rPr>
-        <w:lastRenderedPageBreak/>
         <w:t>3</w:t>
       </w:r>
       <w:r>
@@ -1647,6 +1639,7 @@
           <w:sz w:val="28"/>
           <w:szCs w:val="28"/>
         </w:rPr>
+        <w:lastRenderedPageBreak/>
         <w:t>Zaman Çizelgesi (Gantt-style)</w:t>
       </w:r>
     </w:p>
@@ -1755,7 +1748,19 @@
         <w:rPr>
           <w:rStyle w:val="Gl"/>
         </w:rPr>
-        <w:t>(17-30 Aralık)</w:t>
+        <w:t xml:space="preserve">(17-30 </w:t>
+      </w:r>
+      <w:r>
+        <w:rPr>
+          <w:rStyle w:val="Gl"/>
+        </w:rPr>
+        <w:t>Kasım</w:t>
+      </w:r>
+      <w:r>
+        <w:rPr>
+          <w:rStyle w:val="Gl"/>
+        </w:rPr>
+        <w:t>)</w:t>
       </w:r>
       <w:r>
         <w:t xml:space="preserve">: </w:t>
@@ -2600,7 +2605,6 @@
           <w:b/>
           <w:bCs/>
         </w:rPr>
-        <w:lastRenderedPageBreak/>
         <w:t>4</w:t>
       </w:r>
       <w:r>
@@ -2637,6 +2641,7 @@
           <w:sz w:val="28"/>
           <w:szCs w:val="28"/>
         </w:rPr>
+        <w:lastRenderedPageBreak/>
         <w:t>“Earthquake Magnitude Prediction Using Machine Learning”</w:t>
       </w:r>
     </w:p>
@@ -3141,6 +3146,2018 @@
     <w:p>
       <w:pPr>
         <w:pStyle w:val="NormalWeb"/>
+        <w:jc w:val="both"/>
+      </w:pPr>
+    </w:p>
+    <w:p>
+      <w:pPr>
+        <w:pStyle w:val="Balk1"/>
+      </w:pPr>
+      <w:r>
+        <w:rPr>
+          <w:rStyle w:val="Gl"/>
+          <w:b/>
+          <w:bCs/>
+        </w:rPr>
+        <w:t>5.</w:t>
+      </w:r>
+      <w:r>
+        <w:rPr>
+          <w:rStyle w:val="Gl"/>
+          <w:b/>
+          <w:bCs/>
+        </w:rPr>
+        <w:t>2</w:t>
+      </w:r>
+      <w:r>
+        <w:rPr>
+          <w:rStyle w:val="Gl"/>
+          <w:b/>
+          <w:bCs/>
+        </w:rPr>
+        <w:t xml:space="preserve"> </w:t>
+      </w:r>
+      <w:r>
+        <w:rPr>
+          <w:rStyle w:val="Gl"/>
+          <w:b/>
+          <w:bCs/>
+        </w:rPr>
+        <w:t>Kullanılan Sınıflar ve Etiketler</w:t>
+      </w:r>
+    </w:p>
+    <w:p>
+      <w:pPr>
+        <w:pStyle w:val="Balk1"/>
+        <w:jc w:val="both"/>
+        <w:rPr>
+          <w:b w:val="0"/>
+          <w:bCs w:val="0"/>
+          <w:sz w:val="24"/>
+          <w:szCs w:val="24"/>
+        </w:rPr>
+      </w:pPr>
+    </w:p>
+    <w:p>
+      <w:pPr>
+        <w:pStyle w:val="Balk1"/>
+        <w:jc w:val="both"/>
+        <w:rPr>
+          <w:b w:val="0"/>
+          <w:bCs w:val="0"/>
+          <w:sz w:val="24"/>
+          <w:szCs w:val="24"/>
+        </w:rPr>
+      </w:pPr>
+      <w:r>
+        <w:rPr>
+          <w:b w:val="0"/>
+          <w:bCs w:val="0"/>
+          <w:sz w:val="24"/>
+          <w:szCs w:val="24"/>
+        </w:rPr>
+        <w:t>Projemizde tahmin hedefi olarak deprem büyüklüğü (magnitüd) seçilmiştir. Veri setindeki 'Magnitude' sütunu bizim temel etiketimizdir. Modelin çıktısı olan bu sürekli sayısal etiketler, sismik risk analizini kolaylaştırmak amacıyla 4 farklı risk sınıfına (Minor, Light, Moderate, Strong) eşleştirilmiştir. Böylece her bir sayısal tahmin, otomatik olarak bir risk etiketine atanmaktadır.</w:t>
+      </w:r>
+    </w:p>
+    <w:tbl>
+      <w:tblPr>
+        <w:tblStyle w:val="TabloKlavuzu"/>
+        <w:tblW w:w="9629" w:type="dxa"/>
+        <w:tblInd w:w="0" w:type="dxa"/>
+        <w:tblLook w:val="04A0" w:firstRow="1" w:lastRow="0" w:firstColumn="1" w:lastColumn="0" w:noHBand="0" w:noVBand="1"/>
+      </w:tblPr>
+      <w:tblGrid>
+        <w:gridCol w:w="1737"/>
+        <w:gridCol w:w="1747"/>
+        <w:gridCol w:w="1745"/>
+        <w:gridCol w:w="1040"/>
+        <w:gridCol w:w="3360"/>
+      </w:tblGrid>
+      <w:tr>
+        <w:trPr>
+          <w:trHeight w:val="808"/>
+        </w:trPr>
+        <w:tc>
+          <w:tcPr>
+            <w:tcW w:w="1742" w:type="dxa"/>
+            <w:tcBorders>
+              <w:top w:val="single" w:sz="4" w:space="0" w:color="auto"/>
+              <w:left w:val="single" w:sz="4" w:space="0" w:color="auto"/>
+              <w:bottom w:val="single" w:sz="4" w:space="0" w:color="auto"/>
+              <w:right w:val="single" w:sz="4" w:space="0" w:color="auto"/>
+            </w:tcBorders>
+            <w:vAlign w:val="center"/>
+            <w:hideMark/>
+          </w:tcPr>
+          <w:p>
+            <w:pPr>
+              <w:pStyle w:val="Balk1"/>
+              <w:jc w:val="center"/>
+              <w:outlineLvl w:val="0"/>
+              <w:rPr>
+                <w:b w:val="0"/>
+                <w:bCs w:val="0"/>
+                <w:sz w:val="24"/>
+                <w:szCs w:val="24"/>
+                <w:lang w:eastAsia="en-US"/>
+              </w:rPr>
+            </w:pPr>
+            <w:r>
+              <w:rPr>
+                <w:rStyle w:val="Gl"/>
+                <w:color w:val="1F1F1F"/>
+                <w:sz w:val="24"/>
+                <w:szCs w:val="24"/>
+                <w:bdr w:val="none" w:sz="0" w:space="0" w:color="auto" w:frame="1"/>
+                <w:lang w:eastAsia="en-US"/>
+              </w:rPr>
+              <w:t>Etiket Türü (Label Type)</w:t>
+            </w:r>
+          </w:p>
+        </w:tc>
+        <w:tc>
+          <w:tcPr>
+            <w:tcW w:w="1753" w:type="dxa"/>
+            <w:tcBorders>
+              <w:top w:val="single" w:sz="4" w:space="0" w:color="auto"/>
+              <w:left w:val="single" w:sz="4" w:space="0" w:color="auto"/>
+              <w:bottom w:val="single" w:sz="4" w:space="0" w:color="auto"/>
+              <w:right w:val="single" w:sz="4" w:space="0" w:color="auto"/>
+            </w:tcBorders>
+            <w:vAlign w:val="center"/>
+            <w:hideMark/>
+          </w:tcPr>
+          <w:p>
+            <w:pPr>
+              <w:pStyle w:val="Balk1"/>
+              <w:jc w:val="center"/>
+              <w:outlineLvl w:val="0"/>
+              <w:rPr>
+                <w:b w:val="0"/>
+                <w:bCs w:val="0"/>
+                <w:sz w:val="24"/>
+                <w:szCs w:val="24"/>
+                <w:lang w:eastAsia="en-US"/>
+              </w:rPr>
+            </w:pPr>
+            <w:r>
+              <w:rPr>
+                <w:rStyle w:val="Gl"/>
+                <w:color w:val="1F1F1F"/>
+                <w:sz w:val="24"/>
+                <w:szCs w:val="24"/>
+                <w:bdr w:val="none" w:sz="0" w:space="0" w:color="auto" w:frame="1"/>
+                <w:lang w:eastAsia="en-US"/>
+              </w:rPr>
+              <w:t>Sınıf Adı (Class Label)</w:t>
+            </w:r>
+          </w:p>
+        </w:tc>
+        <w:tc>
+          <w:tcPr>
+            <w:tcW w:w="1713" w:type="dxa"/>
+            <w:tcBorders>
+              <w:top w:val="single" w:sz="4" w:space="0" w:color="auto"/>
+              <w:left w:val="single" w:sz="4" w:space="0" w:color="auto"/>
+              <w:bottom w:val="single" w:sz="4" w:space="0" w:color="auto"/>
+              <w:right w:val="single" w:sz="4" w:space="0" w:color="auto"/>
+            </w:tcBorders>
+            <w:vAlign w:val="center"/>
+            <w:hideMark/>
+          </w:tcPr>
+          <w:p>
+            <w:pPr>
+              <w:pStyle w:val="Balk1"/>
+              <w:jc w:val="center"/>
+              <w:outlineLvl w:val="0"/>
+              <w:rPr>
+                <w:b w:val="0"/>
+                <w:bCs w:val="0"/>
+                <w:sz w:val="24"/>
+                <w:szCs w:val="24"/>
+                <w:lang w:eastAsia="en-US"/>
+              </w:rPr>
+            </w:pPr>
+            <w:r>
+              <w:rPr>
+                <w:rStyle w:val="Gl"/>
+                <w:color w:val="1F1F1F"/>
+                <w:sz w:val="24"/>
+                <w:szCs w:val="24"/>
+                <w:bdr w:val="none" w:sz="0" w:space="0" w:color="auto" w:frame="1"/>
+                <w:lang w:eastAsia="en-US"/>
+              </w:rPr>
+              <w:t>Değer / Aralık (Value/Range)</w:t>
+            </w:r>
+          </w:p>
+        </w:tc>
+        <w:tc>
+          <w:tcPr>
+            <w:tcW w:w="1040" w:type="dxa"/>
+            <w:tcBorders>
+              <w:top w:val="single" w:sz="4" w:space="0" w:color="auto"/>
+              <w:left w:val="single" w:sz="4" w:space="0" w:color="auto"/>
+              <w:bottom w:val="single" w:sz="4" w:space="0" w:color="auto"/>
+              <w:right w:val="single" w:sz="4" w:space="0" w:color="auto"/>
+            </w:tcBorders>
+            <w:hideMark/>
+          </w:tcPr>
+          <w:p>
+            <w:pPr>
+              <w:pStyle w:val="Balk1"/>
+              <w:jc w:val="center"/>
+              <w:outlineLvl w:val="0"/>
+              <w:rPr>
+                <w:b w:val="0"/>
+                <w:bCs w:val="0"/>
+                <w:sz w:val="24"/>
+                <w:szCs w:val="24"/>
+                <w:lang w:eastAsia="en-US"/>
+              </w:rPr>
+            </w:pPr>
+            <w:r>
+              <w:rPr>
+                <w:rStyle w:val="Gl"/>
+                <w:color w:val="1F1F1F"/>
+                <w:sz w:val="24"/>
+                <w:szCs w:val="24"/>
+                <w:bdr w:val="none" w:sz="0" w:space="0" w:color="auto" w:frame="1"/>
+                <w:lang w:eastAsia="en-US"/>
+              </w:rPr>
+              <w:t>Renk Kodu</w:t>
+            </w:r>
+          </w:p>
+        </w:tc>
+        <w:tc>
+          <w:tcPr>
+            <w:tcW w:w="3381" w:type="dxa"/>
+            <w:tcBorders>
+              <w:top w:val="single" w:sz="4" w:space="0" w:color="auto"/>
+              <w:left w:val="single" w:sz="4" w:space="0" w:color="auto"/>
+              <w:bottom w:val="single" w:sz="4" w:space="0" w:color="auto"/>
+              <w:right w:val="single" w:sz="4" w:space="0" w:color="auto"/>
+            </w:tcBorders>
+            <w:vAlign w:val="center"/>
+            <w:hideMark/>
+          </w:tcPr>
+          <w:p>
+            <w:pPr>
+              <w:pStyle w:val="Balk1"/>
+              <w:jc w:val="center"/>
+              <w:outlineLvl w:val="0"/>
+              <w:rPr>
+                <w:b w:val="0"/>
+                <w:bCs w:val="0"/>
+                <w:sz w:val="24"/>
+                <w:szCs w:val="24"/>
+                <w:lang w:eastAsia="en-US"/>
+              </w:rPr>
+            </w:pPr>
+            <w:r>
+              <w:rPr>
+                <w:rStyle w:val="Gl"/>
+                <w:color w:val="1F1F1F"/>
+                <w:sz w:val="24"/>
+                <w:szCs w:val="24"/>
+                <w:bdr w:val="none" w:sz="0" w:space="0" w:color="auto" w:frame="1"/>
+                <w:lang w:eastAsia="en-US"/>
+              </w:rPr>
+              <w:t>Kullanım Amacı</w:t>
+            </w:r>
+          </w:p>
+        </w:tc>
+      </w:tr>
+      <w:tr>
+        <w:trPr>
+          <w:trHeight w:val="1227"/>
+        </w:trPr>
+        <w:tc>
+          <w:tcPr>
+            <w:tcW w:w="1742" w:type="dxa"/>
+            <w:tcBorders>
+              <w:top w:val="single" w:sz="4" w:space="0" w:color="auto"/>
+              <w:left w:val="single" w:sz="4" w:space="0" w:color="auto"/>
+              <w:bottom w:val="single" w:sz="4" w:space="0" w:color="auto"/>
+              <w:right w:val="single" w:sz="4" w:space="0" w:color="auto"/>
+            </w:tcBorders>
+            <w:vAlign w:val="center"/>
+            <w:hideMark/>
+          </w:tcPr>
+          <w:p>
+            <w:pPr>
+              <w:pStyle w:val="Balk1"/>
+              <w:jc w:val="both"/>
+              <w:outlineLvl w:val="0"/>
+              <w:rPr>
+                <w:sz w:val="24"/>
+                <w:szCs w:val="24"/>
+                <w:lang w:eastAsia="en-US"/>
+              </w:rPr>
+            </w:pPr>
+            <w:r>
+              <w:rPr>
+                <w:b w:val="0"/>
+                <w:bCs w:val="0"/>
+                <w:color w:val="1F1F1F"/>
+                <w:sz w:val="24"/>
+                <w:szCs w:val="24"/>
+                <w:bdr w:val="none" w:sz="0" w:space="0" w:color="auto" w:frame="1"/>
+                <w:lang w:eastAsia="en-US"/>
+              </w:rPr>
+              <w:t>Sayısal Etiket (Regression Target)</w:t>
+            </w:r>
+          </w:p>
+        </w:tc>
+        <w:tc>
+          <w:tcPr>
+            <w:tcW w:w="1753" w:type="dxa"/>
+            <w:tcBorders>
+              <w:top w:val="single" w:sz="4" w:space="0" w:color="auto"/>
+              <w:left w:val="single" w:sz="4" w:space="0" w:color="auto"/>
+              <w:bottom w:val="single" w:sz="4" w:space="0" w:color="auto"/>
+              <w:right w:val="single" w:sz="4" w:space="0" w:color="auto"/>
+            </w:tcBorders>
+            <w:vAlign w:val="center"/>
+            <w:hideMark/>
+          </w:tcPr>
+          <w:p>
+            <w:pPr>
+              <w:pStyle w:val="Balk1"/>
+              <w:jc w:val="center"/>
+              <w:outlineLvl w:val="0"/>
+              <w:rPr>
+                <w:sz w:val="24"/>
+                <w:szCs w:val="24"/>
+                <w:lang w:eastAsia="en-US"/>
+              </w:rPr>
+            </w:pPr>
+            <w:r>
+              <w:rPr>
+                <w:b w:val="0"/>
+                <w:bCs w:val="0"/>
+                <w:color w:val="1F1F1F"/>
+                <w:sz w:val="24"/>
+                <w:szCs w:val="24"/>
+                <w:bdr w:val="none" w:sz="0" w:space="0" w:color="auto" w:frame="1"/>
+                <w:lang w:eastAsia="en-US"/>
+              </w:rPr>
+              <w:t>Sürekli Değer</w:t>
+            </w:r>
+          </w:p>
+        </w:tc>
+        <w:tc>
+          <w:tcPr>
+            <w:tcW w:w="1713" w:type="dxa"/>
+            <w:tcBorders>
+              <w:top w:val="single" w:sz="4" w:space="0" w:color="auto"/>
+              <w:left w:val="single" w:sz="4" w:space="0" w:color="auto"/>
+              <w:bottom w:val="single" w:sz="4" w:space="0" w:color="auto"/>
+              <w:right w:val="single" w:sz="4" w:space="0" w:color="auto"/>
+            </w:tcBorders>
+            <w:vAlign w:val="center"/>
+            <w:hideMark/>
+          </w:tcPr>
+          <w:p>
+            <w:pPr>
+              <w:pStyle w:val="Balk1"/>
+              <w:jc w:val="center"/>
+              <w:outlineLvl w:val="0"/>
+              <w:rPr>
+                <w:b w:val="0"/>
+                <w:bCs w:val="0"/>
+                <w:sz w:val="24"/>
+                <w:szCs w:val="24"/>
+                <w:lang w:eastAsia="en-US"/>
+              </w:rPr>
+            </w:pPr>
+            <w:r>
+              <w:rPr>
+                <w:rStyle w:val="math-inline"/>
+                <w:b w:val="0"/>
+                <w:bCs w:val="0"/>
+                <w:sz w:val="24"/>
+                <w:szCs w:val="24"/>
+                <w:lang w:eastAsia="en-US"/>
+              </w:rPr>
+              <w:t>3.0&lt;=Mw&lt;=7.6</w:t>
+            </w:r>
+          </w:p>
+        </w:tc>
+        <w:tc>
+          <w:tcPr>
+            <w:tcW w:w="1040" w:type="dxa"/>
+            <w:tcBorders>
+              <w:top w:val="single" w:sz="4" w:space="0" w:color="auto"/>
+              <w:left w:val="single" w:sz="4" w:space="0" w:color="auto"/>
+              <w:bottom w:val="single" w:sz="4" w:space="0" w:color="auto"/>
+              <w:right w:val="single" w:sz="4" w:space="0" w:color="auto"/>
+            </w:tcBorders>
+          </w:tcPr>
+          <w:p>
+            <w:pPr>
+              <w:pStyle w:val="Balk1"/>
+              <w:jc w:val="both"/>
+              <w:outlineLvl w:val="0"/>
+              <w:rPr>
+                <w:sz w:val="24"/>
+                <w:szCs w:val="24"/>
+                <w:lang w:eastAsia="en-US"/>
+              </w:rPr>
+            </w:pPr>
+          </w:p>
+        </w:tc>
+        <w:tc>
+          <w:tcPr>
+            <w:tcW w:w="3381" w:type="dxa"/>
+            <w:tcBorders>
+              <w:top w:val="single" w:sz="4" w:space="0" w:color="auto"/>
+              <w:left w:val="single" w:sz="4" w:space="0" w:color="auto"/>
+              <w:bottom w:val="single" w:sz="4" w:space="0" w:color="auto"/>
+              <w:right w:val="single" w:sz="4" w:space="0" w:color="auto"/>
+            </w:tcBorders>
+            <w:vAlign w:val="center"/>
+            <w:hideMark/>
+          </w:tcPr>
+          <w:p>
+            <w:pPr>
+              <w:pStyle w:val="Balk1"/>
+              <w:jc w:val="both"/>
+              <w:outlineLvl w:val="0"/>
+              <w:rPr>
+                <w:b w:val="0"/>
+                <w:bCs w:val="0"/>
+                <w:sz w:val="24"/>
+                <w:szCs w:val="24"/>
+                <w:lang w:eastAsia="en-US"/>
+              </w:rPr>
+            </w:pPr>
+            <w:r>
+              <w:rPr>
+                <w:b w:val="0"/>
+                <w:bCs w:val="0"/>
+                <w:color w:val="1F1F1F"/>
+                <w:sz w:val="24"/>
+                <w:szCs w:val="24"/>
+                <w:bdr w:val="none" w:sz="0" w:space="0" w:color="auto" w:frame="1"/>
+                <w:lang w:eastAsia="en-US"/>
+              </w:rPr>
+              <w:t>Modelin eğitimi ve hassas büyüklük tahmini (</w:t>
+            </w:r>
+            <w:r>
+              <w:rPr>
+                <w:rStyle w:val="math-inline"/>
+                <w:b w:val="0"/>
+                <w:bCs w:val="0"/>
+                <w:color w:val="1F1F1F"/>
+                <w:sz w:val="24"/>
+                <w:szCs w:val="24"/>
+                <w:bdr w:val="none" w:sz="0" w:space="0" w:color="auto" w:frame="1"/>
+                <w:lang w:eastAsia="en-US"/>
+              </w:rPr>
+              <w:t>MSE</w:t>
+            </w:r>
+            <w:r>
+              <w:rPr>
+                <w:b w:val="0"/>
+                <w:bCs w:val="0"/>
+                <w:color w:val="1F1F1F"/>
+                <w:sz w:val="24"/>
+                <w:szCs w:val="24"/>
+                <w:bdr w:val="none" w:sz="0" w:space="0" w:color="auto" w:frame="1"/>
+                <w:lang w:eastAsia="en-US"/>
+              </w:rPr>
+              <w:t xml:space="preserve"> hesabı) için kullanılır.</w:t>
+            </w:r>
+          </w:p>
+        </w:tc>
+      </w:tr>
+      <w:tr>
+        <w:trPr>
+          <w:trHeight w:val="808"/>
+        </w:trPr>
+        <w:tc>
+          <w:tcPr>
+            <w:tcW w:w="1742" w:type="dxa"/>
+            <w:tcBorders>
+              <w:top w:val="single" w:sz="4" w:space="0" w:color="auto"/>
+              <w:left w:val="single" w:sz="4" w:space="0" w:color="auto"/>
+              <w:bottom w:val="single" w:sz="4" w:space="0" w:color="auto"/>
+              <w:right w:val="single" w:sz="4" w:space="0" w:color="auto"/>
+            </w:tcBorders>
+            <w:vAlign w:val="center"/>
+            <w:hideMark/>
+          </w:tcPr>
+          <w:p>
+            <w:pPr>
+              <w:pStyle w:val="Balk1"/>
+              <w:jc w:val="both"/>
+              <w:outlineLvl w:val="0"/>
+              <w:rPr>
+                <w:sz w:val="24"/>
+                <w:szCs w:val="24"/>
+                <w:lang w:eastAsia="en-US"/>
+              </w:rPr>
+            </w:pPr>
+            <w:r>
+              <w:rPr>
+                <w:b w:val="0"/>
+                <w:bCs w:val="0"/>
+                <w:color w:val="1F1F1F"/>
+                <w:sz w:val="24"/>
+                <w:szCs w:val="24"/>
+                <w:bdr w:val="none" w:sz="0" w:space="0" w:color="auto" w:frame="1"/>
+                <w:lang w:eastAsia="en-US"/>
+              </w:rPr>
+              <w:t>Kategorik Etiket (Label 0)</w:t>
+            </w:r>
+          </w:p>
+        </w:tc>
+        <w:tc>
+          <w:tcPr>
+            <w:tcW w:w="1753" w:type="dxa"/>
+            <w:tcBorders>
+              <w:top w:val="single" w:sz="4" w:space="0" w:color="auto"/>
+              <w:left w:val="single" w:sz="4" w:space="0" w:color="auto"/>
+              <w:bottom w:val="single" w:sz="4" w:space="0" w:color="auto"/>
+              <w:right w:val="single" w:sz="4" w:space="0" w:color="auto"/>
+            </w:tcBorders>
+            <w:vAlign w:val="center"/>
+            <w:hideMark/>
+          </w:tcPr>
+          <w:p>
+            <w:pPr>
+              <w:pStyle w:val="Balk1"/>
+              <w:jc w:val="center"/>
+              <w:outlineLvl w:val="0"/>
+              <w:rPr>
+                <w:sz w:val="24"/>
+                <w:szCs w:val="24"/>
+                <w:lang w:eastAsia="en-US"/>
+              </w:rPr>
+            </w:pPr>
+            <w:r>
+              <w:rPr>
+                <w:b w:val="0"/>
+                <w:bCs w:val="0"/>
+                <w:color w:val="1F1F1F"/>
+                <w:sz w:val="24"/>
+                <w:szCs w:val="24"/>
+                <w:bdr w:val="none" w:sz="0" w:space="0" w:color="auto" w:frame="1"/>
+                <w:lang w:eastAsia="en-US"/>
+              </w:rPr>
+              <w:t>Minor</w:t>
+            </w:r>
+            <w:r>
+              <w:rPr>
+                <w:color w:val="1F1F1F"/>
+                <w:sz w:val="24"/>
+                <w:szCs w:val="24"/>
+                <w:bdr w:val="none" w:sz="0" w:space="0" w:color="auto" w:frame="1"/>
+                <w:lang w:eastAsia="en-US"/>
+              </w:rPr>
+              <w:t xml:space="preserve"> (Düşük)</w:t>
+            </w:r>
+          </w:p>
+        </w:tc>
+        <w:tc>
+          <w:tcPr>
+            <w:tcW w:w="1713" w:type="dxa"/>
+            <w:tcBorders>
+              <w:top w:val="single" w:sz="4" w:space="0" w:color="auto"/>
+              <w:left w:val="single" w:sz="4" w:space="0" w:color="auto"/>
+              <w:bottom w:val="single" w:sz="4" w:space="0" w:color="auto"/>
+              <w:right w:val="single" w:sz="4" w:space="0" w:color="auto"/>
+            </w:tcBorders>
+            <w:vAlign w:val="center"/>
+            <w:hideMark/>
+          </w:tcPr>
+          <w:p>
+            <w:pPr>
+              <w:pStyle w:val="Balk1"/>
+              <w:jc w:val="center"/>
+              <w:outlineLvl w:val="0"/>
+              <w:rPr>
+                <w:b w:val="0"/>
+                <w:bCs w:val="0"/>
+                <w:sz w:val="24"/>
+                <w:szCs w:val="24"/>
+                <w:lang w:eastAsia="en-US"/>
+              </w:rPr>
+            </w:pPr>
+            <w:r>
+              <w:rPr>
+                <w:rStyle w:val="math-inline"/>
+                <w:b w:val="0"/>
+                <w:bCs w:val="0"/>
+                <w:color w:val="1F1F1F"/>
+                <w:sz w:val="24"/>
+                <w:szCs w:val="24"/>
+                <w:bdr w:val="none" w:sz="0" w:space="0" w:color="auto" w:frame="1"/>
+                <w:lang w:eastAsia="en-US"/>
+              </w:rPr>
+              <w:t>3.0 - 3.9</w:t>
+            </w:r>
+          </w:p>
+        </w:tc>
+        <w:tc>
+          <w:tcPr>
+            <w:tcW w:w="1040" w:type="dxa"/>
+            <w:tcBorders>
+              <w:top w:val="single" w:sz="4" w:space="0" w:color="auto"/>
+              <w:left w:val="single" w:sz="4" w:space="0" w:color="auto"/>
+              <w:bottom w:val="single" w:sz="4" w:space="0" w:color="auto"/>
+              <w:right w:val="single" w:sz="4" w:space="0" w:color="auto"/>
+            </w:tcBorders>
+            <w:vAlign w:val="center"/>
+            <w:hideMark/>
+          </w:tcPr>
+          <w:p>
+            <w:pPr>
+              <w:pStyle w:val="Balk1"/>
+              <w:jc w:val="center"/>
+              <w:outlineLvl w:val="0"/>
+              <w:rPr>
+                <w:sz w:val="24"/>
+                <w:szCs w:val="24"/>
+                <w:lang w:eastAsia="en-US"/>
+              </w:rPr>
+            </w:pPr>
+            <w:r>
+              <w:rPr>
+                <w:b w:val="0"/>
+                <w:bCs w:val="0"/>
+                <w:color w:val="00B050"/>
+                <w:sz w:val="24"/>
+                <w:szCs w:val="24"/>
+                <w:bdr w:val="none" w:sz="0" w:space="0" w:color="auto" w:frame="1"/>
+                <w:lang w:eastAsia="en-US"/>
+              </w:rPr>
+              <w:t>Yeşil</w:t>
+            </w:r>
+          </w:p>
+        </w:tc>
+        <w:tc>
+          <w:tcPr>
+            <w:tcW w:w="3381" w:type="dxa"/>
+            <w:tcBorders>
+              <w:top w:val="single" w:sz="4" w:space="0" w:color="auto"/>
+              <w:left w:val="single" w:sz="4" w:space="0" w:color="auto"/>
+              <w:bottom w:val="single" w:sz="4" w:space="0" w:color="auto"/>
+              <w:right w:val="single" w:sz="4" w:space="0" w:color="auto"/>
+            </w:tcBorders>
+            <w:vAlign w:val="center"/>
+            <w:hideMark/>
+          </w:tcPr>
+          <w:p>
+            <w:pPr>
+              <w:pStyle w:val="Balk1"/>
+              <w:jc w:val="both"/>
+              <w:outlineLvl w:val="0"/>
+              <w:rPr>
+                <w:b w:val="0"/>
+                <w:bCs w:val="0"/>
+                <w:sz w:val="24"/>
+                <w:szCs w:val="24"/>
+                <w:lang w:eastAsia="en-US"/>
+              </w:rPr>
+            </w:pPr>
+            <w:r>
+              <w:rPr>
+                <w:b w:val="0"/>
+                <w:bCs w:val="0"/>
+                <w:color w:val="1F1F1F"/>
+                <w:sz w:val="24"/>
+                <w:szCs w:val="24"/>
+                <w:bdr w:val="none" w:sz="0" w:space="0" w:color="auto" w:frame="1"/>
+                <w:lang w:eastAsia="en-US"/>
+              </w:rPr>
+              <w:t>Sismik gürültüden ayrışan, hasarsız sarsıntıların takibi.</w:t>
+            </w:r>
+          </w:p>
+        </w:tc>
+      </w:tr>
+      <w:tr>
+        <w:trPr>
+          <w:trHeight w:val="808"/>
+        </w:trPr>
+        <w:tc>
+          <w:tcPr>
+            <w:tcW w:w="1742" w:type="dxa"/>
+            <w:tcBorders>
+              <w:top w:val="single" w:sz="4" w:space="0" w:color="auto"/>
+              <w:left w:val="single" w:sz="4" w:space="0" w:color="auto"/>
+              <w:bottom w:val="single" w:sz="4" w:space="0" w:color="auto"/>
+              <w:right w:val="single" w:sz="4" w:space="0" w:color="auto"/>
+            </w:tcBorders>
+            <w:vAlign w:val="center"/>
+            <w:hideMark/>
+          </w:tcPr>
+          <w:p>
+            <w:pPr>
+              <w:pStyle w:val="Balk1"/>
+              <w:jc w:val="both"/>
+              <w:outlineLvl w:val="0"/>
+              <w:rPr>
+                <w:sz w:val="24"/>
+                <w:szCs w:val="24"/>
+                <w:lang w:eastAsia="en-US"/>
+              </w:rPr>
+            </w:pPr>
+            <w:r>
+              <w:rPr>
+                <w:b w:val="0"/>
+                <w:bCs w:val="0"/>
+                <w:color w:val="1F1F1F"/>
+                <w:sz w:val="24"/>
+                <w:szCs w:val="24"/>
+                <w:bdr w:val="none" w:sz="0" w:space="0" w:color="auto" w:frame="1"/>
+                <w:lang w:eastAsia="en-US"/>
+              </w:rPr>
+              <w:t>Kategorik Etiket (Label 1)</w:t>
+            </w:r>
+          </w:p>
+        </w:tc>
+        <w:tc>
+          <w:tcPr>
+            <w:tcW w:w="1753" w:type="dxa"/>
+            <w:tcBorders>
+              <w:top w:val="single" w:sz="4" w:space="0" w:color="auto"/>
+              <w:left w:val="single" w:sz="4" w:space="0" w:color="auto"/>
+              <w:bottom w:val="single" w:sz="4" w:space="0" w:color="auto"/>
+              <w:right w:val="single" w:sz="4" w:space="0" w:color="auto"/>
+            </w:tcBorders>
+            <w:vAlign w:val="center"/>
+            <w:hideMark/>
+          </w:tcPr>
+          <w:p>
+            <w:pPr>
+              <w:pStyle w:val="Balk1"/>
+              <w:jc w:val="center"/>
+              <w:outlineLvl w:val="0"/>
+              <w:rPr>
+                <w:sz w:val="24"/>
+                <w:szCs w:val="24"/>
+                <w:lang w:eastAsia="en-US"/>
+              </w:rPr>
+            </w:pPr>
+            <w:r>
+              <w:rPr>
+                <w:b w:val="0"/>
+                <w:bCs w:val="0"/>
+                <w:color w:val="1F1F1F"/>
+                <w:sz w:val="24"/>
+                <w:szCs w:val="24"/>
+                <w:bdr w:val="none" w:sz="0" w:space="0" w:color="auto" w:frame="1"/>
+                <w:lang w:eastAsia="en-US"/>
+              </w:rPr>
+              <w:t>Light</w:t>
+            </w:r>
+            <w:r>
+              <w:rPr>
+                <w:color w:val="1F1F1F"/>
+                <w:sz w:val="24"/>
+                <w:szCs w:val="24"/>
+                <w:bdr w:val="none" w:sz="0" w:space="0" w:color="auto" w:frame="1"/>
+                <w:lang w:eastAsia="en-US"/>
+              </w:rPr>
+              <w:t xml:space="preserve"> (Orta)</w:t>
+            </w:r>
+          </w:p>
+        </w:tc>
+        <w:tc>
+          <w:tcPr>
+            <w:tcW w:w="1713" w:type="dxa"/>
+            <w:tcBorders>
+              <w:top w:val="single" w:sz="4" w:space="0" w:color="auto"/>
+              <w:left w:val="single" w:sz="4" w:space="0" w:color="auto"/>
+              <w:bottom w:val="single" w:sz="4" w:space="0" w:color="auto"/>
+              <w:right w:val="single" w:sz="4" w:space="0" w:color="auto"/>
+            </w:tcBorders>
+            <w:vAlign w:val="center"/>
+            <w:hideMark/>
+          </w:tcPr>
+          <w:p>
+            <w:pPr>
+              <w:pStyle w:val="Balk1"/>
+              <w:jc w:val="center"/>
+              <w:outlineLvl w:val="0"/>
+              <w:rPr>
+                <w:b w:val="0"/>
+                <w:bCs w:val="0"/>
+                <w:sz w:val="24"/>
+                <w:szCs w:val="24"/>
+                <w:lang w:eastAsia="en-US"/>
+              </w:rPr>
+            </w:pPr>
+            <w:r>
+              <w:rPr>
+                <w:rStyle w:val="math-inline"/>
+                <w:b w:val="0"/>
+                <w:bCs w:val="0"/>
+                <w:color w:val="1F1F1F"/>
+                <w:sz w:val="24"/>
+                <w:szCs w:val="24"/>
+                <w:bdr w:val="none" w:sz="0" w:space="0" w:color="auto" w:frame="1"/>
+                <w:lang w:eastAsia="en-US"/>
+              </w:rPr>
+              <w:t>4.0 - 4.9</w:t>
+            </w:r>
+          </w:p>
+        </w:tc>
+        <w:tc>
+          <w:tcPr>
+            <w:tcW w:w="1040" w:type="dxa"/>
+            <w:tcBorders>
+              <w:top w:val="single" w:sz="4" w:space="0" w:color="auto"/>
+              <w:left w:val="single" w:sz="4" w:space="0" w:color="auto"/>
+              <w:bottom w:val="single" w:sz="4" w:space="0" w:color="auto"/>
+              <w:right w:val="single" w:sz="4" w:space="0" w:color="auto"/>
+            </w:tcBorders>
+            <w:vAlign w:val="center"/>
+            <w:hideMark/>
+          </w:tcPr>
+          <w:p>
+            <w:pPr>
+              <w:pStyle w:val="Balk1"/>
+              <w:jc w:val="center"/>
+              <w:outlineLvl w:val="0"/>
+              <w:rPr>
+                <w:sz w:val="24"/>
+                <w:szCs w:val="24"/>
+                <w:lang w:eastAsia="en-US"/>
+              </w:rPr>
+            </w:pPr>
+            <w:r>
+              <w:rPr>
+                <w:b w:val="0"/>
+                <w:bCs w:val="0"/>
+                <w:color w:val="FFFF00"/>
+                <w:sz w:val="24"/>
+                <w:szCs w:val="24"/>
+                <w:highlight w:val="darkGray"/>
+                <w:bdr w:val="none" w:sz="0" w:space="0" w:color="auto" w:frame="1"/>
+                <w:lang w:eastAsia="en-US"/>
+              </w:rPr>
+              <w:t>Sarı</w:t>
+            </w:r>
+          </w:p>
+        </w:tc>
+        <w:tc>
+          <w:tcPr>
+            <w:tcW w:w="3381" w:type="dxa"/>
+            <w:tcBorders>
+              <w:top w:val="single" w:sz="4" w:space="0" w:color="auto"/>
+              <w:left w:val="single" w:sz="4" w:space="0" w:color="auto"/>
+              <w:bottom w:val="single" w:sz="4" w:space="0" w:color="auto"/>
+              <w:right w:val="single" w:sz="4" w:space="0" w:color="auto"/>
+            </w:tcBorders>
+            <w:vAlign w:val="center"/>
+            <w:hideMark/>
+          </w:tcPr>
+          <w:p>
+            <w:pPr>
+              <w:pStyle w:val="Balk1"/>
+              <w:jc w:val="both"/>
+              <w:outlineLvl w:val="0"/>
+              <w:rPr>
+                <w:b w:val="0"/>
+                <w:bCs w:val="0"/>
+                <w:sz w:val="24"/>
+                <w:szCs w:val="24"/>
+                <w:lang w:eastAsia="en-US"/>
+              </w:rPr>
+            </w:pPr>
+            <w:r>
+              <w:rPr>
+                <w:b w:val="0"/>
+                <w:bCs w:val="0"/>
+                <w:color w:val="1F1F1F"/>
+                <w:sz w:val="24"/>
+                <w:szCs w:val="24"/>
+                <w:bdr w:val="none" w:sz="0" w:space="0" w:color="auto" w:frame="1"/>
+                <w:lang w:eastAsia="en-US"/>
+              </w:rPr>
+              <w:t>Bölgesel düzeyde hissedilen sarsıntı uyarıları.</w:t>
+            </w:r>
+          </w:p>
+        </w:tc>
+      </w:tr>
+      <w:tr>
+        <w:trPr>
+          <w:trHeight w:val="808"/>
+        </w:trPr>
+        <w:tc>
+          <w:tcPr>
+            <w:tcW w:w="1742" w:type="dxa"/>
+            <w:tcBorders>
+              <w:top w:val="single" w:sz="4" w:space="0" w:color="auto"/>
+              <w:left w:val="single" w:sz="4" w:space="0" w:color="auto"/>
+              <w:bottom w:val="single" w:sz="4" w:space="0" w:color="auto"/>
+              <w:right w:val="single" w:sz="4" w:space="0" w:color="auto"/>
+            </w:tcBorders>
+            <w:vAlign w:val="center"/>
+            <w:hideMark/>
+          </w:tcPr>
+          <w:p>
+            <w:pPr>
+              <w:pStyle w:val="Balk1"/>
+              <w:jc w:val="both"/>
+              <w:outlineLvl w:val="0"/>
+              <w:rPr>
+                <w:sz w:val="24"/>
+                <w:szCs w:val="24"/>
+                <w:lang w:eastAsia="en-US"/>
+              </w:rPr>
+            </w:pPr>
+            <w:r>
+              <w:rPr>
+                <w:b w:val="0"/>
+                <w:bCs w:val="0"/>
+                <w:color w:val="1F1F1F"/>
+                <w:sz w:val="24"/>
+                <w:szCs w:val="24"/>
+                <w:bdr w:val="none" w:sz="0" w:space="0" w:color="auto" w:frame="1"/>
+                <w:lang w:eastAsia="en-US"/>
+              </w:rPr>
+              <w:t>Kategorik Etiket (Label 2)</w:t>
+            </w:r>
+          </w:p>
+        </w:tc>
+        <w:tc>
+          <w:tcPr>
+            <w:tcW w:w="1753" w:type="dxa"/>
+            <w:tcBorders>
+              <w:top w:val="single" w:sz="4" w:space="0" w:color="auto"/>
+              <w:left w:val="single" w:sz="4" w:space="0" w:color="auto"/>
+              <w:bottom w:val="single" w:sz="4" w:space="0" w:color="auto"/>
+              <w:right w:val="single" w:sz="4" w:space="0" w:color="auto"/>
+            </w:tcBorders>
+            <w:vAlign w:val="center"/>
+            <w:hideMark/>
+          </w:tcPr>
+          <w:p>
+            <w:pPr>
+              <w:pStyle w:val="Balk1"/>
+              <w:jc w:val="center"/>
+              <w:outlineLvl w:val="0"/>
+              <w:rPr>
+                <w:sz w:val="24"/>
+                <w:szCs w:val="24"/>
+                <w:lang w:eastAsia="en-US"/>
+              </w:rPr>
+            </w:pPr>
+            <w:r>
+              <w:rPr>
+                <w:b w:val="0"/>
+                <w:bCs w:val="0"/>
+                <w:color w:val="1F1F1F"/>
+                <w:sz w:val="24"/>
+                <w:szCs w:val="24"/>
+                <w:bdr w:val="none" w:sz="0" w:space="0" w:color="auto" w:frame="1"/>
+                <w:lang w:eastAsia="en-US"/>
+              </w:rPr>
+              <w:t>Moderate</w:t>
+            </w:r>
+            <w:r>
+              <w:rPr>
+                <w:color w:val="1F1F1F"/>
+                <w:sz w:val="24"/>
+                <w:szCs w:val="24"/>
+                <w:bdr w:val="none" w:sz="0" w:space="0" w:color="auto" w:frame="1"/>
+                <w:lang w:eastAsia="en-US"/>
+              </w:rPr>
+              <w:t xml:space="preserve"> (Yüksek)</w:t>
+            </w:r>
+          </w:p>
+        </w:tc>
+        <w:tc>
+          <w:tcPr>
+            <w:tcW w:w="1713" w:type="dxa"/>
+            <w:tcBorders>
+              <w:top w:val="single" w:sz="4" w:space="0" w:color="auto"/>
+              <w:left w:val="single" w:sz="4" w:space="0" w:color="auto"/>
+              <w:bottom w:val="single" w:sz="4" w:space="0" w:color="auto"/>
+              <w:right w:val="single" w:sz="4" w:space="0" w:color="auto"/>
+            </w:tcBorders>
+            <w:vAlign w:val="center"/>
+            <w:hideMark/>
+          </w:tcPr>
+          <w:p>
+            <w:pPr>
+              <w:pStyle w:val="Balk1"/>
+              <w:jc w:val="center"/>
+              <w:outlineLvl w:val="0"/>
+              <w:rPr>
+                <w:b w:val="0"/>
+                <w:bCs w:val="0"/>
+                <w:sz w:val="24"/>
+                <w:szCs w:val="24"/>
+                <w:lang w:eastAsia="en-US"/>
+              </w:rPr>
+            </w:pPr>
+            <w:r>
+              <w:rPr>
+                <w:rStyle w:val="math-inline"/>
+                <w:b w:val="0"/>
+                <w:bCs w:val="0"/>
+                <w:color w:val="1F1F1F"/>
+                <w:sz w:val="24"/>
+                <w:szCs w:val="24"/>
+                <w:bdr w:val="none" w:sz="0" w:space="0" w:color="auto" w:frame="1"/>
+                <w:lang w:eastAsia="en-US"/>
+              </w:rPr>
+              <w:t>5.0 - 5.9</w:t>
+            </w:r>
+          </w:p>
+        </w:tc>
+        <w:tc>
+          <w:tcPr>
+            <w:tcW w:w="1040" w:type="dxa"/>
+            <w:tcBorders>
+              <w:top w:val="single" w:sz="4" w:space="0" w:color="auto"/>
+              <w:left w:val="single" w:sz="4" w:space="0" w:color="auto"/>
+              <w:bottom w:val="single" w:sz="4" w:space="0" w:color="auto"/>
+              <w:right w:val="single" w:sz="4" w:space="0" w:color="auto"/>
+            </w:tcBorders>
+            <w:vAlign w:val="center"/>
+            <w:hideMark/>
+          </w:tcPr>
+          <w:p>
+            <w:pPr>
+              <w:pStyle w:val="Balk1"/>
+              <w:jc w:val="center"/>
+              <w:outlineLvl w:val="0"/>
+              <w:rPr>
+                <w:sz w:val="24"/>
+                <w:szCs w:val="24"/>
+                <w:lang w:eastAsia="en-US"/>
+              </w:rPr>
+            </w:pPr>
+            <w:r>
+              <w:rPr>
+                <w:b w:val="0"/>
+                <w:bCs w:val="0"/>
+                <w:color w:val="FFC000"/>
+                <w:sz w:val="24"/>
+                <w:szCs w:val="24"/>
+                <w:bdr w:val="none" w:sz="0" w:space="0" w:color="auto" w:frame="1"/>
+                <w:lang w:eastAsia="en-US"/>
+              </w:rPr>
+              <w:t>Turuncu</w:t>
+            </w:r>
+          </w:p>
+        </w:tc>
+        <w:tc>
+          <w:tcPr>
+            <w:tcW w:w="3381" w:type="dxa"/>
+            <w:tcBorders>
+              <w:top w:val="single" w:sz="4" w:space="0" w:color="auto"/>
+              <w:left w:val="single" w:sz="4" w:space="0" w:color="auto"/>
+              <w:bottom w:val="single" w:sz="4" w:space="0" w:color="auto"/>
+              <w:right w:val="single" w:sz="4" w:space="0" w:color="auto"/>
+            </w:tcBorders>
+            <w:vAlign w:val="center"/>
+            <w:hideMark/>
+          </w:tcPr>
+          <w:p>
+            <w:pPr>
+              <w:pStyle w:val="Balk1"/>
+              <w:jc w:val="both"/>
+              <w:outlineLvl w:val="0"/>
+              <w:rPr>
+                <w:b w:val="0"/>
+                <w:bCs w:val="0"/>
+                <w:sz w:val="24"/>
+                <w:szCs w:val="24"/>
+                <w:lang w:eastAsia="en-US"/>
+              </w:rPr>
+            </w:pPr>
+            <w:r>
+              <w:rPr>
+                <w:b w:val="0"/>
+                <w:bCs w:val="0"/>
+                <w:color w:val="1F1F1F"/>
+                <w:sz w:val="24"/>
+                <w:szCs w:val="24"/>
+                <w:bdr w:val="none" w:sz="0" w:space="0" w:color="auto" w:frame="1"/>
+                <w:lang w:eastAsia="en-US"/>
+              </w:rPr>
+              <w:t>Yapısal hasar riski taşıyan depremler için ön uyarı.</w:t>
+            </w:r>
+          </w:p>
+        </w:tc>
+      </w:tr>
+      <w:tr>
+        <w:trPr>
+          <w:trHeight w:val="69"/>
+        </w:trPr>
+        <w:tc>
+          <w:tcPr>
+            <w:tcW w:w="1742" w:type="dxa"/>
+            <w:tcBorders>
+              <w:top w:val="single" w:sz="4" w:space="0" w:color="auto"/>
+              <w:left w:val="single" w:sz="4" w:space="0" w:color="auto"/>
+              <w:bottom w:val="single" w:sz="4" w:space="0" w:color="auto"/>
+              <w:right w:val="single" w:sz="4" w:space="0" w:color="auto"/>
+            </w:tcBorders>
+            <w:vAlign w:val="center"/>
+            <w:hideMark/>
+          </w:tcPr>
+          <w:p>
+            <w:pPr>
+              <w:pStyle w:val="Balk1"/>
+              <w:jc w:val="both"/>
+              <w:outlineLvl w:val="0"/>
+              <w:rPr>
+                <w:sz w:val="24"/>
+                <w:szCs w:val="24"/>
+                <w:lang w:eastAsia="en-US"/>
+              </w:rPr>
+            </w:pPr>
+            <w:r>
+              <w:rPr>
+                <w:b w:val="0"/>
+                <w:bCs w:val="0"/>
+                <w:color w:val="1F1F1F"/>
+                <w:sz w:val="24"/>
+                <w:szCs w:val="24"/>
+                <w:bdr w:val="none" w:sz="0" w:space="0" w:color="auto" w:frame="1"/>
+                <w:lang w:eastAsia="en-US"/>
+              </w:rPr>
+              <w:t>Kategorik Etiket (Label 3)</w:t>
+            </w:r>
+          </w:p>
+        </w:tc>
+        <w:tc>
+          <w:tcPr>
+            <w:tcW w:w="1753" w:type="dxa"/>
+            <w:tcBorders>
+              <w:top w:val="single" w:sz="4" w:space="0" w:color="auto"/>
+              <w:left w:val="single" w:sz="4" w:space="0" w:color="auto"/>
+              <w:bottom w:val="single" w:sz="4" w:space="0" w:color="auto"/>
+              <w:right w:val="single" w:sz="4" w:space="0" w:color="auto"/>
+            </w:tcBorders>
+            <w:vAlign w:val="center"/>
+            <w:hideMark/>
+          </w:tcPr>
+          <w:p>
+            <w:pPr>
+              <w:pStyle w:val="Balk1"/>
+              <w:jc w:val="center"/>
+              <w:outlineLvl w:val="0"/>
+              <w:rPr>
+                <w:sz w:val="24"/>
+                <w:szCs w:val="24"/>
+                <w:lang w:eastAsia="en-US"/>
+              </w:rPr>
+            </w:pPr>
+            <w:r>
+              <w:rPr>
+                <w:b w:val="0"/>
+                <w:bCs w:val="0"/>
+                <w:color w:val="1F1F1F"/>
+                <w:sz w:val="24"/>
+                <w:szCs w:val="24"/>
+                <w:bdr w:val="none" w:sz="0" w:space="0" w:color="auto" w:frame="1"/>
+                <w:lang w:eastAsia="en-US"/>
+              </w:rPr>
+              <w:t>Strong</w:t>
+            </w:r>
+            <w:r>
+              <w:rPr>
+                <w:color w:val="1F1F1F"/>
+                <w:sz w:val="24"/>
+                <w:szCs w:val="24"/>
+                <w:bdr w:val="none" w:sz="0" w:space="0" w:color="auto" w:frame="1"/>
+                <w:lang w:eastAsia="en-US"/>
+              </w:rPr>
+              <w:t xml:space="preserve"> (Kritik)</w:t>
+            </w:r>
+          </w:p>
+        </w:tc>
+        <w:tc>
+          <w:tcPr>
+            <w:tcW w:w="1713" w:type="dxa"/>
+            <w:tcBorders>
+              <w:top w:val="single" w:sz="4" w:space="0" w:color="auto"/>
+              <w:left w:val="single" w:sz="4" w:space="0" w:color="auto"/>
+              <w:bottom w:val="single" w:sz="4" w:space="0" w:color="auto"/>
+              <w:right w:val="single" w:sz="4" w:space="0" w:color="auto"/>
+            </w:tcBorders>
+            <w:vAlign w:val="center"/>
+            <w:hideMark/>
+          </w:tcPr>
+          <w:p>
+            <w:pPr>
+              <w:pStyle w:val="Balk1"/>
+              <w:jc w:val="center"/>
+              <w:outlineLvl w:val="0"/>
+              <w:rPr>
+                <w:b w:val="0"/>
+                <w:bCs w:val="0"/>
+                <w:sz w:val="24"/>
+                <w:szCs w:val="24"/>
+                <w:lang w:eastAsia="en-US"/>
+              </w:rPr>
+            </w:pPr>
+            <w:r>
+              <w:rPr>
+                <w:rStyle w:val="math-inline"/>
+                <w:b w:val="0"/>
+                <w:bCs w:val="0"/>
+                <w:color w:val="1F1F1F"/>
+                <w:sz w:val="24"/>
+                <w:szCs w:val="24"/>
+                <w:bdr w:val="none" w:sz="0" w:space="0" w:color="auto" w:frame="1"/>
+                <w:lang w:eastAsia="en-US"/>
+              </w:rPr>
+              <w:t>6.0</w:t>
+            </w:r>
+            <w:r>
+              <w:rPr>
+                <w:b w:val="0"/>
+                <w:bCs w:val="0"/>
+                <w:color w:val="1F1F1F"/>
+                <w:sz w:val="24"/>
+                <w:szCs w:val="24"/>
+                <w:bdr w:val="none" w:sz="0" w:space="0" w:color="auto" w:frame="1"/>
+                <w:lang w:eastAsia="en-US"/>
+              </w:rPr>
+              <w:t xml:space="preserve"> ve Üzeri</w:t>
+            </w:r>
+          </w:p>
+        </w:tc>
+        <w:tc>
+          <w:tcPr>
+            <w:tcW w:w="1040" w:type="dxa"/>
+            <w:tcBorders>
+              <w:top w:val="single" w:sz="4" w:space="0" w:color="auto"/>
+              <w:left w:val="single" w:sz="4" w:space="0" w:color="auto"/>
+              <w:bottom w:val="single" w:sz="4" w:space="0" w:color="auto"/>
+              <w:right w:val="single" w:sz="4" w:space="0" w:color="auto"/>
+            </w:tcBorders>
+            <w:vAlign w:val="center"/>
+            <w:hideMark/>
+          </w:tcPr>
+          <w:p>
+            <w:pPr>
+              <w:pStyle w:val="Balk1"/>
+              <w:jc w:val="center"/>
+              <w:outlineLvl w:val="0"/>
+              <w:rPr>
+                <w:sz w:val="24"/>
+                <w:szCs w:val="24"/>
+                <w:lang w:eastAsia="en-US"/>
+              </w:rPr>
+            </w:pPr>
+            <w:r>
+              <w:rPr>
+                <w:b w:val="0"/>
+                <w:bCs w:val="0"/>
+                <w:color w:val="EE0000"/>
+                <w:sz w:val="24"/>
+                <w:szCs w:val="24"/>
+                <w:bdr w:val="none" w:sz="0" w:space="0" w:color="auto" w:frame="1"/>
+                <w:lang w:eastAsia="en-US"/>
+              </w:rPr>
+              <w:t>Kırmızı</w:t>
+            </w:r>
+          </w:p>
+        </w:tc>
+        <w:tc>
+          <w:tcPr>
+            <w:tcW w:w="3381" w:type="dxa"/>
+            <w:tcBorders>
+              <w:top w:val="single" w:sz="4" w:space="0" w:color="auto"/>
+              <w:left w:val="single" w:sz="4" w:space="0" w:color="auto"/>
+              <w:bottom w:val="single" w:sz="4" w:space="0" w:color="auto"/>
+              <w:right w:val="single" w:sz="4" w:space="0" w:color="auto"/>
+            </w:tcBorders>
+            <w:vAlign w:val="center"/>
+            <w:hideMark/>
+          </w:tcPr>
+          <w:p>
+            <w:pPr>
+              <w:pStyle w:val="Balk1"/>
+              <w:jc w:val="both"/>
+              <w:outlineLvl w:val="0"/>
+              <w:rPr>
+                <w:b w:val="0"/>
+                <w:bCs w:val="0"/>
+                <w:sz w:val="24"/>
+                <w:szCs w:val="24"/>
+                <w:lang w:eastAsia="en-US"/>
+              </w:rPr>
+            </w:pPr>
+            <w:r>
+              <w:rPr>
+                <w:b w:val="0"/>
+                <w:bCs w:val="0"/>
+                <w:color w:val="1F1F1F"/>
+                <w:sz w:val="24"/>
+                <w:szCs w:val="24"/>
+                <w:bdr w:val="none" w:sz="0" w:space="0" w:color="auto" w:frame="1"/>
+                <w:lang w:eastAsia="en-US"/>
+              </w:rPr>
+              <w:t>Acil durum yönetimi ve tahliye protokolleri tetikleyicisi.</w:t>
+            </w:r>
+          </w:p>
+        </w:tc>
+      </w:tr>
+    </w:tbl>
+    <w:p>
+      <w:pPr>
+        <w:pStyle w:val="NormalWeb"/>
+        <w:spacing w:before="0" w:beforeAutospacing="0"/>
+        <w:rPr>
+          <w:rFonts w:hAnsi="Symbol"/>
+        </w:rPr>
+      </w:pPr>
+    </w:p>
+    <w:p>
+      <w:pPr>
+        <w:pStyle w:val="NormalWeb"/>
+        <w:spacing w:before="0" w:beforeAutospacing="0"/>
+        <w:jc w:val="both"/>
+      </w:pPr>
+      <w:r>
+        <w:rPr>
+          <w:b/>
+          <w:bCs/>
+        </w:rPr>
+        <w:t>Birincil Etiketler (Primary Labels):</w:t>
+      </w:r>
+      <w:r>
+        <w:t xml:space="preserve"> Modelin öğrenme sürecinde (training phase) kullanılan etiketler, deprem kataloğundan alınan gerçek Moment Magnitüd</w:t>
+      </w:r>
+      <w:r>
+        <w:rPr>
+          <w:b/>
+          <w:bCs/>
+        </w:rPr>
+        <w:t xml:space="preserve"> </w:t>
+      </w:r>
+      <w:r>
+        <w:t>(</w:t>
+      </w:r>
+      <w:r>
+        <w:rPr>
+          <w:rStyle w:val="math-inline"/>
+        </w:rPr>
+        <w:t>Mw</w:t>
+      </w:r>
+      <w:r>
+        <w:t>) değerleridir. Bu, modelin doğrusal olmayan sismik hareketleri en yüksek hassasiyetle öğrenmesini sağlar.</w:t>
+      </w:r>
+    </w:p>
+    <w:p>
+      <w:pPr>
+        <w:pStyle w:val="NormalWeb"/>
+        <w:spacing w:before="0" w:beforeAutospacing="0"/>
+        <w:jc w:val="both"/>
+      </w:pPr>
+      <w:r>
+        <w:rPr>
+          <w:b/>
+          <w:bCs/>
+        </w:rPr>
+        <w:t>İkincil Etiketler (Operational Labels):</w:t>
+      </w:r>
+      <w:r>
+        <w:t xml:space="preserve"> Modelin ürettiği sayısal çıktıların (inference) karar destek sistemlerinde kullanılabilmesi için yukarıdaki tabloda belirtilen 4 ana sınıf etiketine dönüştürülmesi hedeflenmiştir.</w:t>
+      </w:r>
+    </w:p>
+    <w:p>
+      <w:pPr>
+        <w:pStyle w:val="Balk1"/>
+        <w:rPr>
+          <w:rStyle w:val="Gl"/>
+          <w:b/>
+          <w:bCs/>
+        </w:rPr>
+      </w:pPr>
+      <w:r>
+        <w:rPr>
+          <w:rStyle w:val="Gl"/>
+          <w:b/>
+          <w:bCs/>
+        </w:rPr>
+        <w:lastRenderedPageBreak/>
+        <w:t>5.</w:t>
+      </w:r>
+      <w:r>
+        <w:rPr>
+          <w:rStyle w:val="Gl"/>
+          <w:b/>
+          <w:bCs/>
+        </w:rPr>
+        <w:t>3</w:t>
+      </w:r>
+      <w:r>
+        <w:rPr>
+          <w:rStyle w:val="Gl"/>
+          <w:b/>
+          <w:bCs/>
+        </w:rPr>
+        <w:t xml:space="preserve"> </w:t>
+      </w:r>
+      <w:r>
+        <w:rPr>
+          <w:rStyle w:val="Gl"/>
+          <w:b/>
+          <w:bCs/>
+        </w:rPr>
+        <w:t>Teknik Bölümleme</w:t>
+      </w:r>
+    </w:p>
+    <w:p>
+      <w:pPr>
+        <w:rPr>
+          <w:b/>
+          <w:bCs/>
+        </w:rPr>
+      </w:pPr>
+    </w:p>
+    <w:tbl>
+      <w:tblPr>
+        <w:tblW w:w="8219" w:type="dxa"/>
+        <w:tblCellSpacing w:w="15" w:type="dxa"/>
+        <w:tblLook w:val="04A0" w:firstRow="1" w:lastRow="0" w:firstColumn="1" w:lastColumn="0" w:noHBand="0" w:noVBand="1"/>
+      </w:tblPr>
+      <w:tblGrid>
+        <w:gridCol w:w="1803"/>
+        <w:gridCol w:w="1164"/>
+        <w:gridCol w:w="1281"/>
+        <w:gridCol w:w="2581"/>
+        <w:gridCol w:w="1390"/>
+      </w:tblGrid>
+      <w:tr>
+        <w:trPr>
+          <w:trHeight w:val="638"/>
+          <w:tblHeader/>
+          <w:tblCellSpacing w:w="15" w:type="dxa"/>
+        </w:trPr>
+        <w:tc>
+          <w:tcPr>
+            <w:tcW w:w="0" w:type="auto"/>
+            <w:tcBorders>
+              <w:top w:val="single" w:sz="6" w:space="0" w:color="auto"/>
+              <w:left w:val="single" w:sz="6" w:space="0" w:color="auto"/>
+              <w:bottom w:val="single" w:sz="6" w:space="0" w:color="auto"/>
+              <w:right w:val="single" w:sz="6" w:space="0" w:color="auto"/>
+            </w:tcBorders>
+            <w:tcMar>
+              <w:top w:w="15" w:type="dxa"/>
+              <w:left w:w="15" w:type="dxa"/>
+              <w:bottom w:w="15" w:type="dxa"/>
+              <w:right w:w="15" w:type="dxa"/>
+            </w:tcMar>
+            <w:vAlign w:val="center"/>
+            <w:hideMark/>
+          </w:tcPr>
+          <w:p>
+            <w:r>
+              <w:rPr>
+                <w:b/>
+                <w:bCs/>
+              </w:rPr>
+              <w:t>Bölüm (Split)</w:t>
+            </w:r>
+          </w:p>
+        </w:tc>
+        <w:tc>
+          <w:tcPr>
+            <w:tcW w:w="0" w:type="auto"/>
+            <w:tcBorders>
+              <w:top w:val="single" w:sz="6" w:space="0" w:color="auto"/>
+              <w:left w:val="single" w:sz="6" w:space="0" w:color="auto"/>
+              <w:bottom w:val="single" w:sz="6" w:space="0" w:color="auto"/>
+              <w:right w:val="single" w:sz="6" w:space="0" w:color="auto"/>
+            </w:tcBorders>
+            <w:tcMar>
+              <w:top w:w="15" w:type="dxa"/>
+              <w:left w:w="15" w:type="dxa"/>
+              <w:bottom w:w="15" w:type="dxa"/>
+              <w:right w:w="15" w:type="dxa"/>
+            </w:tcMar>
+            <w:vAlign w:val="center"/>
+            <w:hideMark/>
+          </w:tcPr>
+          <w:p>
+            <w:r>
+              <w:rPr>
+                <w:b/>
+                <w:bCs/>
+              </w:rPr>
+              <w:t>Ana Oran</w:t>
+            </w:r>
+          </w:p>
+        </w:tc>
+        <w:tc>
+          <w:tcPr>
+            <w:tcW w:w="0" w:type="auto"/>
+            <w:tcBorders>
+              <w:top w:val="single" w:sz="6" w:space="0" w:color="auto"/>
+              <w:left w:val="single" w:sz="6" w:space="0" w:color="auto"/>
+              <w:bottom w:val="single" w:sz="6" w:space="0" w:color="auto"/>
+              <w:right w:val="single" w:sz="6" w:space="0" w:color="auto"/>
+            </w:tcBorders>
+            <w:tcMar>
+              <w:top w:w="15" w:type="dxa"/>
+              <w:left w:w="15" w:type="dxa"/>
+              <w:bottom w:w="15" w:type="dxa"/>
+              <w:right w:w="15" w:type="dxa"/>
+            </w:tcMar>
+            <w:vAlign w:val="center"/>
+            <w:hideMark/>
+          </w:tcPr>
+          <w:p>
+            <w:r>
+              <w:rPr>
+                <w:b/>
+                <w:bCs/>
+              </w:rPr>
+              <w:t>Detay Oran</w:t>
+            </w:r>
+          </w:p>
+        </w:tc>
+        <w:tc>
+          <w:tcPr>
+            <w:tcW w:w="0" w:type="auto"/>
+            <w:tcBorders>
+              <w:top w:val="single" w:sz="6" w:space="0" w:color="auto"/>
+              <w:left w:val="single" w:sz="6" w:space="0" w:color="auto"/>
+              <w:bottom w:val="single" w:sz="6" w:space="0" w:color="auto"/>
+              <w:right w:val="single" w:sz="6" w:space="0" w:color="auto"/>
+            </w:tcBorders>
+            <w:tcMar>
+              <w:top w:w="15" w:type="dxa"/>
+              <w:left w:w="15" w:type="dxa"/>
+              <w:bottom w:w="15" w:type="dxa"/>
+              <w:right w:w="15" w:type="dxa"/>
+            </w:tcMar>
+            <w:vAlign w:val="center"/>
+            <w:hideMark/>
+          </w:tcPr>
+          <w:p>
+            <w:r>
+              <w:rPr>
+                <w:b/>
+                <w:bCs/>
+              </w:rPr>
+              <w:t>Başlangıç - Bitiş Tarihi</w:t>
+            </w:r>
+          </w:p>
+        </w:tc>
+        <w:tc>
+          <w:tcPr>
+            <w:tcW w:w="0" w:type="auto"/>
+            <w:tcBorders>
+              <w:top w:val="single" w:sz="6" w:space="0" w:color="auto"/>
+              <w:left w:val="single" w:sz="6" w:space="0" w:color="auto"/>
+              <w:bottom w:val="single" w:sz="6" w:space="0" w:color="auto"/>
+              <w:right w:val="single" w:sz="6" w:space="0" w:color="auto"/>
+            </w:tcBorders>
+            <w:tcMar>
+              <w:top w:w="15" w:type="dxa"/>
+              <w:left w:w="15" w:type="dxa"/>
+              <w:bottom w:w="15" w:type="dxa"/>
+              <w:right w:w="15" w:type="dxa"/>
+            </w:tcMar>
+            <w:vAlign w:val="center"/>
+            <w:hideMark/>
+          </w:tcPr>
+          <w:p>
+            <w:r>
+              <w:rPr>
+                <w:b/>
+                <w:bCs/>
+              </w:rPr>
+              <w:t>Örnek Sayısı</w:t>
+            </w:r>
+          </w:p>
+        </w:tc>
+      </w:tr>
+      <w:tr>
+        <w:trPr>
+          <w:trHeight w:val="638"/>
+          <w:tblCellSpacing w:w="15" w:type="dxa"/>
+        </w:trPr>
+        <w:tc>
+          <w:tcPr>
+            <w:tcW w:w="0" w:type="auto"/>
+            <w:tcBorders>
+              <w:top w:val="single" w:sz="6" w:space="0" w:color="auto"/>
+              <w:left w:val="single" w:sz="6" w:space="0" w:color="auto"/>
+              <w:bottom w:val="single" w:sz="6" w:space="0" w:color="auto"/>
+              <w:right w:val="single" w:sz="6" w:space="0" w:color="auto"/>
+            </w:tcBorders>
+            <w:tcMar>
+              <w:top w:w="15" w:type="dxa"/>
+              <w:left w:w="15" w:type="dxa"/>
+              <w:bottom w:w="15" w:type="dxa"/>
+              <w:right w:w="15" w:type="dxa"/>
+            </w:tcMar>
+            <w:vAlign w:val="center"/>
+            <w:hideMark/>
+          </w:tcPr>
+          <w:p>
+            <w:r>
+              <w:rPr>
+                <w:b/>
+                <w:bCs/>
+              </w:rPr>
+              <w:t>Eğitim (Train)</w:t>
+            </w:r>
+          </w:p>
+        </w:tc>
+        <w:tc>
+          <w:tcPr>
+            <w:tcW w:w="0" w:type="auto"/>
+            <w:tcBorders>
+              <w:top w:val="single" w:sz="6" w:space="0" w:color="auto"/>
+              <w:left w:val="single" w:sz="6" w:space="0" w:color="auto"/>
+              <w:bottom w:val="single" w:sz="6" w:space="0" w:color="auto"/>
+              <w:right w:val="single" w:sz="6" w:space="0" w:color="auto"/>
+            </w:tcBorders>
+            <w:tcMar>
+              <w:top w:w="15" w:type="dxa"/>
+              <w:left w:w="15" w:type="dxa"/>
+              <w:bottom w:w="15" w:type="dxa"/>
+              <w:right w:w="15" w:type="dxa"/>
+            </w:tcMar>
+            <w:vAlign w:val="center"/>
+            <w:hideMark/>
+          </w:tcPr>
+          <w:p>
+            <w:r>
+              <w:rPr>
+                <w:b/>
+                <w:bCs/>
+              </w:rPr>
+              <w:t>%80</w:t>
+            </w:r>
+          </w:p>
+        </w:tc>
+        <w:tc>
+          <w:tcPr>
+            <w:tcW w:w="0" w:type="auto"/>
+            <w:tcBorders>
+              <w:top w:val="single" w:sz="6" w:space="0" w:color="auto"/>
+              <w:left w:val="single" w:sz="6" w:space="0" w:color="auto"/>
+              <w:bottom w:val="single" w:sz="6" w:space="0" w:color="auto"/>
+              <w:right w:val="single" w:sz="6" w:space="0" w:color="auto"/>
+            </w:tcBorders>
+            <w:tcMar>
+              <w:top w:w="15" w:type="dxa"/>
+              <w:left w:w="15" w:type="dxa"/>
+              <w:bottom w:w="15" w:type="dxa"/>
+              <w:right w:w="15" w:type="dxa"/>
+            </w:tcMar>
+            <w:vAlign w:val="center"/>
+            <w:hideMark/>
+          </w:tcPr>
+          <w:p>
+            <w:r>
+              <w:t>%70</w:t>
+            </w:r>
+          </w:p>
+        </w:tc>
+        <w:tc>
+          <w:tcPr>
+            <w:tcW w:w="0" w:type="auto"/>
+            <w:tcBorders>
+              <w:top w:val="single" w:sz="6" w:space="0" w:color="auto"/>
+              <w:left w:val="single" w:sz="6" w:space="0" w:color="auto"/>
+              <w:bottom w:val="single" w:sz="6" w:space="0" w:color="auto"/>
+              <w:right w:val="single" w:sz="6" w:space="0" w:color="auto"/>
+            </w:tcBorders>
+            <w:tcMar>
+              <w:top w:w="15" w:type="dxa"/>
+              <w:left w:w="15" w:type="dxa"/>
+              <w:bottom w:w="15" w:type="dxa"/>
+              <w:right w:w="15" w:type="dxa"/>
+            </w:tcMar>
+            <w:vAlign w:val="center"/>
+            <w:hideMark/>
+          </w:tcPr>
+          <w:p>
+            <w:r>
+              <w:rPr>
+                <w:b/>
+                <w:bCs/>
+              </w:rPr>
+              <w:t>03.01.1990 - 15.08.2015</w:t>
+            </w:r>
+          </w:p>
+        </w:tc>
+        <w:tc>
+          <w:tcPr>
+            <w:tcW w:w="0" w:type="auto"/>
+            <w:tcBorders>
+              <w:top w:val="single" w:sz="6" w:space="0" w:color="auto"/>
+              <w:left w:val="single" w:sz="6" w:space="0" w:color="auto"/>
+              <w:bottom w:val="single" w:sz="6" w:space="0" w:color="auto"/>
+              <w:right w:val="single" w:sz="6" w:space="0" w:color="auto"/>
+            </w:tcBorders>
+            <w:tcMar>
+              <w:top w:w="15" w:type="dxa"/>
+              <w:left w:w="15" w:type="dxa"/>
+              <w:bottom w:w="15" w:type="dxa"/>
+              <w:right w:w="15" w:type="dxa"/>
+            </w:tcMar>
+            <w:vAlign w:val="center"/>
+            <w:hideMark/>
+          </w:tcPr>
+          <w:p>
+            <w:r>
+              <w:t>22.341</w:t>
+            </w:r>
+          </w:p>
+        </w:tc>
+      </w:tr>
+      <w:tr>
+        <w:trPr>
+          <w:trHeight w:val="658"/>
+          <w:tblCellSpacing w:w="15" w:type="dxa"/>
+        </w:trPr>
+        <w:tc>
+          <w:tcPr>
+            <w:tcW w:w="0" w:type="auto"/>
+            <w:tcBorders>
+              <w:top w:val="single" w:sz="6" w:space="0" w:color="auto"/>
+              <w:left w:val="single" w:sz="6" w:space="0" w:color="auto"/>
+              <w:bottom w:val="single" w:sz="6" w:space="0" w:color="auto"/>
+              <w:right w:val="single" w:sz="6" w:space="0" w:color="auto"/>
+            </w:tcBorders>
+            <w:tcMar>
+              <w:top w:w="15" w:type="dxa"/>
+              <w:left w:w="15" w:type="dxa"/>
+              <w:bottom w:w="15" w:type="dxa"/>
+              <w:right w:w="15" w:type="dxa"/>
+            </w:tcMar>
+            <w:vAlign w:val="center"/>
+            <w:hideMark/>
+          </w:tcPr>
+          <w:p>
+            <w:r>
+              <w:rPr>
+                <w:b/>
+                <w:bCs/>
+              </w:rPr>
+              <w:t>Doğrulama (Val)</w:t>
+            </w:r>
+          </w:p>
+        </w:tc>
+        <w:tc>
+          <w:tcPr>
+            <w:tcW w:w="0" w:type="auto"/>
+            <w:tcBorders>
+              <w:top w:val="single" w:sz="6" w:space="0" w:color="auto"/>
+              <w:left w:val="single" w:sz="6" w:space="0" w:color="auto"/>
+              <w:bottom w:val="single" w:sz="6" w:space="0" w:color="auto"/>
+              <w:right w:val="single" w:sz="6" w:space="0" w:color="auto"/>
+            </w:tcBorders>
+            <w:tcMar>
+              <w:top w:w="15" w:type="dxa"/>
+              <w:left w:w="15" w:type="dxa"/>
+              <w:bottom w:w="15" w:type="dxa"/>
+              <w:right w:w="15" w:type="dxa"/>
+            </w:tcMar>
+            <w:vAlign w:val="center"/>
+            <w:hideMark/>
+          </w:tcPr>
+          <w:p>
+            <w:r>
+              <w:t>(Eğitim içi)</w:t>
+            </w:r>
+          </w:p>
+        </w:tc>
+        <w:tc>
+          <w:tcPr>
+            <w:tcW w:w="0" w:type="auto"/>
+            <w:tcBorders>
+              <w:top w:val="single" w:sz="6" w:space="0" w:color="auto"/>
+              <w:left w:val="single" w:sz="6" w:space="0" w:color="auto"/>
+              <w:bottom w:val="single" w:sz="6" w:space="0" w:color="auto"/>
+              <w:right w:val="single" w:sz="6" w:space="0" w:color="auto"/>
+            </w:tcBorders>
+            <w:tcMar>
+              <w:top w:w="15" w:type="dxa"/>
+              <w:left w:w="15" w:type="dxa"/>
+              <w:bottom w:w="15" w:type="dxa"/>
+              <w:right w:w="15" w:type="dxa"/>
+            </w:tcMar>
+            <w:vAlign w:val="center"/>
+            <w:hideMark/>
+          </w:tcPr>
+          <w:p>
+            <w:r>
+              <w:t>%10</w:t>
+            </w:r>
+          </w:p>
+        </w:tc>
+        <w:tc>
+          <w:tcPr>
+            <w:tcW w:w="0" w:type="auto"/>
+            <w:tcBorders>
+              <w:top w:val="single" w:sz="6" w:space="0" w:color="auto"/>
+              <w:left w:val="single" w:sz="6" w:space="0" w:color="auto"/>
+              <w:bottom w:val="single" w:sz="6" w:space="0" w:color="auto"/>
+              <w:right w:val="single" w:sz="6" w:space="0" w:color="auto"/>
+            </w:tcBorders>
+            <w:tcMar>
+              <w:top w:w="15" w:type="dxa"/>
+              <w:left w:w="15" w:type="dxa"/>
+              <w:bottom w:w="15" w:type="dxa"/>
+              <w:right w:w="15" w:type="dxa"/>
+            </w:tcMar>
+            <w:vAlign w:val="center"/>
+            <w:hideMark/>
+          </w:tcPr>
+          <w:p>
+            <w:r>
+              <w:rPr>
+                <w:b/>
+                <w:bCs/>
+              </w:rPr>
+              <w:t>15.08.2015 - 19.11.2020</w:t>
+            </w:r>
+          </w:p>
+        </w:tc>
+        <w:tc>
+          <w:tcPr>
+            <w:tcW w:w="0" w:type="auto"/>
+            <w:tcBorders>
+              <w:top w:val="single" w:sz="6" w:space="0" w:color="auto"/>
+              <w:left w:val="single" w:sz="6" w:space="0" w:color="auto"/>
+              <w:bottom w:val="single" w:sz="6" w:space="0" w:color="auto"/>
+              <w:right w:val="single" w:sz="6" w:space="0" w:color="auto"/>
+            </w:tcBorders>
+            <w:tcMar>
+              <w:top w:w="15" w:type="dxa"/>
+              <w:left w:w="15" w:type="dxa"/>
+              <w:bottom w:w="15" w:type="dxa"/>
+              <w:right w:w="15" w:type="dxa"/>
+            </w:tcMar>
+            <w:vAlign w:val="center"/>
+            <w:hideMark/>
+          </w:tcPr>
+          <w:p>
+            <w:r>
+              <w:t>3.191</w:t>
+            </w:r>
+          </w:p>
+        </w:tc>
+      </w:tr>
+      <w:tr>
+        <w:trPr>
+          <w:trHeight w:val="620"/>
+          <w:tblCellSpacing w:w="15" w:type="dxa"/>
+        </w:trPr>
+        <w:tc>
+          <w:tcPr>
+            <w:tcW w:w="0" w:type="auto"/>
+            <w:tcBorders>
+              <w:top w:val="single" w:sz="6" w:space="0" w:color="auto"/>
+              <w:left w:val="single" w:sz="6" w:space="0" w:color="auto"/>
+              <w:bottom w:val="single" w:sz="6" w:space="0" w:color="auto"/>
+              <w:right w:val="single" w:sz="6" w:space="0" w:color="auto"/>
+            </w:tcBorders>
+            <w:tcMar>
+              <w:top w:w="15" w:type="dxa"/>
+              <w:left w:w="15" w:type="dxa"/>
+              <w:bottom w:w="15" w:type="dxa"/>
+              <w:right w:w="15" w:type="dxa"/>
+            </w:tcMar>
+            <w:vAlign w:val="center"/>
+            <w:hideMark/>
+          </w:tcPr>
+          <w:p>
+            <w:r>
+              <w:rPr>
+                <w:b/>
+                <w:bCs/>
+              </w:rPr>
+              <w:t>Test</w:t>
+            </w:r>
+          </w:p>
+        </w:tc>
+        <w:tc>
+          <w:tcPr>
+            <w:tcW w:w="0" w:type="auto"/>
+            <w:tcBorders>
+              <w:top w:val="single" w:sz="6" w:space="0" w:color="auto"/>
+              <w:left w:val="single" w:sz="6" w:space="0" w:color="auto"/>
+              <w:bottom w:val="single" w:sz="6" w:space="0" w:color="auto"/>
+              <w:right w:val="single" w:sz="6" w:space="0" w:color="auto"/>
+            </w:tcBorders>
+            <w:tcMar>
+              <w:top w:w="15" w:type="dxa"/>
+              <w:left w:w="15" w:type="dxa"/>
+              <w:bottom w:w="15" w:type="dxa"/>
+              <w:right w:w="15" w:type="dxa"/>
+            </w:tcMar>
+            <w:vAlign w:val="center"/>
+            <w:hideMark/>
+          </w:tcPr>
+          <w:p>
+            <w:r>
+              <w:rPr>
+                <w:b/>
+                <w:bCs/>
+              </w:rPr>
+              <w:t>%20</w:t>
+            </w:r>
+          </w:p>
+        </w:tc>
+        <w:tc>
+          <w:tcPr>
+            <w:tcW w:w="0" w:type="auto"/>
+            <w:tcBorders>
+              <w:top w:val="single" w:sz="6" w:space="0" w:color="auto"/>
+              <w:left w:val="single" w:sz="6" w:space="0" w:color="auto"/>
+              <w:bottom w:val="single" w:sz="6" w:space="0" w:color="auto"/>
+              <w:right w:val="single" w:sz="6" w:space="0" w:color="auto"/>
+            </w:tcBorders>
+            <w:tcMar>
+              <w:top w:w="15" w:type="dxa"/>
+              <w:left w:w="15" w:type="dxa"/>
+              <w:bottom w:w="15" w:type="dxa"/>
+              <w:right w:w="15" w:type="dxa"/>
+            </w:tcMar>
+            <w:vAlign w:val="center"/>
+            <w:hideMark/>
+          </w:tcPr>
+          <w:p>
+            <w:r>
+              <w:t>%20</w:t>
+            </w:r>
+          </w:p>
+        </w:tc>
+        <w:tc>
+          <w:tcPr>
+            <w:tcW w:w="0" w:type="auto"/>
+            <w:tcBorders>
+              <w:top w:val="single" w:sz="6" w:space="0" w:color="auto"/>
+              <w:left w:val="single" w:sz="6" w:space="0" w:color="auto"/>
+              <w:bottom w:val="single" w:sz="6" w:space="0" w:color="auto"/>
+              <w:right w:val="single" w:sz="6" w:space="0" w:color="auto"/>
+            </w:tcBorders>
+            <w:tcMar>
+              <w:top w:w="15" w:type="dxa"/>
+              <w:left w:w="15" w:type="dxa"/>
+              <w:bottom w:w="15" w:type="dxa"/>
+              <w:right w:w="15" w:type="dxa"/>
+            </w:tcMar>
+            <w:vAlign w:val="center"/>
+            <w:hideMark/>
+          </w:tcPr>
+          <w:p>
+            <w:r>
+              <w:rPr>
+                <w:b/>
+                <w:bCs/>
+              </w:rPr>
+              <w:t>19.11.2020 - 21.11.2025</w:t>
+            </w:r>
+          </w:p>
+        </w:tc>
+        <w:tc>
+          <w:tcPr>
+            <w:tcW w:w="0" w:type="auto"/>
+            <w:tcBorders>
+              <w:top w:val="single" w:sz="6" w:space="0" w:color="auto"/>
+              <w:left w:val="single" w:sz="6" w:space="0" w:color="auto"/>
+              <w:bottom w:val="single" w:sz="6" w:space="0" w:color="auto"/>
+              <w:right w:val="single" w:sz="6" w:space="0" w:color="auto"/>
+            </w:tcBorders>
+            <w:tcMar>
+              <w:top w:w="15" w:type="dxa"/>
+              <w:left w:w="15" w:type="dxa"/>
+              <w:bottom w:w="15" w:type="dxa"/>
+              <w:right w:w="15" w:type="dxa"/>
+            </w:tcMar>
+            <w:vAlign w:val="center"/>
+            <w:hideMark/>
+          </w:tcPr>
+          <w:p>
+            <w:r>
+              <w:t>6.384</w:t>
+            </w:r>
+          </w:p>
+        </w:tc>
+      </w:tr>
+    </w:tbl>
+    <w:p>
+      <w:pPr>
+        <w:pStyle w:val="Balk1"/>
+      </w:pPr>
+    </w:p>
+    <w:p>
+      <w:pPr>
+        <w:pStyle w:val="NormalWeb"/>
+        <w:spacing w:before="0" w:beforeAutospacing="0"/>
         <w:jc w:val="both"/>
         <w:rPr>
           <w:rStyle w:val="Gl"/>
@@ -3619,6 +5636,7 @@
           <w:sz w:val="28"/>
           <w:szCs w:val="28"/>
         </w:rPr>
+        <w:lastRenderedPageBreak/>
         <w:t>2 nci öğrenci</w:t>
       </w:r>
       <w:r>
@@ -3727,7 +5745,6 @@
           <w:noProof/>
           <w:position w:val="-5"/>
         </w:rPr>
-        <w:lastRenderedPageBreak/>
         <w:t>Bi-LSTM (Bidirectional LSTM):</w:t>
       </w:r>
       <w:r>
@@ -4502,6 +6519,7 @@
           <w:noProof/>
           <w:position w:val="-5"/>
         </w:rPr>
+        <w:lastRenderedPageBreak/>
         <w:drawing>
           <wp:inline distT="0" distB="0" distL="0" distR="0" wp14:anchorId="594806A6" wp14:editId="5CA24BE7">
             <wp:extent cx="457200" cy="381000"/>
@@ -4600,7 +6618,6 @@
           <w:noProof/>
           <w:position w:val="-5"/>
         </w:rPr>
-        <w:lastRenderedPageBreak/>
         <w:t>Dilated-CNN:</w:t>
       </w:r>
       <w:r>
@@ -5631,7 +7648,6 @@
                 <w:kern w:val="2"/>
                 <w14:ligatures w14:val="standardContextual"/>
               </w:rPr>
-              <w:lastRenderedPageBreak/>
               <w:t>Model No</w:t>
             </w:r>
           </w:p>
@@ -8670,6 +10686,946 @@
       <w:pPr>
         <w:jc w:val="both"/>
         <w:rPr>
+          <w:rFonts w:ascii="Times New Roman" w:eastAsiaTheme="minorEastAsia" w:hAnsi="Times New Roman" w:cs="Times New Roman"/>
+          <w:b/>
+          <w:bCs/>
+          <w:sz w:val="24"/>
+          <w:szCs w:val="24"/>
+          <w:lang w:eastAsia="tr-TR"/>
+        </w:rPr>
+      </w:pPr>
+    </w:p>
+    <w:p>
+      <w:pPr>
+        <w:jc w:val="both"/>
+        <w:rPr>
+          <w:rFonts w:ascii="Times New Roman" w:eastAsiaTheme="minorEastAsia" w:hAnsi="Times New Roman" w:cs="Times New Roman"/>
+          <w:b/>
+          <w:bCs/>
+          <w:sz w:val="24"/>
+          <w:szCs w:val="24"/>
+          <w:lang w:eastAsia="tr-TR"/>
+        </w:rPr>
+      </w:pPr>
+    </w:p>
+    <w:tbl>
+      <w:tblPr>
+        <w:tblW w:w="0" w:type="auto"/>
+        <w:tblCellSpacing w:w="15" w:type="dxa"/>
+        <w:tblCellMar>
+          <w:left w:w="0" w:type="dxa"/>
+          <w:right w:w="0" w:type="dxa"/>
+        </w:tblCellMar>
+        <w:tblLook w:val="04A0" w:firstRow="1" w:lastRow="0" w:firstColumn="1" w:lastColumn="0" w:noHBand="0" w:noVBand="1"/>
+      </w:tblPr>
+      <w:tblGrid>
+        <w:gridCol w:w="2181"/>
+        <w:gridCol w:w="2061"/>
+        <w:gridCol w:w="1260"/>
+        <w:gridCol w:w="3554"/>
+      </w:tblGrid>
+      <w:tr>
+        <w:trPr>
+          <w:tblHeader/>
+          <w:tblCellSpacing w:w="15" w:type="dxa"/>
+        </w:trPr>
+        <w:tc>
+          <w:tcPr>
+            <w:tcW w:w="0" w:type="auto"/>
+            <w:tcBorders>
+              <w:top w:val="single" w:sz="6" w:space="0" w:color="auto"/>
+              <w:left w:val="single" w:sz="6" w:space="0" w:color="auto"/>
+              <w:bottom w:val="single" w:sz="6" w:space="0" w:color="auto"/>
+              <w:right w:val="single" w:sz="6" w:space="0" w:color="auto"/>
+            </w:tcBorders>
+            <w:tcMar>
+              <w:top w:w="120" w:type="dxa"/>
+              <w:left w:w="180" w:type="dxa"/>
+              <w:bottom w:w="120" w:type="dxa"/>
+              <w:right w:w="180" w:type="dxa"/>
+            </w:tcMar>
+            <w:vAlign w:val="center"/>
+            <w:hideMark/>
+          </w:tcPr>
+          <w:p>
+            <w:pPr>
+              <w:spacing w:after="0" w:line="240" w:lineRule="auto"/>
+              <w:rPr>
+                <w:rFonts w:ascii="Times New Roman" w:eastAsia="Times New Roman" w:hAnsi="Times New Roman" w:cs="Times New Roman"/>
+                <w:color w:val="1F1F1F"/>
+                <w:sz w:val="24"/>
+                <w:szCs w:val="24"/>
+                <w:lang w:eastAsia="tr-TR"/>
+              </w:rPr>
+            </w:pPr>
+            <w:r>
+              <w:rPr>
+                <w:rFonts w:ascii="Times New Roman" w:eastAsia="Times New Roman" w:hAnsi="Times New Roman" w:cs="Times New Roman"/>
+                <w:b/>
+                <w:bCs/>
+                <w:color w:val="1F1F1F"/>
+                <w:sz w:val="24"/>
+                <w:szCs w:val="24"/>
+                <w:bdr w:val="none" w:sz="0" w:space="0" w:color="auto" w:frame="1"/>
+                <w:lang w:eastAsia="tr-TR"/>
+              </w:rPr>
+              <w:t>Sınıf</w:t>
+            </w:r>
+          </w:p>
+        </w:tc>
+        <w:tc>
+          <w:tcPr>
+            <w:tcW w:w="0" w:type="auto"/>
+            <w:tcBorders>
+              <w:top w:val="single" w:sz="6" w:space="0" w:color="auto"/>
+              <w:left w:val="single" w:sz="6" w:space="0" w:color="auto"/>
+              <w:bottom w:val="single" w:sz="6" w:space="0" w:color="auto"/>
+              <w:right w:val="single" w:sz="6" w:space="0" w:color="auto"/>
+            </w:tcBorders>
+            <w:tcMar>
+              <w:top w:w="120" w:type="dxa"/>
+              <w:left w:w="180" w:type="dxa"/>
+              <w:bottom w:w="120" w:type="dxa"/>
+              <w:right w:w="180" w:type="dxa"/>
+            </w:tcMar>
+            <w:vAlign w:val="center"/>
+            <w:hideMark/>
+          </w:tcPr>
+          <w:p>
+            <w:pPr>
+              <w:spacing w:after="0" w:line="240" w:lineRule="auto"/>
+              <w:rPr>
+                <w:rFonts w:ascii="Times New Roman" w:eastAsia="Times New Roman" w:hAnsi="Times New Roman" w:cs="Times New Roman"/>
+                <w:color w:val="1F1F1F"/>
+                <w:sz w:val="24"/>
+                <w:szCs w:val="24"/>
+                <w:lang w:eastAsia="tr-TR"/>
+              </w:rPr>
+            </w:pPr>
+            <w:r>
+              <w:rPr>
+                <w:rFonts w:ascii="Times New Roman" w:eastAsia="Times New Roman" w:hAnsi="Times New Roman" w:cs="Times New Roman"/>
+                <w:b/>
+                <w:bCs/>
+                <w:color w:val="1F1F1F"/>
+                <w:sz w:val="24"/>
+                <w:szCs w:val="24"/>
+                <w:bdr w:val="none" w:sz="0" w:space="0" w:color="auto" w:frame="1"/>
+                <w:lang w:eastAsia="tr-TR"/>
+              </w:rPr>
+              <w:t>Model</w:t>
+            </w:r>
+          </w:p>
+        </w:tc>
+        <w:tc>
+          <w:tcPr>
+            <w:tcW w:w="0" w:type="auto"/>
+            <w:tcBorders>
+              <w:top w:val="single" w:sz="6" w:space="0" w:color="auto"/>
+              <w:left w:val="single" w:sz="6" w:space="0" w:color="auto"/>
+              <w:bottom w:val="single" w:sz="6" w:space="0" w:color="auto"/>
+              <w:right w:val="single" w:sz="6" w:space="0" w:color="auto"/>
+            </w:tcBorders>
+            <w:tcMar>
+              <w:top w:w="120" w:type="dxa"/>
+              <w:left w:w="180" w:type="dxa"/>
+              <w:bottom w:w="120" w:type="dxa"/>
+              <w:right w:w="180" w:type="dxa"/>
+            </w:tcMar>
+            <w:vAlign w:val="center"/>
+            <w:hideMark/>
+          </w:tcPr>
+          <w:p>
+            <w:pPr>
+              <w:spacing w:after="0" w:line="240" w:lineRule="auto"/>
+              <w:rPr>
+                <w:rFonts w:ascii="Times New Roman" w:eastAsia="Times New Roman" w:hAnsi="Times New Roman" w:cs="Times New Roman"/>
+                <w:color w:val="1F1F1F"/>
+                <w:sz w:val="24"/>
+                <w:szCs w:val="24"/>
+                <w:lang w:eastAsia="tr-TR"/>
+              </w:rPr>
+            </w:pPr>
+            <w:r>
+              <w:rPr>
+                <w:rFonts w:ascii="Times New Roman" w:eastAsia="Times New Roman" w:hAnsi="Times New Roman" w:cs="Times New Roman"/>
+                <w:b/>
+                <w:bCs/>
+                <w:color w:val="1F1F1F"/>
+                <w:sz w:val="24"/>
+                <w:szCs w:val="24"/>
+                <w:bdr w:val="none" w:sz="0" w:space="0" w:color="auto" w:frame="1"/>
+                <w:lang w:eastAsia="tr-TR"/>
+              </w:rPr>
+              <w:t>F1 Skoru</w:t>
+            </w:r>
+          </w:p>
+        </w:tc>
+        <w:tc>
+          <w:tcPr>
+            <w:tcW w:w="0" w:type="auto"/>
+            <w:tcBorders>
+              <w:top w:val="single" w:sz="6" w:space="0" w:color="auto"/>
+              <w:left w:val="single" w:sz="6" w:space="0" w:color="auto"/>
+              <w:bottom w:val="single" w:sz="6" w:space="0" w:color="auto"/>
+              <w:right w:val="single" w:sz="6" w:space="0" w:color="auto"/>
+            </w:tcBorders>
+            <w:tcMar>
+              <w:top w:w="120" w:type="dxa"/>
+              <w:left w:w="180" w:type="dxa"/>
+              <w:bottom w:w="120" w:type="dxa"/>
+              <w:right w:w="180" w:type="dxa"/>
+            </w:tcMar>
+            <w:vAlign w:val="center"/>
+            <w:hideMark/>
+          </w:tcPr>
+          <w:p>
+            <w:pPr>
+              <w:spacing w:after="0" w:line="240" w:lineRule="auto"/>
+              <w:rPr>
+                <w:rFonts w:ascii="Times New Roman" w:eastAsia="Times New Roman" w:hAnsi="Times New Roman" w:cs="Times New Roman"/>
+                <w:color w:val="1F1F1F"/>
+                <w:sz w:val="24"/>
+                <w:szCs w:val="24"/>
+                <w:lang w:eastAsia="tr-TR"/>
+              </w:rPr>
+            </w:pPr>
+            <w:r>
+              <w:rPr>
+                <w:rFonts w:ascii="Times New Roman" w:eastAsia="Times New Roman" w:hAnsi="Times New Roman" w:cs="Times New Roman"/>
+                <w:b/>
+                <w:bCs/>
+                <w:color w:val="1F1F1F"/>
+                <w:sz w:val="24"/>
+                <w:szCs w:val="24"/>
+                <w:bdr w:val="none" w:sz="0" w:space="0" w:color="auto" w:frame="1"/>
+                <w:lang w:eastAsia="tr-TR"/>
+              </w:rPr>
+              <w:t>Yorum</w:t>
+            </w:r>
+          </w:p>
+        </w:tc>
+      </w:tr>
+      <w:tr>
+        <w:trPr>
+          <w:tblCellSpacing w:w="15" w:type="dxa"/>
+        </w:trPr>
+        <w:tc>
+          <w:tcPr>
+            <w:tcW w:w="0" w:type="auto"/>
+            <w:tcBorders>
+              <w:top w:val="single" w:sz="6" w:space="0" w:color="auto"/>
+              <w:left w:val="single" w:sz="6" w:space="0" w:color="auto"/>
+              <w:bottom w:val="single" w:sz="6" w:space="0" w:color="auto"/>
+              <w:right w:val="single" w:sz="6" w:space="0" w:color="auto"/>
+            </w:tcBorders>
+            <w:tcMar>
+              <w:top w:w="120" w:type="dxa"/>
+              <w:left w:w="180" w:type="dxa"/>
+              <w:bottom w:w="120" w:type="dxa"/>
+              <w:right w:w="180" w:type="dxa"/>
+            </w:tcMar>
+            <w:vAlign w:val="center"/>
+            <w:hideMark/>
+          </w:tcPr>
+          <w:p>
+            <w:pPr>
+              <w:spacing w:after="0" w:line="240" w:lineRule="auto"/>
+              <w:rPr>
+                <w:rFonts w:ascii="Times New Roman" w:eastAsia="Times New Roman" w:hAnsi="Times New Roman" w:cs="Times New Roman"/>
+                <w:color w:val="1F1F1F"/>
+                <w:sz w:val="24"/>
+                <w:szCs w:val="24"/>
+                <w:lang w:eastAsia="tr-TR"/>
+              </w:rPr>
+            </w:pPr>
+            <w:r>
+              <w:rPr>
+                <w:rFonts w:ascii="Times New Roman" w:eastAsia="Times New Roman" w:hAnsi="Times New Roman" w:cs="Times New Roman"/>
+                <w:b/>
+                <w:bCs/>
+                <w:color w:val="1F1F1F"/>
+                <w:sz w:val="24"/>
+                <w:szCs w:val="24"/>
+                <w:bdr w:val="none" w:sz="0" w:space="0" w:color="auto" w:frame="1"/>
+                <w:lang w:eastAsia="tr-TR"/>
+              </w:rPr>
+              <w:t>Sınıf 0 (Deprem Yok)</w:t>
+            </w:r>
+          </w:p>
+        </w:tc>
+        <w:tc>
+          <w:tcPr>
+            <w:tcW w:w="0" w:type="auto"/>
+            <w:tcBorders>
+              <w:top w:val="single" w:sz="6" w:space="0" w:color="auto"/>
+              <w:left w:val="single" w:sz="6" w:space="0" w:color="auto"/>
+              <w:bottom w:val="single" w:sz="6" w:space="0" w:color="auto"/>
+              <w:right w:val="single" w:sz="6" w:space="0" w:color="auto"/>
+            </w:tcBorders>
+            <w:tcMar>
+              <w:top w:w="120" w:type="dxa"/>
+              <w:left w:w="180" w:type="dxa"/>
+              <w:bottom w:w="120" w:type="dxa"/>
+              <w:right w:w="180" w:type="dxa"/>
+            </w:tcMar>
+            <w:vAlign w:val="center"/>
+            <w:hideMark/>
+          </w:tcPr>
+          <w:p>
+            <w:pPr>
+              <w:spacing w:after="0" w:line="240" w:lineRule="auto"/>
+              <w:rPr>
+                <w:rFonts w:ascii="Times New Roman" w:eastAsia="Times New Roman" w:hAnsi="Times New Roman" w:cs="Times New Roman"/>
+                <w:color w:val="1F1F1F"/>
+                <w:sz w:val="24"/>
+                <w:szCs w:val="24"/>
+                <w:lang w:eastAsia="tr-TR"/>
+              </w:rPr>
+            </w:pPr>
+            <w:r>
+              <w:rPr>
+                <w:rFonts w:ascii="Times New Roman" w:eastAsia="Times New Roman" w:hAnsi="Times New Roman" w:cs="Times New Roman"/>
+                <w:color w:val="1F1F1F"/>
+                <w:sz w:val="24"/>
+                <w:szCs w:val="24"/>
+                <w:bdr w:val="none" w:sz="0" w:space="0" w:color="auto" w:frame="1"/>
+                <w:lang w:eastAsia="tr-TR"/>
+              </w:rPr>
+              <w:t>Baseline</w:t>
+            </w:r>
+          </w:p>
+        </w:tc>
+        <w:tc>
+          <w:tcPr>
+            <w:tcW w:w="0" w:type="auto"/>
+            <w:tcBorders>
+              <w:top w:val="single" w:sz="6" w:space="0" w:color="auto"/>
+              <w:left w:val="single" w:sz="6" w:space="0" w:color="auto"/>
+              <w:bottom w:val="single" w:sz="6" w:space="0" w:color="auto"/>
+              <w:right w:val="single" w:sz="6" w:space="0" w:color="auto"/>
+            </w:tcBorders>
+            <w:tcMar>
+              <w:top w:w="120" w:type="dxa"/>
+              <w:left w:w="180" w:type="dxa"/>
+              <w:bottom w:w="120" w:type="dxa"/>
+              <w:right w:w="180" w:type="dxa"/>
+            </w:tcMar>
+            <w:vAlign w:val="center"/>
+            <w:hideMark/>
+          </w:tcPr>
+          <w:p>
+            <w:pPr>
+              <w:spacing w:after="0" w:line="240" w:lineRule="auto"/>
+              <w:rPr>
+                <w:rFonts w:ascii="Times New Roman" w:eastAsia="Times New Roman" w:hAnsi="Times New Roman" w:cs="Times New Roman"/>
+                <w:color w:val="1F1F1F"/>
+                <w:sz w:val="24"/>
+                <w:szCs w:val="24"/>
+                <w:lang w:eastAsia="tr-TR"/>
+              </w:rPr>
+            </w:pPr>
+            <w:r>
+              <w:rPr>
+                <w:rFonts w:ascii="Times New Roman" w:eastAsia="Times New Roman" w:hAnsi="Times New Roman" w:cs="Times New Roman"/>
+                <w:b/>
+                <w:bCs/>
+                <w:color w:val="1F1F1F"/>
+                <w:sz w:val="24"/>
+                <w:szCs w:val="24"/>
+                <w:bdr w:val="none" w:sz="0" w:space="0" w:color="auto" w:frame="1"/>
+                <w:lang w:eastAsia="tr-TR"/>
+              </w:rPr>
+              <w:t>0.84</w:t>
+            </w:r>
+          </w:p>
+        </w:tc>
+        <w:tc>
+          <w:tcPr>
+            <w:tcW w:w="0" w:type="auto"/>
+            <w:tcBorders>
+              <w:top w:val="single" w:sz="6" w:space="0" w:color="auto"/>
+              <w:left w:val="single" w:sz="6" w:space="0" w:color="auto"/>
+              <w:bottom w:val="single" w:sz="6" w:space="0" w:color="auto"/>
+              <w:right w:val="single" w:sz="6" w:space="0" w:color="auto"/>
+            </w:tcBorders>
+            <w:tcMar>
+              <w:top w:w="120" w:type="dxa"/>
+              <w:left w:w="180" w:type="dxa"/>
+              <w:bottom w:w="120" w:type="dxa"/>
+              <w:right w:w="180" w:type="dxa"/>
+            </w:tcMar>
+            <w:vAlign w:val="center"/>
+            <w:hideMark/>
+          </w:tcPr>
+          <w:p>
+            <w:pPr>
+              <w:spacing w:after="0" w:line="240" w:lineRule="auto"/>
+              <w:rPr>
+                <w:rFonts w:ascii="Times New Roman" w:eastAsia="Times New Roman" w:hAnsi="Times New Roman" w:cs="Times New Roman"/>
+                <w:color w:val="1F1F1F"/>
+                <w:sz w:val="24"/>
+                <w:szCs w:val="24"/>
+                <w:lang w:eastAsia="tr-TR"/>
+              </w:rPr>
+            </w:pPr>
+            <w:r>
+              <w:rPr>
+                <w:rFonts w:ascii="Times New Roman" w:eastAsia="Times New Roman" w:hAnsi="Times New Roman" w:cs="Times New Roman"/>
+                <w:color w:val="1F1F1F"/>
+                <w:sz w:val="24"/>
+                <w:szCs w:val="24"/>
+                <w:bdr w:val="none" w:sz="0" w:space="0" w:color="auto" w:frame="1"/>
+                <w:lang w:eastAsia="tr-TR"/>
+              </w:rPr>
+              <w:t>Sürekli bu sınıfı tahmin ettiği için yüksek</w:t>
+            </w:r>
+          </w:p>
+        </w:tc>
+      </w:tr>
+      <w:tr>
+        <w:trPr>
+          <w:tblCellSpacing w:w="15" w:type="dxa"/>
+        </w:trPr>
+        <w:tc>
+          <w:tcPr>
+            <w:tcW w:w="0" w:type="auto"/>
+            <w:tcBorders>
+              <w:top w:val="single" w:sz="6" w:space="0" w:color="auto"/>
+              <w:left w:val="single" w:sz="6" w:space="0" w:color="auto"/>
+              <w:bottom w:val="single" w:sz="6" w:space="0" w:color="auto"/>
+              <w:right w:val="single" w:sz="6" w:space="0" w:color="auto"/>
+            </w:tcBorders>
+            <w:tcMar>
+              <w:top w:w="120" w:type="dxa"/>
+              <w:left w:w="180" w:type="dxa"/>
+              <w:bottom w:w="120" w:type="dxa"/>
+              <w:right w:w="180" w:type="dxa"/>
+            </w:tcMar>
+            <w:vAlign w:val="center"/>
+            <w:hideMark/>
+          </w:tcPr>
+          <w:p>
+            <w:pPr>
+              <w:spacing w:after="0" w:line="240" w:lineRule="auto"/>
+              <w:rPr>
+                <w:rFonts w:ascii="Times New Roman" w:eastAsia="Times New Roman" w:hAnsi="Times New Roman" w:cs="Times New Roman"/>
+                <w:color w:val="1F1F1F"/>
+                <w:sz w:val="24"/>
+                <w:szCs w:val="24"/>
+                <w:lang w:eastAsia="tr-TR"/>
+              </w:rPr>
+            </w:pPr>
+            <w:r>
+              <w:rPr>
+                <w:rFonts w:ascii="Times New Roman" w:eastAsia="Times New Roman" w:hAnsi="Times New Roman" w:cs="Times New Roman"/>
+                <w:color w:val="1F1F1F"/>
+                <w:sz w:val="24"/>
+                <w:szCs w:val="24"/>
+                <w:bdr w:val="none" w:sz="0" w:space="0" w:color="auto" w:frame="1"/>
+                <w:lang w:eastAsia="tr-TR"/>
+              </w:rPr>
+              <w:t>Sınıf 0 (Deprem Yok)</w:t>
+            </w:r>
+          </w:p>
+        </w:tc>
+        <w:tc>
+          <w:tcPr>
+            <w:tcW w:w="0" w:type="auto"/>
+            <w:tcBorders>
+              <w:top w:val="single" w:sz="6" w:space="0" w:color="auto"/>
+              <w:left w:val="single" w:sz="6" w:space="0" w:color="auto"/>
+              <w:bottom w:val="single" w:sz="6" w:space="0" w:color="auto"/>
+              <w:right w:val="single" w:sz="6" w:space="0" w:color="auto"/>
+            </w:tcBorders>
+            <w:tcMar>
+              <w:top w:w="120" w:type="dxa"/>
+              <w:left w:w="180" w:type="dxa"/>
+              <w:bottom w:w="120" w:type="dxa"/>
+              <w:right w:w="180" w:type="dxa"/>
+            </w:tcMar>
+            <w:vAlign w:val="center"/>
+            <w:hideMark/>
+          </w:tcPr>
+          <w:p>
+            <w:pPr>
+              <w:spacing w:after="0" w:line="240" w:lineRule="auto"/>
+              <w:rPr>
+                <w:rFonts w:ascii="Times New Roman" w:eastAsia="Times New Roman" w:hAnsi="Times New Roman" w:cs="Times New Roman"/>
+                <w:color w:val="1F1F1F"/>
+                <w:sz w:val="24"/>
+                <w:szCs w:val="24"/>
+                <w:lang w:eastAsia="tr-TR"/>
+              </w:rPr>
+            </w:pPr>
+            <w:r>
+              <w:rPr>
+                <w:rFonts w:ascii="Times New Roman" w:eastAsia="Times New Roman" w:hAnsi="Times New Roman" w:cs="Times New Roman"/>
+                <w:color w:val="1F1F1F"/>
+                <w:sz w:val="24"/>
+                <w:szCs w:val="24"/>
+                <w:bdr w:val="none" w:sz="0" w:space="0" w:color="auto" w:frame="1"/>
+                <w:lang w:eastAsia="tr-TR"/>
+              </w:rPr>
+              <w:t>Lojistik Regresyon</w:t>
+            </w:r>
+          </w:p>
+        </w:tc>
+        <w:tc>
+          <w:tcPr>
+            <w:tcW w:w="0" w:type="auto"/>
+            <w:tcBorders>
+              <w:top w:val="single" w:sz="6" w:space="0" w:color="auto"/>
+              <w:left w:val="single" w:sz="6" w:space="0" w:color="auto"/>
+              <w:bottom w:val="single" w:sz="6" w:space="0" w:color="auto"/>
+              <w:right w:val="single" w:sz="6" w:space="0" w:color="auto"/>
+            </w:tcBorders>
+            <w:tcMar>
+              <w:top w:w="120" w:type="dxa"/>
+              <w:left w:w="180" w:type="dxa"/>
+              <w:bottom w:w="120" w:type="dxa"/>
+              <w:right w:w="180" w:type="dxa"/>
+            </w:tcMar>
+            <w:vAlign w:val="center"/>
+            <w:hideMark/>
+          </w:tcPr>
+          <w:p>
+            <w:pPr>
+              <w:spacing w:after="0" w:line="240" w:lineRule="auto"/>
+              <w:rPr>
+                <w:rFonts w:ascii="Times New Roman" w:eastAsia="Times New Roman" w:hAnsi="Times New Roman" w:cs="Times New Roman"/>
+                <w:color w:val="1F1F1F"/>
+                <w:sz w:val="24"/>
+                <w:szCs w:val="24"/>
+                <w:lang w:eastAsia="tr-TR"/>
+              </w:rPr>
+            </w:pPr>
+            <w:r>
+              <w:rPr>
+                <w:rFonts w:ascii="Times New Roman" w:eastAsia="Times New Roman" w:hAnsi="Times New Roman" w:cs="Times New Roman"/>
+                <w:color w:val="1F1F1F"/>
+                <w:sz w:val="24"/>
+                <w:szCs w:val="24"/>
+                <w:bdr w:val="none" w:sz="0" w:space="0" w:color="auto" w:frame="1"/>
+                <w:lang w:eastAsia="tr-TR"/>
+              </w:rPr>
+              <w:t>0.81</w:t>
+            </w:r>
+          </w:p>
+        </w:tc>
+        <w:tc>
+          <w:tcPr>
+            <w:tcW w:w="0" w:type="auto"/>
+            <w:tcBorders>
+              <w:top w:val="single" w:sz="6" w:space="0" w:color="auto"/>
+              <w:left w:val="single" w:sz="6" w:space="0" w:color="auto"/>
+              <w:bottom w:val="single" w:sz="6" w:space="0" w:color="auto"/>
+              <w:right w:val="single" w:sz="6" w:space="0" w:color="auto"/>
+            </w:tcBorders>
+            <w:tcMar>
+              <w:top w:w="120" w:type="dxa"/>
+              <w:left w:w="180" w:type="dxa"/>
+              <w:bottom w:w="120" w:type="dxa"/>
+              <w:right w:w="180" w:type="dxa"/>
+            </w:tcMar>
+            <w:vAlign w:val="center"/>
+            <w:hideMark/>
+          </w:tcPr>
+          <w:p>
+            <w:pPr>
+              <w:spacing w:after="0" w:line="240" w:lineRule="auto"/>
+              <w:rPr>
+                <w:rFonts w:ascii="Times New Roman" w:eastAsia="Times New Roman" w:hAnsi="Times New Roman" w:cs="Times New Roman"/>
+                <w:color w:val="1F1F1F"/>
+                <w:sz w:val="24"/>
+                <w:szCs w:val="24"/>
+                <w:lang w:eastAsia="tr-TR"/>
+              </w:rPr>
+            </w:pPr>
+            <w:r>
+              <w:rPr>
+                <w:rFonts w:ascii="Times New Roman" w:eastAsia="Times New Roman" w:hAnsi="Times New Roman" w:cs="Times New Roman"/>
+                <w:color w:val="1F1F1F"/>
+                <w:sz w:val="24"/>
+                <w:szCs w:val="24"/>
+                <w:bdr w:val="none" w:sz="0" w:space="0" w:color="auto" w:frame="1"/>
+                <w:lang w:eastAsia="tr-TR"/>
+              </w:rPr>
+              <w:t>Dengeli başarı</w:t>
+            </w:r>
+          </w:p>
+        </w:tc>
+      </w:tr>
+      <w:tr>
+        <w:trPr>
+          <w:tblCellSpacing w:w="15" w:type="dxa"/>
+        </w:trPr>
+        <w:tc>
+          <w:tcPr>
+            <w:tcW w:w="0" w:type="auto"/>
+            <w:tcBorders>
+              <w:top w:val="single" w:sz="6" w:space="0" w:color="auto"/>
+              <w:left w:val="single" w:sz="6" w:space="0" w:color="auto"/>
+              <w:bottom w:val="single" w:sz="6" w:space="0" w:color="auto"/>
+              <w:right w:val="single" w:sz="6" w:space="0" w:color="auto"/>
+            </w:tcBorders>
+            <w:tcMar>
+              <w:top w:w="120" w:type="dxa"/>
+              <w:left w:w="180" w:type="dxa"/>
+              <w:bottom w:w="120" w:type="dxa"/>
+              <w:right w:w="180" w:type="dxa"/>
+            </w:tcMar>
+            <w:vAlign w:val="center"/>
+            <w:hideMark/>
+          </w:tcPr>
+          <w:p>
+            <w:pPr>
+              <w:spacing w:after="0" w:line="240" w:lineRule="auto"/>
+              <w:rPr>
+                <w:rFonts w:ascii="Times New Roman" w:eastAsia="Times New Roman" w:hAnsi="Times New Roman" w:cs="Times New Roman"/>
+                <w:color w:val="1F1F1F"/>
+                <w:sz w:val="24"/>
+                <w:szCs w:val="24"/>
+                <w:lang w:eastAsia="tr-TR"/>
+              </w:rPr>
+            </w:pPr>
+            <w:r>
+              <w:rPr>
+                <w:rFonts w:ascii="Times New Roman" w:eastAsia="Times New Roman" w:hAnsi="Times New Roman" w:cs="Times New Roman"/>
+                <w:color w:val="1F1F1F"/>
+                <w:sz w:val="24"/>
+                <w:szCs w:val="24"/>
+                <w:bdr w:val="none" w:sz="0" w:space="0" w:color="auto" w:frame="1"/>
+                <w:lang w:eastAsia="tr-TR"/>
+              </w:rPr>
+              <w:t>Sınıf 1 (Deprem Var)</w:t>
+            </w:r>
+          </w:p>
+        </w:tc>
+        <w:tc>
+          <w:tcPr>
+            <w:tcW w:w="0" w:type="auto"/>
+            <w:tcBorders>
+              <w:top w:val="single" w:sz="6" w:space="0" w:color="auto"/>
+              <w:left w:val="single" w:sz="6" w:space="0" w:color="auto"/>
+              <w:bottom w:val="single" w:sz="6" w:space="0" w:color="auto"/>
+              <w:right w:val="single" w:sz="6" w:space="0" w:color="auto"/>
+            </w:tcBorders>
+            <w:tcMar>
+              <w:top w:w="120" w:type="dxa"/>
+              <w:left w:w="180" w:type="dxa"/>
+              <w:bottom w:w="120" w:type="dxa"/>
+              <w:right w:w="180" w:type="dxa"/>
+            </w:tcMar>
+            <w:vAlign w:val="center"/>
+            <w:hideMark/>
+          </w:tcPr>
+          <w:p>
+            <w:pPr>
+              <w:spacing w:after="0" w:line="240" w:lineRule="auto"/>
+              <w:rPr>
+                <w:rFonts w:ascii="Times New Roman" w:eastAsia="Times New Roman" w:hAnsi="Times New Roman" w:cs="Times New Roman"/>
+                <w:color w:val="1F1F1F"/>
+                <w:sz w:val="24"/>
+                <w:szCs w:val="24"/>
+                <w:lang w:eastAsia="tr-TR"/>
+              </w:rPr>
+            </w:pPr>
+            <w:r>
+              <w:rPr>
+                <w:rFonts w:ascii="Times New Roman" w:eastAsia="Times New Roman" w:hAnsi="Times New Roman" w:cs="Times New Roman"/>
+                <w:color w:val="1F1F1F"/>
+                <w:sz w:val="24"/>
+                <w:szCs w:val="24"/>
+                <w:bdr w:val="none" w:sz="0" w:space="0" w:color="auto" w:frame="1"/>
+                <w:lang w:eastAsia="tr-TR"/>
+              </w:rPr>
+              <w:t>Baseline</w:t>
+            </w:r>
+          </w:p>
+        </w:tc>
+        <w:tc>
+          <w:tcPr>
+            <w:tcW w:w="0" w:type="auto"/>
+            <w:tcBorders>
+              <w:top w:val="single" w:sz="6" w:space="0" w:color="auto"/>
+              <w:left w:val="single" w:sz="6" w:space="0" w:color="auto"/>
+              <w:bottom w:val="single" w:sz="6" w:space="0" w:color="auto"/>
+              <w:right w:val="single" w:sz="6" w:space="0" w:color="auto"/>
+            </w:tcBorders>
+            <w:tcMar>
+              <w:top w:w="120" w:type="dxa"/>
+              <w:left w:w="180" w:type="dxa"/>
+              <w:bottom w:w="120" w:type="dxa"/>
+              <w:right w:w="180" w:type="dxa"/>
+            </w:tcMar>
+            <w:vAlign w:val="center"/>
+            <w:hideMark/>
+          </w:tcPr>
+          <w:p>
+            <w:pPr>
+              <w:spacing w:after="0" w:line="240" w:lineRule="auto"/>
+              <w:rPr>
+                <w:rFonts w:ascii="Times New Roman" w:eastAsia="Times New Roman" w:hAnsi="Times New Roman" w:cs="Times New Roman"/>
+                <w:color w:val="1F1F1F"/>
+                <w:sz w:val="24"/>
+                <w:szCs w:val="24"/>
+                <w:lang w:eastAsia="tr-TR"/>
+              </w:rPr>
+            </w:pPr>
+            <w:r>
+              <w:rPr>
+                <w:rFonts w:ascii="Times New Roman" w:eastAsia="Times New Roman" w:hAnsi="Times New Roman" w:cs="Times New Roman"/>
+                <w:color w:val="1F1F1F"/>
+                <w:sz w:val="24"/>
+                <w:szCs w:val="24"/>
+                <w:bdr w:val="none" w:sz="0" w:space="0" w:color="auto" w:frame="1"/>
+                <w:lang w:eastAsia="tr-TR"/>
+              </w:rPr>
+              <w:t>0.00</w:t>
+            </w:r>
+          </w:p>
+        </w:tc>
+        <w:tc>
+          <w:tcPr>
+            <w:tcW w:w="0" w:type="auto"/>
+            <w:tcBorders>
+              <w:top w:val="single" w:sz="6" w:space="0" w:color="auto"/>
+              <w:left w:val="single" w:sz="6" w:space="0" w:color="auto"/>
+              <w:bottom w:val="single" w:sz="6" w:space="0" w:color="auto"/>
+              <w:right w:val="single" w:sz="6" w:space="0" w:color="auto"/>
+            </w:tcBorders>
+            <w:tcMar>
+              <w:top w:w="120" w:type="dxa"/>
+              <w:left w:w="180" w:type="dxa"/>
+              <w:bottom w:w="120" w:type="dxa"/>
+              <w:right w:w="180" w:type="dxa"/>
+            </w:tcMar>
+            <w:vAlign w:val="center"/>
+            <w:hideMark/>
+          </w:tcPr>
+          <w:p>
+            <w:pPr>
+              <w:spacing w:after="0" w:line="240" w:lineRule="auto"/>
+              <w:rPr>
+                <w:rFonts w:ascii="Times New Roman" w:eastAsia="Times New Roman" w:hAnsi="Times New Roman" w:cs="Times New Roman"/>
+                <w:color w:val="1F1F1F"/>
+                <w:sz w:val="24"/>
+                <w:szCs w:val="24"/>
+                <w:lang w:eastAsia="tr-TR"/>
+              </w:rPr>
+            </w:pPr>
+            <w:r>
+              <w:rPr>
+                <w:rFonts w:ascii="Times New Roman" w:eastAsia="Times New Roman" w:hAnsi="Times New Roman" w:cs="Times New Roman"/>
+                <w:color w:val="1F1F1F"/>
+                <w:sz w:val="24"/>
+                <w:szCs w:val="24"/>
+                <w:bdr w:val="none" w:sz="0" w:space="0" w:color="auto" w:frame="1"/>
+                <w:lang w:eastAsia="tr-TR"/>
+              </w:rPr>
+              <w:t>Deprem tespit edemiyor</w:t>
+            </w:r>
+          </w:p>
+        </w:tc>
+      </w:tr>
+      <w:tr>
+        <w:trPr>
+          <w:tblCellSpacing w:w="15" w:type="dxa"/>
+        </w:trPr>
+        <w:tc>
+          <w:tcPr>
+            <w:tcW w:w="0" w:type="auto"/>
+            <w:tcBorders>
+              <w:top w:val="single" w:sz="6" w:space="0" w:color="auto"/>
+              <w:left w:val="single" w:sz="6" w:space="0" w:color="auto"/>
+              <w:bottom w:val="single" w:sz="6" w:space="0" w:color="auto"/>
+              <w:right w:val="single" w:sz="6" w:space="0" w:color="auto"/>
+            </w:tcBorders>
+            <w:tcMar>
+              <w:top w:w="120" w:type="dxa"/>
+              <w:left w:w="180" w:type="dxa"/>
+              <w:bottom w:w="120" w:type="dxa"/>
+              <w:right w:w="180" w:type="dxa"/>
+            </w:tcMar>
+            <w:vAlign w:val="center"/>
+            <w:hideMark/>
+          </w:tcPr>
+          <w:p>
+            <w:pPr>
+              <w:spacing w:after="0" w:line="240" w:lineRule="auto"/>
+              <w:rPr>
+                <w:rFonts w:ascii="Times New Roman" w:eastAsia="Times New Roman" w:hAnsi="Times New Roman" w:cs="Times New Roman"/>
+                <w:color w:val="1F1F1F"/>
+                <w:sz w:val="24"/>
+                <w:szCs w:val="24"/>
+                <w:lang w:eastAsia="tr-TR"/>
+              </w:rPr>
+            </w:pPr>
+            <w:r>
+              <w:rPr>
+                <w:rFonts w:ascii="Times New Roman" w:eastAsia="Times New Roman" w:hAnsi="Times New Roman" w:cs="Times New Roman"/>
+                <w:b/>
+                <w:bCs/>
+                <w:color w:val="1F1F1F"/>
+                <w:sz w:val="24"/>
+                <w:szCs w:val="24"/>
+                <w:bdr w:val="none" w:sz="0" w:space="0" w:color="auto" w:frame="1"/>
+                <w:lang w:eastAsia="tr-TR"/>
+              </w:rPr>
+              <w:t>Sınıf 1 (Deprem Var)</w:t>
+            </w:r>
+          </w:p>
+        </w:tc>
+        <w:tc>
+          <w:tcPr>
+            <w:tcW w:w="0" w:type="auto"/>
+            <w:tcBorders>
+              <w:top w:val="single" w:sz="6" w:space="0" w:color="auto"/>
+              <w:left w:val="single" w:sz="6" w:space="0" w:color="auto"/>
+              <w:bottom w:val="single" w:sz="6" w:space="0" w:color="auto"/>
+              <w:right w:val="single" w:sz="6" w:space="0" w:color="auto"/>
+            </w:tcBorders>
+            <w:tcMar>
+              <w:top w:w="120" w:type="dxa"/>
+              <w:left w:w="180" w:type="dxa"/>
+              <w:bottom w:w="120" w:type="dxa"/>
+              <w:right w:w="180" w:type="dxa"/>
+            </w:tcMar>
+            <w:vAlign w:val="center"/>
+            <w:hideMark/>
+          </w:tcPr>
+          <w:p>
+            <w:pPr>
+              <w:spacing w:after="0" w:line="240" w:lineRule="auto"/>
+              <w:rPr>
+                <w:rFonts w:ascii="Times New Roman" w:eastAsia="Times New Roman" w:hAnsi="Times New Roman" w:cs="Times New Roman"/>
+                <w:color w:val="1F1F1F"/>
+                <w:sz w:val="24"/>
+                <w:szCs w:val="24"/>
+                <w:lang w:eastAsia="tr-TR"/>
+              </w:rPr>
+            </w:pPr>
+            <w:r>
+              <w:rPr>
+                <w:rFonts w:ascii="Times New Roman" w:eastAsia="Times New Roman" w:hAnsi="Times New Roman" w:cs="Times New Roman"/>
+                <w:b/>
+                <w:bCs/>
+                <w:color w:val="1F1F1F"/>
+                <w:sz w:val="24"/>
+                <w:szCs w:val="24"/>
+                <w:bdr w:val="none" w:sz="0" w:space="0" w:color="auto" w:frame="1"/>
+                <w:lang w:eastAsia="tr-TR"/>
+              </w:rPr>
+              <w:t>Lojistik Regresyon</w:t>
+            </w:r>
+          </w:p>
+        </w:tc>
+        <w:tc>
+          <w:tcPr>
+            <w:tcW w:w="0" w:type="auto"/>
+            <w:tcBorders>
+              <w:top w:val="single" w:sz="6" w:space="0" w:color="auto"/>
+              <w:left w:val="single" w:sz="6" w:space="0" w:color="auto"/>
+              <w:bottom w:val="single" w:sz="6" w:space="0" w:color="auto"/>
+              <w:right w:val="single" w:sz="6" w:space="0" w:color="auto"/>
+            </w:tcBorders>
+            <w:tcMar>
+              <w:top w:w="120" w:type="dxa"/>
+              <w:left w:w="180" w:type="dxa"/>
+              <w:bottom w:w="120" w:type="dxa"/>
+              <w:right w:w="180" w:type="dxa"/>
+            </w:tcMar>
+            <w:vAlign w:val="center"/>
+            <w:hideMark/>
+          </w:tcPr>
+          <w:p>
+            <w:pPr>
+              <w:spacing w:after="0" w:line="240" w:lineRule="auto"/>
+              <w:rPr>
+                <w:rFonts w:ascii="Times New Roman" w:eastAsia="Times New Roman" w:hAnsi="Times New Roman" w:cs="Times New Roman"/>
+                <w:color w:val="1F1F1F"/>
+                <w:sz w:val="24"/>
+                <w:szCs w:val="24"/>
+                <w:lang w:eastAsia="tr-TR"/>
+              </w:rPr>
+            </w:pPr>
+            <w:r>
+              <w:rPr>
+                <w:rFonts w:ascii="Times New Roman" w:eastAsia="Times New Roman" w:hAnsi="Times New Roman" w:cs="Times New Roman"/>
+                <w:b/>
+                <w:bCs/>
+                <w:color w:val="1F1F1F"/>
+                <w:sz w:val="24"/>
+                <w:szCs w:val="24"/>
+                <w:bdr w:val="none" w:sz="0" w:space="0" w:color="auto" w:frame="1"/>
+                <w:lang w:eastAsia="tr-TR"/>
+              </w:rPr>
+              <w:t>0.41</w:t>
+            </w:r>
+          </w:p>
+        </w:tc>
+        <w:tc>
+          <w:tcPr>
+            <w:tcW w:w="0" w:type="auto"/>
+            <w:tcBorders>
+              <w:top w:val="single" w:sz="6" w:space="0" w:color="auto"/>
+              <w:left w:val="single" w:sz="6" w:space="0" w:color="auto"/>
+              <w:bottom w:val="single" w:sz="6" w:space="0" w:color="auto"/>
+              <w:right w:val="single" w:sz="6" w:space="0" w:color="auto"/>
+            </w:tcBorders>
+            <w:tcMar>
+              <w:top w:w="120" w:type="dxa"/>
+              <w:left w:w="180" w:type="dxa"/>
+              <w:bottom w:w="120" w:type="dxa"/>
+              <w:right w:w="180" w:type="dxa"/>
+            </w:tcMar>
+            <w:vAlign w:val="center"/>
+            <w:hideMark/>
+          </w:tcPr>
+          <w:p>
+            <w:pPr>
+              <w:spacing w:after="0" w:line="240" w:lineRule="auto"/>
+              <w:rPr>
+                <w:rFonts w:ascii="Times New Roman" w:eastAsia="Times New Roman" w:hAnsi="Times New Roman" w:cs="Times New Roman"/>
+                <w:color w:val="1F1F1F"/>
+                <w:sz w:val="24"/>
+                <w:szCs w:val="24"/>
+                <w:lang w:eastAsia="tr-TR"/>
+              </w:rPr>
+            </w:pPr>
+            <w:r>
+              <w:rPr>
+                <w:rFonts w:ascii="Times New Roman" w:eastAsia="Times New Roman" w:hAnsi="Times New Roman" w:cs="Times New Roman"/>
+                <w:color w:val="1F1F1F"/>
+                <w:sz w:val="24"/>
+                <w:szCs w:val="24"/>
+                <w:bdr w:val="none" w:sz="0" w:space="0" w:color="auto" w:frame="1"/>
+                <w:lang w:eastAsia="tr-TR"/>
+              </w:rPr>
+              <w:t>Depremleri yakalayabiliyor</w:t>
+            </w:r>
+          </w:p>
+        </w:tc>
+      </w:tr>
+    </w:tbl>
+    <w:p>
+      <w:pPr>
+        <w:jc w:val="both"/>
+        <w:rPr>
+          <w:rFonts w:ascii="Times New Roman" w:eastAsiaTheme="minorEastAsia" w:hAnsi="Times New Roman" w:cs="Times New Roman"/>
+          <w:b/>
+          <w:bCs/>
+          <w:sz w:val="24"/>
+          <w:szCs w:val="24"/>
+          <w:lang w:eastAsia="tr-TR"/>
+        </w:rPr>
+      </w:pPr>
+    </w:p>
+    <w:p>
+      <w:pPr>
+        <w:jc w:val="both"/>
+        <w:rPr>
           <w:rFonts w:ascii="Times New Roman" w:hAnsi="Times New Roman" w:cs="Times New Roman"/>
           <w:sz w:val="24"/>
           <w:szCs w:val="24"/>
@@ -8805,6 +11761,7 @@
           <w:szCs w:val="40"/>
           <w:lang w:eastAsia="tr-TR"/>
         </w:rPr>
+        <w:lastRenderedPageBreak/>
         <w:t>Deney 1</w:t>
       </w:r>
       <w:r>
@@ -9183,7 +12140,6 @@
           <w:szCs w:val="24"/>
           <w:lang w:eastAsia="tr-TR"/>
         </w:rPr>
-        <w:lastRenderedPageBreak/>
         <w:t>Basit bir 5 katlı cross-validation yerine doğrudan doğrulama seti üzerinden değerlendirme yaptım, böylece zaman sızıntısı önlenmiş oldu.</w:t>
       </w:r>
     </w:p>
@@ -9950,6 +12906,7 @@
           <w:szCs w:val="24"/>
           <w:lang w:eastAsia="tr-TR"/>
         </w:rPr>
+        <w:lastRenderedPageBreak/>
         <w:t>Başarı sıralaması (MAE’ye göre):</w:t>
       </w:r>
     </w:p>
@@ -10157,7 +13114,6 @@
           <w:szCs w:val="28"/>
           <w:lang w:eastAsia="tr-TR"/>
         </w:rPr>
-        <w:lastRenderedPageBreak/>
         <w:t>Train &amp; Test Ayrımı ve Hedef Değer</w:t>
       </w:r>
     </w:p>
@@ -11012,6 +13968,7 @@
           <w:szCs w:val="28"/>
           <w:lang w:eastAsia="tr-TR"/>
         </w:rPr>
+        <w:lastRenderedPageBreak/>
         <w:t>Değerlendirme Kriterleri</w:t>
       </w:r>
     </w:p>
@@ -11331,7 +14288,6 @@
           <w:b/>
           <w:bCs/>
         </w:rPr>
-        <w:lastRenderedPageBreak/>
         <w:t>8.</w:t>
       </w:r>
       <w:r>
@@ -11591,6 +14547,7 @@
         <w:rPr>
           <w:rStyle w:val="Gl"/>
         </w:rPr>
+        <w:lastRenderedPageBreak/>
         <w:t>NumPy:</w:t>
       </w:r>
       <w:r>
@@ -11804,7 +14761,6 @@
         <w:ind w:left="720"/>
       </w:pPr>
       <w:r>
-        <w:lastRenderedPageBreak/>
         <w:t>Veri seti boyutu yönetilebilir seviyede olduğundan donanım kısıtı proje üzerinde ciddi bir engel oluşturmamıştır.</w:t>
       </w:r>
     </w:p>
@@ -11831,6 +14787,14 @@
         </w:rPr>
         <w:t>9. Sonuçların Yorumlanması</w:t>
       </w:r>
+      <w:r>
+        <w:rPr>
+          <w:rStyle w:val="Gl"/>
+          <w:b/>
+          <w:bCs/>
+        </w:rPr>
+        <w:t xml:space="preserve"> ve Özeti</w:t>
+      </w:r>
     </w:p>
     <w:p>
       <w:pPr>
@@ -11838,6 +14802,1266 @@
       </w:pPr>
       <w:r>
         <w:t>Model karşılaştırmalarında, çok değişkenli (multivariate) giriş yapısı ve kapı mekanizması sayesinde zaman serilerindeki karmaşık bağımlılıkları daha kararlı modelleyen Earthquake GRU, 0,01154 MSE değeriyle en yüksek başarıyı sergilemiştir. Tek değişkenli (univariate) modellerin düşük performansı ve yüksek hata oranları, deprem tahmini için veri çeşitliliğinin kritik önemini ortaya koymaktadır. Bu sonuçlar, projedeki en ideal mimarinin veri derinliği ile uyumlu çalışan GRU yapısı olduğunu kanıtlamaktadır.</w:t>
+      </w:r>
+    </w:p>
+    <w:p>
+      <w:pPr>
+        <w:pStyle w:val="NormalWeb"/>
+      </w:pPr>
+    </w:p>
+    <w:p>
+      <w:pPr>
+        <w:rPr>
+          <w:b/>
+          <w:bCs/>
+        </w:rPr>
+      </w:pPr>
+      <w:r>
+        <w:rPr>
+          <w:b/>
+          <w:bCs/>
+        </w:rPr>
+        <w:t>Sıralı Zaman Serisi (Sequential Time Series) Analizi</w:t>
+      </w:r>
+    </w:p>
+    <w:p>
+      <w:pPr>
+        <w:rPr>
+          <w:b/>
+          <w:bCs/>
+        </w:rPr>
+      </w:pPr>
+      <w:r>
+        <w:rPr>
+          <w:b/>
+          <w:bCs/>
+        </w:rPr>
+        <w:t>Teknik Özet</w:t>
+      </w:r>
+    </w:p>
+    <w:p>
+      <w:r>
+        <w:rPr>
+          <w:i/>
+          <w:iCs/>
+        </w:rPr>
+        <w:t xml:space="preserve">"Geliştirilen derin öğrenme modelleri, verinin zamansal bağımlılığını (temporal dependency) koruyan </w:t>
+      </w:r>
+      <w:r>
+        <w:rPr>
+          <w:b/>
+          <w:bCs/>
+          <w:i/>
+          <w:iCs/>
+        </w:rPr>
+        <w:t>Sıralı (Sequential) Zaman Serisi</w:t>
+      </w:r>
+      <w:r>
+        <w:rPr>
+          <w:i/>
+          <w:iCs/>
+        </w:rPr>
+        <w:t xml:space="preserve"> yaklaşımıyla kurgulanmıştır. Bu durum, kod altyapısında aşağıdaki üç temel yöntemle sağlanmıştır:</w:t>
+      </w:r>
+    </w:p>
+    <w:tbl>
+      <w:tblPr>
+        <w:tblpPr w:leftFromText="141" w:rightFromText="141" w:bottomFromText="160" w:vertAnchor="text" w:horzAnchor="margin" w:tblpY="452"/>
+        <w:tblW w:w="0" w:type="auto"/>
+        <w:tblCellSpacing w:w="15" w:type="dxa"/>
+        <w:tblCellMar>
+          <w:left w:w="0" w:type="dxa"/>
+          <w:right w:w="0" w:type="dxa"/>
+        </w:tblCellMar>
+        <w:tblLook w:val="04A0" w:firstRow="1" w:lastRow="0" w:firstColumn="1" w:lastColumn="0" w:noHBand="0" w:noVBand="1"/>
+      </w:tblPr>
+      <w:tblGrid>
+        <w:gridCol w:w="1874"/>
+        <w:gridCol w:w="2291"/>
+        <w:gridCol w:w="2371"/>
+        <w:gridCol w:w="2520"/>
+      </w:tblGrid>
+      <w:tr>
+        <w:trPr>
+          <w:tblHeader/>
+          <w:tblCellSpacing w:w="15" w:type="dxa"/>
+        </w:trPr>
+        <w:tc>
+          <w:tcPr>
+            <w:tcW w:w="0" w:type="auto"/>
+            <w:tcBorders>
+              <w:top w:val="single" w:sz="6" w:space="0" w:color="auto"/>
+              <w:left w:val="single" w:sz="6" w:space="0" w:color="auto"/>
+              <w:bottom w:val="single" w:sz="6" w:space="0" w:color="auto"/>
+              <w:right w:val="single" w:sz="6" w:space="0" w:color="auto"/>
+            </w:tcBorders>
+            <w:tcMar>
+              <w:top w:w="120" w:type="dxa"/>
+              <w:left w:w="180" w:type="dxa"/>
+              <w:bottom w:w="120" w:type="dxa"/>
+              <w:right w:w="180" w:type="dxa"/>
+            </w:tcMar>
+            <w:vAlign w:val="center"/>
+            <w:hideMark/>
+          </w:tcPr>
+          <w:p>
+            <w:pPr>
+              <w:rPr>
+                <w:rFonts w:ascii="Times New Roman" w:hAnsi="Times New Roman" w:cs="Times New Roman"/>
+              </w:rPr>
+            </w:pPr>
+            <w:r>
+              <w:rPr>
+                <w:rFonts w:ascii="Times New Roman" w:hAnsi="Times New Roman" w:cs="Times New Roman"/>
+                <w:b/>
+                <w:bCs/>
+              </w:rPr>
+              <w:lastRenderedPageBreak/>
+              <w:t>Karşılaştırma Kriteri</w:t>
+            </w:r>
+          </w:p>
+        </w:tc>
+        <w:tc>
+          <w:tcPr>
+            <w:tcW w:w="0" w:type="auto"/>
+            <w:tcBorders>
+              <w:top w:val="single" w:sz="6" w:space="0" w:color="auto"/>
+              <w:left w:val="single" w:sz="6" w:space="0" w:color="auto"/>
+              <w:bottom w:val="single" w:sz="6" w:space="0" w:color="auto"/>
+              <w:right w:val="single" w:sz="6" w:space="0" w:color="auto"/>
+            </w:tcBorders>
+            <w:tcMar>
+              <w:top w:w="120" w:type="dxa"/>
+              <w:left w:w="180" w:type="dxa"/>
+              <w:bottom w:w="120" w:type="dxa"/>
+              <w:right w:w="180" w:type="dxa"/>
+            </w:tcMar>
+            <w:vAlign w:val="center"/>
+            <w:hideMark/>
+          </w:tcPr>
+          <w:p>
+            <w:pPr>
+              <w:rPr>
+                <w:rFonts w:ascii="Times New Roman" w:hAnsi="Times New Roman" w:cs="Times New Roman"/>
+              </w:rPr>
+            </w:pPr>
+            <w:r>
+              <w:rPr>
+                <w:rFonts w:ascii="Times New Roman" w:hAnsi="Times New Roman" w:cs="Times New Roman"/>
+                <w:b/>
+                <w:bCs/>
+              </w:rPr>
+              <w:t>Seri Zamanlı (Yanlış/Eksik Terim)</w:t>
+            </w:r>
+          </w:p>
+        </w:tc>
+        <w:tc>
+          <w:tcPr>
+            <w:tcW w:w="0" w:type="auto"/>
+            <w:tcBorders>
+              <w:top w:val="single" w:sz="6" w:space="0" w:color="auto"/>
+              <w:left w:val="single" w:sz="6" w:space="0" w:color="auto"/>
+              <w:bottom w:val="single" w:sz="6" w:space="0" w:color="auto"/>
+              <w:right w:val="single" w:sz="6" w:space="0" w:color="auto"/>
+            </w:tcBorders>
+            <w:tcMar>
+              <w:top w:w="120" w:type="dxa"/>
+              <w:left w:w="180" w:type="dxa"/>
+              <w:bottom w:w="120" w:type="dxa"/>
+              <w:right w:w="180" w:type="dxa"/>
+            </w:tcMar>
+            <w:vAlign w:val="center"/>
+            <w:hideMark/>
+          </w:tcPr>
+          <w:p>
+            <w:pPr>
+              <w:rPr>
+                <w:rFonts w:ascii="Times New Roman" w:hAnsi="Times New Roman" w:cs="Times New Roman"/>
+              </w:rPr>
+            </w:pPr>
+            <w:r>
+              <w:rPr>
+                <w:rFonts w:ascii="Times New Roman" w:hAnsi="Times New Roman" w:cs="Times New Roman"/>
+                <w:b/>
+                <w:bCs/>
+              </w:rPr>
+              <w:t>Sıralı Zaman Serisi (Bizim Model)</w:t>
+            </w:r>
+          </w:p>
+        </w:tc>
+        <w:tc>
+          <w:tcPr>
+            <w:tcW w:w="0" w:type="auto"/>
+            <w:tcBorders>
+              <w:top w:val="single" w:sz="6" w:space="0" w:color="auto"/>
+              <w:left w:val="single" w:sz="6" w:space="0" w:color="auto"/>
+              <w:bottom w:val="single" w:sz="6" w:space="0" w:color="auto"/>
+              <w:right w:val="single" w:sz="6" w:space="0" w:color="auto"/>
+            </w:tcBorders>
+            <w:tcMar>
+              <w:top w:w="120" w:type="dxa"/>
+              <w:left w:w="180" w:type="dxa"/>
+              <w:bottom w:w="120" w:type="dxa"/>
+              <w:right w:w="180" w:type="dxa"/>
+            </w:tcMar>
+            <w:vAlign w:val="center"/>
+            <w:hideMark/>
+          </w:tcPr>
+          <w:p>
+            <w:pPr>
+              <w:rPr>
+                <w:rFonts w:ascii="Times New Roman" w:hAnsi="Times New Roman" w:cs="Times New Roman"/>
+              </w:rPr>
+            </w:pPr>
+            <w:r>
+              <w:rPr>
+                <w:rFonts w:ascii="Times New Roman" w:hAnsi="Times New Roman" w:cs="Times New Roman"/>
+                <w:b/>
+                <w:bCs/>
+              </w:rPr>
+              <w:t>Neden "Sıralı" Diyoruz?</w:t>
+            </w:r>
+          </w:p>
+        </w:tc>
+      </w:tr>
+      <w:tr>
+        <w:trPr>
+          <w:tblCellSpacing w:w="15" w:type="dxa"/>
+        </w:trPr>
+        <w:tc>
+          <w:tcPr>
+            <w:tcW w:w="0" w:type="auto"/>
+            <w:tcBorders>
+              <w:top w:val="single" w:sz="6" w:space="0" w:color="auto"/>
+              <w:left w:val="single" w:sz="6" w:space="0" w:color="auto"/>
+              <w:bottom w:val="single" w:sz="6" w:space="0" w:color="auto"/>
+              <w:right w:val="single" w:sz="6" w:space="0" w:color="auto"/>
+            </w:tcBorders>
+            <w:tcMar>
+              <w:top w:w="120" w:type="dxa"/>
+              <w:left w:w="180" w:type="dxa"/>
+              <w:bottom w:w="120" w:type="dxa"/>
+              <w:right w:w="180" w:type="dxa"/>
+            </w:tcMar>
+            <w:vAlign w:val="center"/>
+            <w:hideMark/>
+          </w:tcPr>
+          <w:p>
+            <w:pPr>
+              <w:rPr>
+                <w:rFonts w:ascii="Times New Roman" w:hAnsi="Times New Roman" w:cs="Times New Roman"/>
+              </w:rPr>
+            </w:pPr>
+            <w:r>
+              <w:rPr>
+                <w:rFonts w:ascii="Times New Roman" w:hAnsi="Times New Roman" w:cs="Times New Roman"/>
+                <w:b/>
+                <w:bCs/>
+              </w:rPr>
+              <w:t>Temel Odak</w:t>
+            </w:r>
+          </w:p>
+        </w:tc>
+        <w:tc>
+          <w:tcPr>
+            <w:tcW w:w="0" w:type="auto"/>
+            <w:tcBorders>
+              <w:top w:val="single" w:sz="6" w:space="0" w:color="auto"/>
+              <w:left w:val="single" w:sz="6" w:space="0" w:color="auto"/>
+              <w:bottom w:val="single" w:sz="6" w:space="0" w:color="auto"/>
+              <w:right w:val="single" w:sz="6" w:space="0" w:color="auto"/>
+            </w:tcBorders>
+            <w:tcMar>
+              <w:top w:w="120" w:type="dxa"/>
+              <w:left w:w="180" w:type="dxa"/>
+              <w:bottom w:w="120" w:type="dxa"/>
+              <w:right w:w="180" w:type="dxa"/>
+            </w:tcMar>
+            <w:vAlign w:val="center"/>
+            <w:hideMark/>
+          </w:tcPr>
+          <w:p>
+            <w:pPr>
+              <w:rPr>
+                <w:rFonts w:ascii="Times New Roman" w:hAnsi="Times New Roman" w:cs="Times New Roman"/>
+              </w:rPr>
+            </w:pPr>
+            <w:r>
+              <w:rPr>
+                <w:rFonts w:ascii="Times New Roman" w:hAnsi="Times New Roman" w:cs="Times New Roman"/>
+              </w:rPr>
+              <w:t>Hız ve anlık akış. (Örn: "Seri üretim" gibi hızlı akan işler.)</w:t>
+            </w:r>
+          </w:p>
+        </w:tc>
+        <w:tc>
+          <w:tcPr>
+            <w:tcW w:w="0" w:type="auto"/>
+            <w:tcBorders>
+              <w:top w:val="single" w:sz="6" w:space="0" w:color="auto"/>
+              <w:left w:val="single" w:sz="6" w:space="0" w:color="auto"/>
+              <w:bottom w:val="single" w:sz="6" w:space="0" w:color="auto"/>
+              <w:right w:val="single" w:sz="6" w:space="0" w:color="auto"/>
+            </w:tcBorders>
+            <w:tcMar>
+              <w:top w:w="120" w:type="dxa"/>
+              <w:left w:w="180" w:type="dxa"/>
+              <w:bottom w:w="120" w:type="dxa"/>
+              <w:right w:w="180" w:type="dxa"/>
+            </w:tcMar>
+            <w:vAlign w:val="center"/>
+            <w:hideMark/>
+          </w:tcPr>
+          <w:p>
+            <w:pPr>
+              <w:rPr>
+                <w:rFonts w:ascii="Times New Roman" w:hAnsi="Times New Roman" w:cs="Times New Roman"/>
+              </w:rPr>
+            </w:pPr>
+            <w:r>
+              <w:rPr>
+                <w:rFonts w:ascii="Times New Roman" w:hAnsi="Times New Roman" w:cs="Times New Roman"/>
+                <w:b/>
+                <w:bCs/>
+              </w:rPr>
+              <w:t>Bağımlılık ve Hafıza.</w:t>
+            </w:r>
+            <w:r>
+              <w:rPr>
+                <w:rFonts w:ascii="Times New Roman" w:hAnsi="Times New Roman" w:cs="Times New Roman"/>
+              </w:rPr>
+              <w:t xml:space="preserve"> (Örn: Bugünün depremi, dünkü stres birikimine bağlıdır.)</w:t>
+            </w:r>
+          </w:p>
+        </w:tc>
+        <w:tc>
+          <w:tcPr>
+            <w:tcW w:w="0" w:type="auto"/>
+            <w:tcBorders>
+              <w:top w:val="single" w:sz="6" w:space="0" w:color="auto"/>
+              <w:left w:val="single" w:sz="6" w:space="0" w:color="auto"/>
+              <w:bottom w:val="single" w:sz="6" w:space="0" w:color="auto"/>
+              <w:right w:val="single" w:sz="6" w:space="0" w:color="auto"/>
+            </w:tcBorders>
+            <w:tcMar>
+              <w:top w:w="120" w:type="dxa"/>
+              <w:left w:w="180" w:type="dxa"/>
+              <w:bottom w:w="120" w:type="dxa"/>
+              <w:right w:w="180" w:type="dxa"/>
+            </w:tcMar>
+            <w:vAlign w:val="center"/>
+            <w:hideMark/>
+          </w:tcPr>
+          <w:p>
+            <w:pPr>
+              <w:rPr>
+                <w:rFonts w:ascii="Times New Roman" w:hAnsi="Times New Roman" w:cs="Times New Roman"/>
+              </w:rPr>
+            </w:pPr>
+            <w:r>
+              <w:rPr>
+                <w:rFonts w:ascii="Times New Roman" w:hAnsi="Times New Roman" w:cs="Times New Roman"/>
+              </w:rPr>
+              <w:t xml:space="preserve">Modelimiz hıza değil, olayların </w:t>
+            </w:r>
+            <w:r>
+              <w:rPr>
+                <w:rFonts w:ascii="Times New Roman" w:hAnsi="Times New Roman" w:cs="Times New Roman"/>
+                <w:b/>
+                <w:bCs/>
+              </w:rPr>
+              <w:t>oluş sırasına</w:t>
+            </w:r>
+            <w:r>
+              <w:rPr>
+                <w:rFonts w:ascii="Times New Roman" w:hAnsi="Times New Roman" w:cs="Times New Roman"/>
+              </w:rPr>
+              <w:t xml:space="preserve"> baktığı için.</w:t>
+            </w:r>
+          </w:p>
+        </w:tc>
+      </w:tr>
+      <w:tr>
+        <w:trPr>
+          <w:trHeight w:val="26"/>
+          <w:tblCellSpacing w:w="15" w:type="dxa"/>
+        </w:trPr>
+        <w:tc>
+          <w:tcPr>
+            <w:tcW w:w="0" w:type="auto"/>
+            <w:tcBorders>
+              <w:top w:val="single" w:sz="6" w:space="0" w:color="auto"/>
+              <w:left w:val="single" w:sz="6" w:space="0" w:color="auto"/>
+              <w:bottom w:val="single" w:sz="6" w:space="0" w:color="auto"/>
+              <w:right w:val="single" w:sz="6" w:space="0" w:color="auto"/>
+            </w:tcBorders>
+            <w:tcMar>
+              <w:top w:w="120" w:type="dxa"/>
+              <w:left w:w="180" w:type="dxa"/>
+              <w:bottom w:w="120" w:type="dxa"/>
+              <w:right w:w="180" w:type="dxa"/>
+            </w:tcMar>
+            <w:vAlign w:val="center"/>
+            <w:hideMark/>
+          </w:tcPr>
+          <w:p>
+            <w:pPr>
+              <w:rPr>
+                <w:rFonts w:ascii="Times New Roman" w:hAnsi="Times New Roman" w:cs="Times New Roman"/>
+              </w:rPr>
+            </w:pPr>
+            <w:r>
+              <w:rPr>
+                <w:rFonts w:ascii="Times New Roman" w:hAnsi="Times New Roman" w:cs="Times New Roman"/>
+                <w:b/>
+                <w:bCs/>
+              </w:rPr>
+              <w:t>Veri İlişkisi</w:t>
+            </w:r>
+          </w:p>
+        </w:tc>
+        <w:tc>
+          <w:tcPr>
+            <w:tcW w:w="0" w:type="auto"/>
+            <w:tcBorders>
+              <w:top w:val="single" w:sz="6" w:space="0" w:color="auto"/>
+              <w:left w:val="single" w:sz="6" w:space="0" w:color="auto"/>
+              <w:bottom w:val="single" w:sz="6" w:space="0" w:color="auto"/>
+              <w:right w:val="single" w:sz="6" w:space="0" w:color="auto"/>
+            </w:tcBorders>
+            <w:tcMar>
+              <w:top w:w="120" w:type="dxa"/>
+              <w:left w:w="180" w:type="dxa"/>
+              <w:bottom w:w="120" w:type="dxa"/>
+              <w:right w:w="180" w:type="dxa"/>
+            </w:tcMar>
+            <w:vAlign w:val="center"/>
+            <w:hideMark/>
+          </w:tcPr>
+          <w:p>
+            <w:pPr>
+              <w:rPr>
+                <w:rFonts w:ascii="Times New Roman" w:hAnsi="Times New Roman" w:cs="Times New Roman"/>
+              </w:rPr>
+            </w:pPr>
+            <w:r>
+              <w:rPr>
+                <w:rFonts w:ascii="Times New Roman" w:hAnsi="Times New Roman" w:cs="Times New Roman"/>
+              </w:rPr>
+              <w:t>Veriler birbirinden bağımsız olabilir, sadece hızlı gelirler.</w:t>
+            </w:r>
+          </w:p>
+        </w:tc>
+        <w:tc>
+          <w:tcPr>
+            <w:tcW w:w="0" w:type="auto"/>
+            <w:tcBorders>
+              <w:top w:val="single" w:sz="6" w:space="0" w:color="auto"/>
+              <w:left w:val="single" w:sz="6" w:space="0" w:color="auto"/>
+              <w:bottom w:val="single" w:sz="6" w:space="0" w:color="auto"/>
+              <w:right w:val="single" w:sz="6" w:space="0" w:color="auto"/>
+            </w:tcBorders>
+            <w:tcMar>
+              <w:top w:w="120" w:type="dxa"/>
+              <w:left w:w="180" w:type="dxa"/>
+              <w:bottom w:w="120" w:type="dxa"/>
+              <w:right w:w="180" w:type="dxa"/>
+            </w:tcMar>
+            <w:vAlign w:val="center"/>
+            <w:hideMark/>
+          </w:tcPr>
+          <w:p>
+            <w:pPr>
+              <w:rPr>
+                <w:rFonts w:ascii="Times New Roman" w:hAnsi="Times New Roman" w:cs="Times New Roman"/>
+              </w:rPr>
+            </w:pPr>
+            <w:r>
+              <w:rPr>
+                <w:rFonts w:ascii="Times New Roman" w:hAnsi="Times New Roman" w:cs="Times New Roman"/>
+                <w:b/>
+                <w:bCs/>
+              </w:rPr>
+              <w:t>Her veri bir öncekine muhtaçtır.</w:t>
+            </w:r>
+            <w:r>
+              <w:rPr>
+                <w:rFonts w:ascii="Times New Roman" w:hAnsi="Times New Roman" w:cs="Times New Roman"/>
+              </w:rPr>
+              <w:t xml:space="preserve"> (t anı, t-1'den etkilenir.)</w:t>
+            </w:r>
+          </w:p>
+        </w:tc>
+        <w:tc>
+          <w:tcPr>
+            <w:tcW w:w="0" w:type="auto"/>
+            <w:tcBorders>
+              <w:top w:val="single" w:sz="6" w:space="0" w:color="auto"/>
+              <w:left w:val="single" w:sz="6" w:space="0" w:color="auto"/>
+              <w:bottom w:val="single" w:sz="6" w:space="0" w:color="auto"/>
+              <w:right w:val="single" w:sz="6" w:space="0" w:color="auto"/>
+            </w:tcBorders>
+            <w:tcMar>
+              <w:top w:w="120" w:type="dxa"/>
+              <w:left w:w="180" w:type="dxa"/>
+              <w:bottom w:w="120" w:type="dxa"/>
+              <w:right w:w="180" w:type="dxa"/>
+            </w:tcMar>
+            <w:vAlign w:val="center"/>
+            <w:hideMark/>
+          </w:tcPr>
+          <w:p>
+            <w:pPr>
+              <w:rPr>
+                <w:rFonts w:ascii="Times New Roman" w:hAnsi="Times New Roman" w:cs="Times New Roman"/>
+              </w:rPr>
+            </w:pPr>
+            <w:r>
+              <w:rPr>
+                <w:rFonts w:ascii="Times New Roman" w:hAnsi="Times New Roman" w:cs="Times New Roman"/>
+              </w:rPr>
+              <w:t>Sırayı bozarsak (shuffle), verinin anlamı kaybolacağı için.</w:t>
+            </w:r>
+          </w:p>
+        </w:tc>
+      </w:tr>
+      <w:tr>
+        <w:trPr>
+          <w:tblCellSpacing w:w="15" w:type="dxa"/>
+        </w:trPr>
+        <w:tc>
+          <w:tcPr>
+            <w:tcW w:w="0" w:type="auto"/>
+            <w:tcBorders>
+              <w:top w:val="single" w:sz="6" w:space="0" w:color="auto"/>
+              <w:left w:val="single" w:sz="6" w:space="0" w:color="auto"/>
+              <w:bottom w:val="single" w:sz="6" w:space="0" w:color="auto"/>
+              <w:right w:val="single" w:sz="6" w:space="0" w:color="auto"/>
+            </w:tcBorders>
+            <w:tcMar>
+              <w:top w:w="120" w:type="dxa"/>
+              <w:left w:w="180" w:type="dxa"/>
+              <w:bottom w:w="120" w:type="dxa"/>
+              <w:right w:w="180" w:type="dxa"/>
+            </w:tcMar>
+            <w:vAlign w:val="center"/>
+            <w:hideMark/>
+          </w:tcPr>
+          <w:p>
+            <w:pPr>
+              <w:rPr>
+                <w:rFonts w:ascii="Times New Roman" w:hAnsi="Times New Roman" w:cs="Times New Roman"/>
+                <w:b/>
+                <w:bCs/>
+              </w:rPr>
+            </w:pPr>
+            <w:r>
+              <w:rPr>
+                <w:rFonts w:ascii="Times New Roman" w:hAnsi="Times New Roman" w:cs="Times New Roman"/>
+                <w:b/>
+                <w:bCs/>
+              </w:rPr>
+              <w:t>Modelin Bakışı</w:t>
+            </w:r>
+          </w:p>
+        </w:tc>
+        <w:tc>
+          <w:tcPr>
+            <w:tcW w:w="0" w:type="auto"/>
+            <w:tcBorders>
+              <w:top w:val="single" w:sz="6" w:space="0" w:color="auto"/>
+              <w:left w:val="single" w:sz="6" w:space="0" w:color="auto"/>
+              <w:bottom w:val="single" w:sz="6" w:space="0" w:color="auto"/>
+              <w:right w:val="single" w:sz="6" w:space="0" w:color="auto"/>
+            </w:tcBorders>
+            <w:tcMar>
+              <w:top w:w="120" w:type="dxa"/>
+              <w:left w:w="180" w:type="dxa"/>
+              <w:bottom w:w="120" w:type="dxa"/>
+              <w:right w:w="180" w:type="dxa"/>
+            </w:tcMar>
+            <w:vAlign w:val="center"/>
+            <w:hideMark/>
+          </w:tcPr>
+          <w:p>
+            <w:pPr>
+              <w:rPr>
+                <w:rFonts w:ascii="Times New Roman" w:hAnsi="Times New Roman" w:cs="Times New Roman"/>
+              </w:rPr>
+            </w:pPr>
+            <w:r>
+              <w:rPr>
+                <w:rFonts w:ascii="Times New Roman" w:hAnsi="Times New Roman" w:cs="Times New Roman"/>
+              </w:rPr>
+              <w:t>"Şu an ne oluyor?" (Anlık fotoğraf çeker.)</w:t>
+            </w:r>
+          </w:p>
+        </w:tc>
+        <w:tc>
+          <w:tcPr>
+            <w:tcW w:w="0" w:type="auto"/>
+            <w:tcBorders>
+              <w:top w:val="single" w:sz="6" w:space="0" w:color="auto"/>
+              <w:left w:val="single" w:sz="6" w:space="0" w:color="auto"/>
+              <w:bottom w:val="single" w:sz="6" w:space="0" w:color="auto"/>
+              <w:right w:val="single" w:sz="6" w:space="0" w:color="auto"/>
+            </w:tcBorders>
+            <w:tcMar>
+              <w:top w:w="120" w:type="dxa"/>
+              <w:left w:w="180" w:type="dxa"/>
+              <w:bottom w:w="120" w:type="dxa"/>
+              <w:right w:w="180" w:type="dxa"/>
+            </w:tcMar>
+            <w:vAlign w:val="center"/>
+            <w:hideMark/>
+          </w:tcPr>
+          <w:p>
+            <w:pPr>
+              <w:rPr>
+                <w:rFonts w:ascii="Times New Roman" w:hAnsi="Times New Roman" w:cs="Times New Roman"/>
+              </w:rPr>
+            </w:pPr>
+            <w:r>
+              <w:rPr>
+                <w:rFonts w:ascii="Times New Roman" w:hAnsi="Times New Roman" w:cs="Times New Roman"/>
+                <w:b/>
+                <w:bCs/>
+              </w:rPr>
+              <w:t>"Buraya nasıl geldik?"</w:t>
+            </w:r>
+            <w:r>
+              <w:rPr>
+                <w:rFonts w:ascii="Times New Roman" w:hAnsi="Times New Roman" w:cs="Times New Roman"/>
+              </w:rPr>
+              <w:t xml:space="preserve"> (Geçmişten gelen hikayeyi okur.)</w:t>
+            </w:r>
+          </w:p>
+        </w:tc>
+        <w:tc>
+          <w:tcPr>
+            <w:tcW w:w="0" w:type="auto"/>
+            <w:tcBorders>
+              <w:top w:val="single" w:sz="6" w:space="0" w:color="auto"/>
+              <w:left w:val="single" w:sz="6" w:space="0" w:color="auto"/>
+              <w:bottom w:val="single" w:sz="6" w:space="0" w:color="auto"/>
+              <w:right w:val="single" w:sz="6" w:space="0" w:color="auto"/>
+            </w:tcBorders>
+            <w:tcMar>
+              <w:top w:w="120" w:type="dxa"/>
+              <w:left w:w="180" w:type="dxa"/>
+              <w:bottom w:w="120" w:type="dxa"/>
+              <w:right w:w="180" w:type="dxa"/>
+            </w:tcMar>
+            <w:vAlign w:val="center"/>
+            <w:hideMark/>
+          </w:tcPr>
+          <w:p>
+            <w:pPr>
+              <w:rPr>
+                <w:rFonts w:ascii="Times New Roman" w:hAnsi="Times New Roman" w:cs="Times New Roman"/>
+              </w:rPr>
+            </w:pPr>
+            <w:r>
+              <w:rPr>
+                <w:rFonts w:ascii="Times New Roman" w:hAnsi="Times New Roman" w:cs="Times New Roman"/>
+              </w:rPr>
+              <w:t>Modelimiz 20 günlük geçmiş veriyi (window) okuyarak karar verdiği için.</w:t>
+            </w:r>
+          </w:p>
+        </w:tc>
+      </w:tr>
+      <w:tr>
+        <w:trPr>
+          <w:tblCellSpacing w:w="15" w:type="dxa"/>
+        </w:trPr>
+        <w:tc>
+          <w:tcPr>
+            <w:tcW w:w="0" w:type="auto"/>
+            <w:tcBorders>
+              <w:top w:val="single" w:sz="6" w:space="0" w:color="auto"/>
+              <w:left w:val="single" w:sz="6" w:space="0" w:color="auto"/>
+              <w:bottom w:val="single" w:sz="6" w:space="0" w:color="auto"/>
+              <w:right w:val="single" w:sz="6" w:space="0" w:color="auto"/>
+            </w:tcBorders>
+            <w:tcMar>
+              <w:top w:w="120" w:type="dxa"/>
+              <w:left w:w="180" w:type="dxa"/>
+              <w:bottom w:w="120" w:type="dxa"/>
+              <w:right w:w="180" w:type="dxa"/>
+            </w:tcMar>
+            <w:vAlign w:val="center"/>
+            <w:hideMark/>
+          </w:tcPr>
+          <w:p>
+            <w:pPr>
+              <w:rPr>
+                <w:rFonts w:ascii="Times New Roman" w:hAnsi="Times New Roman" w:cs="Times New Roman"/>
+              </w:rPr>
+            </w:pPr>
+            <w:r>
+              <w:rPr>
+                <w:rFonts w:ascii="Times New Roman" w:hAnsi="Times New Roman" w:cs="Times New Roman"/>
+                <w:b/>
+                <w:bCs/>
+              </w:rPr>
+              <w:t>Matematiksel Karşılığı</w:t>
+            </w:r>
+          </w:p>
+        </w:tc>
+        <w:tc>
+          <w:tcPr>
+            <w:tcW w:w="0" w:type="auto"/>
+            <w:tcBorders>
+              <w:top w:val="single" w:sz="6" w:space="0" w:color="auto"/>
+              <w:left w:val="single" w:sz="6" w:space="0" w:color="auto"/>
+              <w:bottom w:val="single" w:sz="6" w:space="0" w:color="auto"/>
+              <w:right w:val="single" w:sz="6" w:space="0" w:color="auto"/>
+            </w:tcBorders>
+            <w:tcMar>
+              <w:top w:w="120" w:type="dxa"/>
+              <w:left w:w="180" w:type="dxa"/>
+              <w:bottom w:w="120" w:type="dxa"/>
+              <w:right w:w="180" w:type="dxa"/>
+            </w:tcMar>
+            <w:vAlign w:val="center"/>
+            <w:hideMark/>
+          </w:tcPr>
+          <w:p>
+            <w:pPr>
+              <w:rPr>
+                <w:rFonts w:ascii="Times New Roman" w:hAnsi="Times New Roman" w:cs="Times New Roman"/>
+              </w:rPr>
+            </w:pPr>
+            <w:r>
+              <w:rPr>
+                <w:rFonts w:ascii="Times New Roman" w:hAnsi="Times New Roman" w:cs="Times New Roman"/>
+              </w:rPr>
+              <w:t>y = f(x)</w:t>
+            </w:r>
+          </w:p>
+          <w:p>
+            <w:pPr>
+              <w:rPr>
+                <w:rFonts w:ascii="Times New Roman" w:hAnsi="Times New Roman" w:cs="Times New Roman"/>
+              </w:rPr>
+            </w:pPr>
+            <w:r>
+              <w:rPr>
+                <w:rFonts w:ascii="Times New Roman" w:hAnsi="Times New Roman" w:cs="Times New Roman"/>
+              </w:rPr>
+              <w:t>(Girdi neyse çıktı odur.)</w:t>
+            </w:r>
+          </w:p>
+        </w:tc>
+        <w:tc>
+          <w:tcPr>
+            <w:tcW w:w="0" w:type="auto"/>
+            <w:tcBorders>
+              <w:top w:val="single" w:sz="6" w:space="0" w:color="auto"/>
+              <w:left w:val="single" w:sz="6" w:space="0" w:color="auto"/>
+              <w:bottom w:val="single" w:sz="6" w:space="0" w:color="auto"/>
+              <w:right w:val="single" w:sz="6" w:space="0" w:color="auto"/>
+            </w:tcBorders>
+            <w:tcMar>
+              <w:top w:w="120" w:type="dxa"/>
+              <w:left w:w="180" w:type="dxa"/>
+              <w:bottom w:w="120" w:type="dxa"/>
+              <w:right w:w="180" w:type="dxa"/>
+            </w:tcMar>
+            <w:vAlign w:val="center"/>
+            <w:hideMark/>
+          </w:tcPr>
+          <w:p>
+            <w:pPr>
+              <w:rPr>
+                <w:rFonts w:ascii="Times New Roman" w:hAnsi="Times New Roman" w:cs="Times New Roman"/>
+              </w:rPr>
+            </w:pPr>
+            <w:r>
+              <w:rPr>
+                <w:rFonts w:ascii="Times New Roman" w:hAnsi="Times New Roman" w:cs="Times New Roman"/>
+              </w:rPr>
+              <w:t>y</w:t>
+            </w:r>
+            <w:r>
+              <w:rPr>
+                <w:rFonts w:ascii="Times New Roman" w:hAnsi="Times New Roman" w:cs="Times New Roman"/>
+                <w:vertAlign w:val="subscript"/>
+              </w:rPr>
+              <w:t>t</w:t>
+            </w:r>
+            <w:r>
+              <w:rPr>
+                <w:rFonts w:ascii="Times New Roman" w:hAnsi="Times New Roman" w:cs="Times New Roman"/>
+              </w:rPr>
+              <w:t xml:space="preserve"> = f(x</w:t>
+            </w:r>
+            <w:r>
+              <w:rPr>
+                <w:rFonts w:ascii="Times New Roman" w:hAnsi="Times New Roman" w:cs="Times New Roman"/>
+                <w:vertAlign w:val="subscript"/>
+              </w:rPr>
+              <w:t>t</w:t>
+            </w:r>
+            <w:r>
+              <w:rPr>
+                <w:rFonts w:ascii="Times New Roman" w:hAnsi="Times New Roman" w:cs="Times New Roman"/>
+              </w:rPr>
+              <w:t>, h</w:t>
+            </w:r>
+            <w:r>
+              <w:rPr>
+                <w:rFonts w:ascii="Times New Roman" w:hAnsi="Times New Roman" w:cs="Times New Roman"/>
+                <w:vertAlign w:val="subscript"/>
+              </w:rPr>
+              <w:t>t-1</w:t>
+            </w:r>
+            <w:r>
+              <w:rPr>
+                <w:rFonts w:ascii="Times New Roman" w:hAnsi="Times New Roman" w:cs="Times New Roman"/>
+              </w:rPr>
+              <w:t>})</w:t>
+            </w:r>
+          </w:p>
+          <w:p>
+            <w:pPr>
+              <w:rPr>
+                <w:rFonts w:ascii="Times New Roman" w:hAnsi="Times New Roman" w:cs="Times New Roman"/>
+              </w:rPr>
+            </w:pPr>
+            <w:r>
+              <w:rPr>
+                <w:rFonts w:ascii="Times New Roman" w:hAnsi="Times New Roman" w:cs="Times New Roman"/>
+              </w:rPr>
+              <w:t xml:space="preserve">(Çıktı, hem girdiye hem </w:t>
+            </w:r>
+            <w:r>
+              <w:rPr>
+                <w:rFonts w:ascii="Times New Roman" w:hAnsi="Times New Roman" w:cs="Times New Roman"/>
+                <w:b/>
+                <w:bCs/>
+              </w:rPr>
+              <w:t>geçmiş hafızaya</w:t>
+            </w:r>
+            <w:r>
+              <w:rPr>
+                <w:rFonts w:ascii="Times New Roman" w:hAnsi="Times New Roman" w:cs="Times New Roman"/>
+              </w:rPr>
+              <w:t xml:space="preserve"> bağlıdır.)</w:t>
+            </w:r>
+          </w:p>
+        </w:tc>
+        <w:tc>
+          <w:tcPr>
+            <w:tcW w:w="0" w:type="auto"/>
+            <w:tcBorders>
+              <w:top w:val="single" w:sz="6" w:space="0" w:color="auto"/>
+              <w:left w:val="single" w:sz="6" w:space="0" w:color="auto"/>
+              <w:bottom w:val="single" w:sz="6" w:space="0" w:color="auto"/>
+              <w:right w:val="single" w:sz="6" w:space="0" w:color="auto"/>
+            </w:tcBorders>
+            <w:tcMar>
+              <w:top w:w="120" w:type="dxa"/>
+              <w:left w:w="180" w:type="dxa"/>
+              <w:bottom w:w="120" w:type="dxa"/>
+              <w:right w:w="180" w:type="dxa"/>
+            </w:tcMar>
+            <w:vAlign w:val="center"/>
+            <w:hideMark/>
+          </w:tcPr>
+          <w:p>
+            <w:pPr>
+              <w:rPr>
+                <w:rFonts w:ascii="Times New Roman" w:hAnsi="Times New Roman" w:cs="Times New Roman"/>
+              </w:rPr>
+            </w:pPr>
+            <w:r>
+              <w:rPr>
+                <w:rFonts w:ascii="Times New Roman" w:hAnsi="Times New Roman" w:cs="Times New Roman"/>
+              </w:rPr>
+              <w:t xml:space="preserve">Kullandığımız </w:t>
+            </w:r>
+            <w:r>
+              <w:rPr>
+                <w:rFonts w:ascii="Times New Roman" w:hAnsi="Times New Roman" w:cs="Times New Roman"/>
+                <w:b/>
+                <w:bCs/>
+              </w:rPr>
+              <w:t>LSTM</w:t>
+            </w:r>
+            <w:r>
+              <w:rPr>
+                <w:rFonts w:ascii="Times New Roman" w:hAnsi="Times New Roman" w:cs="Times New Roman"/>
+              </w:rPr>
+              <w:t xml:space="preserve"> hücresi, geçmiş bilgiyi hafızasında taşıdığı için.</w:t>
+            </w:r>
+          </w:p>
+        </w:tc>
+      </w:tr>
+      <w:tr>
+        <w:trPr>
+          <w:trHeight w:val="1227"/>
+          <w:tblCellSpacing w:w="15" w:type="dxa"/>
+        </w:trPr>
+        <w:tc>
+          <w:tcPr>
+            <w:tcW w:w="0" w:type="auto"/>
+            <w:tcBorders>
+              <w:top w:val="single" w:sz="6" w:space="0" w:color="auto"/>
+              <w:left w:val="single" w:sz="6" w:space="0" w:color="auto"/>
+              <w:bottom w:val="single" w:sz="6" w:space="0" w:color="auto"/>
+              <w:right w:val="single" w:sz="6" w:space="0" w:color="auto"/>
+            </w:tcBorders>
+            <w:tcMar>
+              <w:top w:w="120" w:type="dxa"/>
+              <w:left w:w="180" w:type="dxa"/>
+              <w:bottom w:w="120" w:type="dxa"/>
+              <w:right w:w="180" w:type="dxa"/>
+            </w:tcMar>
+            <w:vAlign w:val="center"/>
+            <w:hideMark/>
+          </w:tcPr>
+          <w:p>
+            <w:pPr>
+              <w:rPr>
+                <w:rFonts w:ascii="Times New Roman" w:hAnsi="Times New Roman" w:cs="Times New Roman"/>
+              </w:rPr>
+            </w:pPr>
+            <w:r>
+              <w:rPr>
+                <w:rFonts w:ascii="Times New Roman" w:hAnsi="Times New Roman" w:cs="Times New Roman"/>
+                <w:b/>
+                <w:bCs/>
+              </w:rPr>
+              <w:t>İngilizce Karşılığı</w:t>
+            </w:r>
+          </w:p>
+        </w:tc>
+        <w:tc>
+          <w:tcPr>
+            <w:tcW w:w="0" w:type="auto"/>
+            <w:tcBorders>
+              <w:top w:val="single" w:sz="6" w:space="0" w:color="auto"/>
+              <w:left w:val="single" w:sz="6" w:space="0" w:color="auto"/>
+              <w:bottom w:val="single" w:sz="6" w:space="0" w:color="auto"/>
+              <w:right w:val="single" w:sz="6" w:space="0" w:color="auto"/>
+            </w:tcBorders>
+            <w:tcMar>
+              <w:top w:w="120" w:type="dxa"/>
+              <w:left w:w="180" w:type="dxa"/>
+              <w:bottom w:w="120" w:type="dxa"/>
+              <w:right w:w="180" w:type="dxa"/>
+            </w:tcMar>
+            <w:vAlign w:val="center"/>
+            <w:hideMark/>
+          </w:tcPr>
+          <w:p>
+            <w:pPr>
+              <w:rPr>
+                <w:rFonts w:ascii="Times New Roman" w:hAnsi="Times New Roman" w:cs="Times New Roman"/>
+              </w:rPr>
+            </w:pPr>
+            <w:r>
+              <w:rPr>
+                <w:rFonts w:ascii="Times New Roman" w:hAnsi="Times New Roman" w:cs="Times New Roman"/>
+                <w:i/>
+                <w:iCs/>
+              </w:rPr>
+              <w:t>Real-Time / Serial Processing</w:t>
+            </w:r>
+          </w:p>
+        </w:tc>
+        <w:tc>
+          <w:tcPr>
+            <w:tcW w:w="0" w:type="auto"/>
+            <w:tcBorders>
+              <w:top w:val="single" w:sz="6" w:space="0" w:color="auto"/>
+              <w:left w:val="single" w:sz="6" w:space="0" w:color="auto"/>
+              <w:bottom w:val="single" w:sz="6" w:space="0" w:color="auto"/>
+              <w:right w:val="single" w:sz="6" w:space="0" w:color="auto"/>
+            </w:tcBorders>
+            <w:tcMar>
+              <w:top w:w="120" w:type="dxa"/>
+              <w:left w:w="180" w:type="dxa"/>
+              <w:bottom w:w="120" w:type="dxa"/>
+              <w:right w:w="180" w:type="dxa"/>
+            </w:tcMar>
+            <w:vAlign w:val="center"/>
+            <w:hideMark/>
+          </w:tcPr>
+          <w:p>
+            <w:pPr>
+              <w:rPr>
+                <w:rFonts w:ascii="Times New Roman" w:hAnsi="Times New Roman" w:cs="Times New Roman"/>
+              </w:rPr>
+            </w:pPr>
+            <w:r>
+              <w:rPr>
+                <w:rFonts w:ascii="Times New Roman" w:hAnsi="Times New Roman" w:cs="Times New Roman"/>
+                <w:b/>
+                <w:bCs/>
+                <w:i/>
+                <w:iCs/>
+              </w:rPr>
+              <w:t>Sequential Time Series Analysis</w:t>
+            </w:r>
+          </w:p>
+        </w:tc>
+        <w:tc>
+          <w:tcPr>
+            <w:tcW w:w="0" w:type="auto"/>
+            <w:tcBorders>
+              <w:top w:val="single" w:sz="6" w:space="0" w:color="auto"/>
+              <w:left w:val="single" w:sz="6" w:space="0" w:color="auto"/>
+              <w:bottom w:val="single" w:sz="6" w:space="0" w:color="auto"/>
+              <w:right w:val="single" w:sz="6" w:space="0" w:color="auto"/>
+            </w:tcBorders>
+            <w:tcMar>
+              <w:top w:w="120" w:type="dxa"/>
+              <w:left w:w="180" w:type="dxa"/>
+              <w:bottom w:w="120" w:type="dxa"/>
+              <w:right w:w="180" w:type="dxa"/>
+            </w:tcMar>
+            <w:vAlign w:val="center"/>
+            <w:hideMark/>
+          </w:tcPr>
+          <w:p>
+            <w:pPr>
+              <w:rPr>
+                <w:rFonts w:ascii="Times New Roman" w:hAnsi="Times New Roman" w:cs="Times New Roman"/>
+              </w:rPr>
+            </w:pPr>
+            <w:r>
+              <w:rPr>
+                <w:rFonts w:ascii="Times New Roman" w:hAnsi="Times New Roman" w:cs="Times New Roman"/>
+              </w:rPr>
+              <w:t xml:space="preserve">Literatürde bu yöntem </w:t>
+            </w:r>
+            <w:r>
+              <w:rPr>
+                <w:rFonts w:ascii="Times New Roman" w:hAnsi="Times New Roman" w:cs="Times New Roman"/>
+                <w:b/>
+                <w:bCs/>
+              </w:rPr>
+              <w:t>"Sequence Models"</w:t>
+            </w:r>
+            <w:r>
+              <w:rPr>
+                <w:rFonts w:ascii="Times New Roman" w:hAnsi="Times New Roman" w:cs="Times New Roman"/>
+              </w:rPr>
+              <w:t xml:space="preserve"> olarak geçtiği için</w:t>
+            </w:r>
+          </w:p>
+        </w:tc>
+      </w:tr>
+    </w:tbl>
+    <w:p>
+      <w:pPr>
+        <w:numPr>
+          <w:ilvl w:val="0"/>
+          <w:numId w:val="24"/>
+        </w:numPr>
+        <w:spacing w:line="276" w:lineRule="auto"/>
+        <w:rPr>
+          <w:kern w:val="2"/>
+          <w14:ligatures w14:val="standardContextual"/>
+        </w:rPr>
+      </w:pPr>
+      <w:r>
+        <w:rPr>
+          <w:b/>
+          <w:bCs/>
+          <w:i/>
+          <w:iCs/>
+        </w:rPr>
+        <w:t>Veri Yapılandırması (Sequence Generation):</w:t>
+      </w:r>
+      <w:r>
+        <w:t xml:space="preserve"> </w:t>
+      </w:r>
+      <w:r>
+        <w:rPr>
+          <w:i/>
+          <w:iCs/>
+        </w:rPr>
+        <w:t>Veri seti, bağımsız örnekler yerine seq_length=20 parametresi ile 20 adımlık ardışık zaman pencerelerine (sliding windows) dönüştürülmüştür. Model, tekil bir anı değil, olayların oluş sırasını analiz etmektedir.</w:t>
+      </w:r>
+    </w:p>
+    <w:p>
+      <w:pPr>
+        <w:numPr>
+          <w:ilvl w:val="0"/>
+          <w:numId w:val="24"/>
+        </w:numPr>
+        <w:spacing w:line="276" w:lineRule="auto"/>
+      </w:pPr>
+      <w:r>
+        <w:rPr>
+          <w:b/>
+          <w:bCs/>
+          <w:i/>
+          <w:iCs/>
+        </w:rPr>
+        <w:t>Zamansal Bütünlüğün Korunması (Temporal Splitting):</w:t>
+      </w:r>
+      <w:r>
+        <w:t xml:space="preserve"> </w:t>
+      </w:r>
+      <w:r>
+        <w:rPr>
+          <w:i/>
+          <w:iCs/>
+        </w:rPr>
+        <w:t>Eğitim ve test veri setleri ayrılırken rastgele karıştırma (shuffle) yapılmamış; verinin ilk %80'i eğitim, son %20'si test olacak şekilde zaman ekseninde kesilerek (slicing) veri sızıntısı (data leakage) engellenmiştir.</w:t>
+      </w:r>
+    </w:p>
+    <w:p>
+      <w:pPr>
+        <w:numPr>
+          <w:ilvl w:val="0"/>
+          <w:numId w:val="24"/>
+        </w:numPr>
+        <w:spacing w:line="276" w:lineRule="auto"/>
+      </w:pPr>
+      <w:r>
+        <w:rPr>
+          <w:b/>
+          <w:bCs/>
+          <w:i/>
+          <w:iCs/>
+        </w:rPr>
+        <w:t>Model Mimarisi:</w:t>
+      </w:r>
+      <w:r>
+        <w:t xml:space="preserve"> </w:t>
+      </w:r>
+      <w:r>
+        <w:rPr>
+          <w:i/>
+          <w:iCs/>
+        </w:rPr>
+        <w:t>Mimari tasarımda kullanılan LSTM (Long Short-Term Memory) ve Conv1d katmanları, verinin sadece anlık değerini değil, önceki adımlardan gelen tarihsel bilgisini (context) de işleyerek sıralı öğrenmeyi gerçekleştirmektedir."</w:t>
+      </w:r>
+    </w:p>
+    <w:p>
+      <w:pPr>
+        <w:rPr>
+          <w:i/>
+          <w:iCs/>
+        </w:rPr>
+      </w:pPr>
+      <w:r>
+        <w:rPr>
+          <w:b/>
+          <w:bCs/>
+        </w:rPr>
+        <w:t>Terminoloji Seçimi Hakkında Not:</w:t>
+      </w:r>
+      <w:r>
+        <w:t xml:space="preserve"> </w:t>
+      </w:r>
+      <w:r>
+        <w:rPr>
+          <w:i/>
+          <w:iCs/>
+        </w:rPr>
+        <w:t xml:space="preserve">"Projemizde 'Seri Zamanlı' ifadesi yerine </w:t>
+      </w:r>
+      <w:r>
+        <w:rPr>
+          <w:b/>
+          <w:bCs/>
+          <w:i/>
+          <w:iCs/>
+        </w:rPr>
+        <w:t>'Sıralı Zaman Serisi' (Sequential Time Series)</w:t>
+      </w:r>
+      <w:r>
+        <w:rPr>
+          <w:i/>
+          <w:iCs/>
+        </w:rPr>
+        <w:t xml:space="preserve"> ifadesinin tercih edilmesinin temel nedeni, çalışmamızın veri akış hızına değil, </w:t>
+      </w:r>
+      <w:r>
+        <w:rPr>
+          <w:b/>
+          <w:bCs/>
+          <w:i/>
+          <w:iCs/>
+        </w:rPr>
+        <w:t>veriler arasındaki nedensellik ilişkisine</w:t>
+      </w:r>
+      <w:r>
+        <w:rPr>
+          <w:i/>
+          <w:iCs/>
+        </w:rPr>
+        <w:t xml:space="preserve"> odaklanmasıdır. Modelimiz, deprem verilerini </w:t>
+      </w:r>
+      <w:r>
+        <w:rPr>
+          <w:i/>
+          <w:iCs/>
+        </w:rPr>
+        <w:lastRenderedPageBreak/>
+        <w:t xml:space="preserve">birbirinden bağımsız anlık olaylar olarak değil, tarihsel bir zincirin halkaları (sequence) olarak işlemektedir. Bu nedenle model mimarisi, geçmiş adımların bilgisini koruyan </w:t>
+      </w:r>
+      <w:r>
+        <w:rPr>
+          <w:b/>
+          <w:bCs/>
+          <w:i/>
+          <w:iCs/>
+        </w:rPr>
+        <w:t>sıralı (sequential)</w:t>
+      </w:r>
+      <w:r>
+        <w:rPr>
+          <w:i/>
+          <w:iCs/>
+        </w:rPr>
+        <w:t xml:space="preserve"> bir yapı üzerine kurulmuştur."</w:t>
+      </w:r>
+    </w:p>
+    <w:p>
+      <w:pPr>
+        <w:rPr>
+          <w:b/>
+          <w:bCs/>
+        </w:rPr>
+      </w:pPr>
+      <w:r>
+        <w:rPr>
+          <w:b/>
+          <w:bCs/>
+        </w:rPr>
+        <w:t>Veri Seti Bölümleme ve Zamansal Dağılım Tablosu</w:t>
+      </w:r>
+    </w:p>
+    <w:p>
+      <w:r>
+        <w:t xml:space="preserve">Aşağıdaki tablo, modelin eğitim ve test süreçlerinde kullanılan veri kümelerinin istatistiksel ve zamansal özelliklerini detaylandırmaktadır. Veri seti, </w:t>
+      </w:r>
+      <w:r>
+        <w:rPr>
+          <w:b/>
+          <w:bCs/>
+        </w:rPr>
+        <w:t>zaman serisi analizi (Time Series Analysis)</w:t>
+      </w:r>
+      <w:r>
+        <w:t xml:space="preserve"> prensiplerine uygun olarak, rastgele karıştırma yapılmadan </w:t>
+      </w:r>
+      <w:r>
+        <w:rPr>
+          <w:b/>
+          <w:bCs/>
+        </w:rPr>
+        <w:t>kronolojik kesme (Chronological Split)</w:t>
+      </w:r>
+      <w:r>
+        <w:t xml:space="preserve"> yöntemiyle ayrılmıştır.</w:t>
       </w:r>
     </w:p>
     <w:p>
@@ -14294,6 +18518,119 @@
     </w:lvl>
   </w:abstractNum>
   <w:abstractNum w:abstractNumId="13" w15:restartNumberingAfterBreak="0">
+    <w:nsid w:val="4AF37FB4"/>
+    <w:multiLevelType w:val="multilevel"/>
+    <w:tmpl w:val="F498F916"/>
+    <w:lvl w:ilvl="0">
+      <w:start w:val="1"/>
+      <w:numFmt w:val="decimal"/>
+      <w:lvlText w:val="%1."/>
+      <w:lvlJc w:val="left"/>
+      <w:pPr>
+        <w:tabs>
+          <w:tab w:val="num" w:pos="720"/>
+        </w:tabs>
+        <w:ind w:left="720" w:hanging="360"/>
+      </w:pPr>
+    </w:lvl>
+    <w:lvl w:ilvl="1">
+      <w:start w:val="1"/>
+      <w:numFmt w:val="decimal"/>
+      <w:lvlText w:val="%2."/>
+      <w:lvlJc w:val="left"/>
+      <w:pPr>
+        <w:tabs>
+          <w:tab w:val="num" w:pos="1440"/>
+        </w:tabs>
+        <w:ind w:left="1440" w:hanging="360"/>
+      </w:pPr>
+    </w:lvl>
+    <w:lvl w:ilvl="2">
+      <w:start w:val="1"/>
+      <w:numFmt w:val="decimal"/>
+      <w:lvlText w:val="%3."/>
+      <w:lvlJc w:val="left"/>
+      <w:pPr>
+        <w:tabs>
+          <w:tab w:val="num" w:pos="2160"/>
+        </w:tabs>
+        <w:ind w:left="2160" w:hanging="360"/>
+      </w:pPr>
+    </w:lvl>
+    <w:lvl w:ilvl="3">
+      <w:start w:val="1"/>
+      <w:numFmt w:val="decimal"/>
+      <w:lvlText w:val="%4."/>
+      <w:lvlJc w:val="left"/>
+      <w:pPr>
+        <w:tabs>
+          <w:tab w:val="num" w:pos="2880"/>
+        </w:tabs>
+        <w:ind w:left="2880" w:hanging="360"/>
+      </w:pPr>
+    </w:lvl>
+    <w:lvl w:ilvl="4">
+      <w:start w:val="1"/>
+      <w:numFmt w:val="decimal"/>
+      <w:lvlText w:val="%5."/>
+      <w:lvlJc w:val="left"/>
+      <w:pPr>
+        <w:tabs>
+          <w:tab w:val="num" w:pos="3600"/>
+        </w:tabs>
+        <w:ind w:left="3600" w:hanging="360"/>
+      </w:pPr>
+    </w:lvl>
+    <w:lvl w:ilvl="5">
+      <w:start w:val="1"/>
+      <w:numFmt w:val="decimal"/>
+      <w:lvlText w:val="%6."/>
+      <w:lvlJc w:val="left"/>
+      <w:pPr>
+        <w:tabs>
+          <w:tab w:val="num" w:pos="4320"/>
+        </w:tabs>
+        <w:ind w:left="4320" w:hanging="360"/>
+      </w:pPr>
+    </w:lvl>
+    <w:lvl w:ilvl="6">
+      <w:start w:val="1"/>
+      <w:numFmt w:val="decimal"/>
+      <w:lvlText w:val="%7."/>
+      <w:lvlJc w:val="left"/>
+      <w:pPr>
+        <w:tabs>
+          <w:tab w:val="num" w:pos="5040"/>
+        </w:tabs>
+        <w:ind w:left="5040" w:hanging="360"/>
+      </w:pPr>
+    </w:lvl>
+    <w:lvl w:ilvl="7">
+      <w:start w:val="1"/>
+      <w:numFmt w:val="decimal"/>
+      <w:lvlText w:val="%8."/>
+      <w:lvlJc w:val="left"/>
+      <w:pPr>
+        <w:tabs>
+          <w:tab w:val="num" w:pos="5760"/>
+        </w:tabs>
+        <w:ind w:left="5760" w:hanging="360"/>
+      </w:pPr>
+    </w:lvl>
+    <w:lvl w:ilvl="8">
+      <w:start w:val="1"/>
+      <w:numFmt w:val="decimal"/>
+      <w:lvlText w:val="%9."/>
+      <w:lvlJc w:val="left"/>
+      <w:pPr>
+        <w:tabs>
+          <w:tab w:val="num" w:pos="6480"/>
+        </w:tabs>
+        <w:ind w:left="6480" w:hanging="360"/>
+      </w:pPr>
+    </w:lvl>
+  </w:abstractNum>
+  <w:abstractNum w:abstractNumId="14" w15:restartNumberingAfterBreak="0">
     <w:nsid w:val="4BA70C9F"/>
     <w:multiLevelType w:val="multilevel"/>
     <w:tmpl w:val="CE0EA262"/>
@@ -14442,7 +18779,7 @@
       </w:rPr>
     </w:lvl>
   </w:abstractNum>
-  <w:abstractNum w:abstractNumId="14" w15:restartNumberingAfterBreak="0">
+  <w:abstractNum w:abstractNumId="15" w15:restartNumberingAfterBreak="0">
     <w:nsid w:val="4C051FE4"/>
     <w:multiLevelType w:val="multilevel"/>
     <w:tmpl w:val="25047C24"/>
@@ -14591,7 +18928,7 @@
       </w:rPr>
     </w:lvl>
   </w:abstractNum>
-  <w:abstractNum w:abstractNumId="15" w15:restartNumberingAfterBreak="0">
+  <w:abstractNum w:abstractNumId="16" w15:restartNumberingAfterBreak="0">
     <w:nsid w:val="5A884B77"/>
     <w:multiLevelType w:val="multilevel"/>
     <w:tmpl w:val="C096E6D8"/>
@@ -14740,7 +19077,7 @@
       </w:rPr>
     </w:lvl>
   </w:abstractNum>
-  <w:abstractNum w:abstractNumId="16" w15:restartNumberingAfterBreak="0">
+  <w:abstractNum w:abstractNumId="17" w15:restartNumberingAfterBreak="0">
     <w:nsid w:val="5B3D7ADE"/>
     <w:multiLevelType w:val="multilevel"/>
     <w:tmpl w:val="BEB6D700"/>
@@ -14889,7 +19226,7 @@
       </w:rPr>
     </w:lvl>
   </w:abstractNum>
-  <w:abstractNum w:abstractNumId="17" w15:restartNumberingAfterBreak="0">
+  <w:abstractNum w:abstractNumId="18" w15:restartNumberingAfterBreak="0">
     <w:nsid w:val="5E896B3F"/>
     <w:multiLevelType w:val="multilevel"/>
     <w:tmpl w:val="E8B02410"/>
@@ -15038,7 +19375,7 @@
       </w:rPr>
     </w:lvl>
   </w:abstractNum>
-  <w:abstractNum w:abstractNumId="18" w15:restartNumberingAfterBreak="0">
+  <w:abstractNum w:abstractNumId="19" w15:restartNumberingAfterBreak="0">
     <w:nsid w:val="608B725D"/>
     <w:multiLevelType w:val="multilevel"/>
     <w:tmpl w:val="B57249A2"/>
@@ -15175,7 +19512,7 @@
       </w:rPr>
     </w:lvl>
   </w:abstractNum>
-  <w:abstractNum w:abstractNumId="19" w15:restartNumberingAfterBreak="0">
+  <w:abstractNum w:abstractNumId="20" w15:restartNumberingAfterBreak="0">
     <w:nsid w:val="66E06D20"/>
     <w:multiLevelType w:val="multilevel"/>
     <w:tmpl w:val="410614C0"/>
@@ -15324,7 +19661,7 @@
       </w:rPr>
     </w:lvl>
   </w:abstractNum>
-  <w:abstractNum w:abstractNumId="20" w15:restartNumberingAfterBreak="0">
+  <w:abstractNum w:abstractNumId="21" w15:restartNumberingAfterBreak="0">
     <w:nsid w:val="690540A9"/>
     <w:multiLevelType w:val="multilevel"/>
     <w:tmpl w:val="C53C0C56"/>
@@ -15473,7 +19810,7 @@
       </w:rPr>
     </w:lvl>
   </w:abstractNum>
-  <w:abstractNum w:abstractNumId="21" w15:restartNumberingAfterBreak="0">
+  <w:abstractNum w:abstractNumId="22" w15:restartNumberingAfterBreak="0">
     <w:nsid w:val="6939039C"/>
     <w:multiLevelType w:val="multilevel"/>
     <w:tmpl w:val="2A1E1D1E"/>
@@ -15622,7 +19959,7 @@
       </w:rPr>
     </w:lvl>
   </w:abstractNum>
-  <w:abstractNum w:abstractNumId="22" w15:restartNumberingAfterBreak="0">
+  <w:abstractNum w:abstractNumId="23" w15:restartNumberingAfterBreak="0">
     <w:nsid w:val="735D0DBA"/>
     <w:multiLevelType w:val="multilevel"/>
     <w:tmpl w:val="9244B888"/>
@@ -15772,10 +20109,10 @@
     </w:lvl>
   </w:abstractNum>
   <w:num w:numId="1">
-    <w:abstractNumId w:val="20"/>
+    <w:abstractNumId w:val="21"/>
   </w:num>
   <w:num w:numId="2">
-    <w:abstractNumId w:val="18"/>
+    <w:abstractNumId w:val="19"/>
   </w:num>
   <w:num w:numId="3">
     <w:abstractNumId w:val="1"/>
@@ -15784,13 +20121,13 @@
     <w:abstractNumId w:val="6"/>
   </w:num>
   <w:num w:numId="5">
-    <w:abstractNumId w:val="21"/>
+    <w:abstractNumId w:val="22"/>
   </w:num>
   <w:num w:numId="6">
-    <w:abstractNumId w:val="15"/>
+    <w:abstractNumId w:val="16"/>
   </w:num>
   <w:num w:numId="7">
-    <w:abstractNumId w:val="22"/>
+    <w:abstractNumId w:val="23"/>
   </w:num>
   <w:num w:numId="8">
     <w:abstractNumId w:val="8"/>
@@ -15810,13 +20147,13 @@
     <w:abstractNumId w:val="9"/>
   </w:num>
   <w:num w:numId="10">
-    <w:abstractNumId w:val="19"/>
+    <w:abstractNumId w:val="20"/>
   </w:num>
   <w:num w:numId="11">
     <w:abstractNumId w:val="11"/>
   </w:num>
   <w:num w:numId="12">
-    <w:abstractNumId w:val="14"/>
+    <w:abstractNumId w:val="15"/>
   </w:num>
   <w:num w:numId="13">
     <w:abstractNumId w:val="10"/>
@@ -15842,7 +20179,7 @@
     <w:abstractNumId w:val="0"/>
   </w:num>
   <w:num w:numId="17">
-    <w:abstractNumId w:val="17"/>
+    <w:abstractNumId w:val="18"/>
   </w:num>
   <w:num w:numId="18">
     <w:abstractNumId w:val="5"/>
@@ -15854,13 +20191,43 @@
     <w:abstractNumId w:val="12"/>
   </w:num>
   <w:num w:numId="21">
-    <w:abstractNumId w:val="13"/>
+    <w:abstractNumId w:val="14"/>
   </w:num>
   <w:num w:numId="22">
-    <w:abstractNumId w:val="16"/>
+    <w:abstractNumId w:val="17"/>
   </w:num>
   <w:num w:numId="23">
     <w:abstractNumId w:val="3"/>
+  </w:num>
+  <w:num w:numId="24">
+    <w:abstractNumId w:val="13"/>
+    <w:lvlOverride w:ilvl="0">
+      <w:startOverride w:val="1"/>
+    </w:lvlOverride>
+    <w:lvlOverride w:ilvl="1">
+      <w:startOverride w:val="1"/>
+    </w:lvlOverride>
+    <w:lvlOverride w:ilvl="2">
+      <w:startOverride w:val="1"/>
+    </w:lvlOverride>
+    <w:lvlOverride w:ilvl="3">
+      <w:startOverride w:val="1"/>
+    </w:lvlOverride>
+    <w:lvlOverride w:ilvl="4">
+      <w:startOverride w:val="1"/>
+    </w:lvlOverride>
+    <w:lvlOverride w:ilvl="5">
+      <w:startOverride w:val="1"/>
+    </w:lvlOverride>
+    <w:lvlOverride w:ilvl="6">
+      <w:startOverride w:val="1"/>
+    </w:lvlOverride>
+    <w:lvlOverride w:ilvl="7">
+      <w:startOverride w:val="1"/>
+    </w:lvlOverride>
+    <w:lvlOverride w:ilvl="8">
+      <w:startOverride w:val="1"/>
+    </w:lvlOverride>
   </w:num>
   <w:numIdMacAtCleanup w:val="23"/>
 </w:numbering>
@@ -16575,6 +20942,31 @@
       <w:shd w:val="clear" w:color="auto" w:fill="E1DFDD"/>
     </w:rPr>
   </w:style>
+  <w:style w:type="character" w:customStyle="1" w:styleId="math-inline">
+    <w:name w:val="math-inline"/>
+    <w:basedOn w:val="VarsaylanParagrafYazTipi"/>
+    <w:rsid w:val="00E50F11"/>
+  </w:style>
+  <w:style w:type="table" w:styleId="TabloKlavuzu">
+    <w:name w:val="Table Grid"/>
+    <w:basedOn w:val="NormalTablo"/>
+    <w:uiPriority w:val="39"/>
+    <w:rsid w:val="00E50F11"/>
+    <w:pPr>
+      <w:spacing w:after="0" w:line="240" w:lineRule="auto"/>
+    </w:pPr>
+    <w:tblPr>
+      <w:tblInd w:w="0" w:type="nil"/>
+      <w:tblBorders>
+        <w:top w:val="single" w:sz="4" w:space="0" w:color="auto"/>
+        <w:left w:val="single" w:sz="4" w:space="0" w:color="auto"/>
+        <w:bottom w:val="single" w:sz="4" w:space="0" w:color="auto"/>
+        <w:right w:val="single" w:sz="4" w:space="0" w:color="auto"/>
+        <w:insideH w:val="single" w:sz="4" w:space="0" w:color="auto"/>
+        <w:insideV w:val="single" w:sz="4" w:space="0" w:color="auto"/>
+      </w:tblBorders>
+    </w:tblPr>
+  </w:style>
 </w:styles>
 </file>
 

</xml_diff>